<commit_message>
feat(jev): TAiJevBatchLabeler, etiquetado masivo con Jev
Aplica las mismas preguntas a muchas filas, una llamada por fila y en
paralelo (un TAiJev por fila), y devuelve un reporte con etiqueta,
confianza y top-3 por fila, tokens, costo, tiempo y las filas dudosas
para revision humana.

- Entrada: textos ({ItemField: texto}) o TJSONObject ya armados.
- Una fila con error no detiene el lote. Questions y LabelQuestion se
  validan antes de la primera llamada. Cancel seguro desde otro hilo.
  SaveToCSV para el detalle.
- Demo 087: reproduce el experimento del PUC (126 movimientos, 225
  cuentas) con los mismos tokens que el prototipo en Python (1.191.860):
  92.9% total y 100% en el 61% que se automatizaria (conf >= 0.8),
  US$0.05 en 4.2 s con 16 en paralelo.
- Suite: 1 caso nuevo (58/58). Guias .docx: seccion 8.3.

Co-Authored-By: Claude Opus 5.5 (1M context) <noreply@anthropic.com>
</commit_message>
<xml_diff>
--- a/Docs/Version 3/uMakerAi-Jev-TypeSafe-EN.docx
+++ b/Docs/Version 3/uMakerAi-Jev-TypeSafe-EN.docx
@@ -1200,6 +1200,91 @@
                 <w:sz w:val="19"/>
                 <w:szCs w:val="19"/>
               </w:rPr>
+              <w:t xml:space="preserve">Label thousands of rows (e-mails, entries, tickets)</w:t>
+            </w:r>
+          </w:p>
+        </w:tc>
+        <w:tc>
+          <w:tcPr>
+            <w:tcW w:type="dxa" w:w="2800"/>
+            <w:tcBorders>
+              <w:top w:val="single" w:color="BFC9D6" w:sz="4"/>
+              <w:left w:val="single" w:color="BFC9D6" w:sz="4"/>
+              <w:bottom w:val="single" w:color="BFC9D6" w:sz="4"/>
+              <w:right w:val="single" w:color="BFC9D6" w:sz="4"/>
+            </w:tcBorders>
+            <w:shd w:fill="FFFFFF" w:color="auto" w:val="clear"/>
+            <w:tcMar>
+              <w:top w:type="dxa" w:w="60"/>
+              <w:left w:type="dxa" w:w="100"/>
+              <w:bottom w:type="dxa" w:w="60"/>
+              <w:right w:type="dxa" w:w="100"/>
+            </w:tcMar>
+          </w:tcPr>
+          <w:p>
+            <w:r>
+              <w:rPr>
+                <w:sz w:val="19"/>
+                <w:szCs w:val="19"/>
+              </w:rPr>
+              <w:t xml:space="preserve">An LLM row by row, or by hand</w:t>
+            </w:r>
+          </w:p>
+        </w:tc>
+        <w:tc>
+          <w:tcPr>
+            <w:tcW w:type="dxa" w:w="3160"/>
+            <w:tcBorders>
+              <w:top w:val="single" w:color="BFC9D6" w:sz="4"/>
+              <w:left w:val="single" w:color="BFC9D6" w:sz="4"/>
+              <w:bottom w:val="single" w:color="BFC9D6" w:sz="4"/>
+              <w:right w:val="single" w:color="BFC9D6" w:sz="4"/>
+            </w:tcBorders>
+            <w:shd w:fill="FFFFFF" w:color="auto" w:val="clear"/>
+            <w:tcMar>
+              <w:top w:type="dxa" w:w="60"/>
+              <w:left w:type="dxa" w:w="100"/>
+              <w:bottom w:type="dxa" w:w="60"/>
+              <w:right w:type="dxa" w:w="100"/>
+            </w:tcMar>
+          </w:tcPr>
+          <w:p>
+            <w:r>
+              <w:rPr>
+                <w:rFonts w:ascii="Consolas" w:cs="Consolas" w:eastAsia="Consolas" w:hAnsi="Consolas"/>
+                <w:color w:val="0B4F8A"/>
+                <w:sz w:val="19"/>
+                <w:szCs w:val="19"/>
+              </w:rPr>
+              <w:t xml:space="preserve">TAiJevBatchLabeler</w:t>
+            </w:r>
+          </w:p>
+        </w:tc>
+      </w:tr>
+      <w:tr>
+        <w:tc>
+          <w:tcPr>
+            <w:tcW w:type="dxa" w:w="3400"/>
+            <w:tcBorders>
+              <w:top w:val="single" w:color="BFC9D6" w:sz="4"/>
+              <w:left w:val="single" w:color="BFC9D6" w:sz="4"/>
+              <w:bottom w:val="single" w:color="BFC9D6" w:sz="4"/>
+              <w:right w:val="single" w:color="BFC9D6" w:sz="4"/>
+            </w:tcBorders>
+            <w:shd w:fill="F6F8FB" w:color="auto" w:val="clear"/>
+            <w:tcMar>
+              <w:top w:type="dxa" w:w="60"/>
+              <w:left w:type="dxa" w:w="100"/>
+              <w:bottom w:type="dxa" w:w="60"/>
+              <w:right w:type="dxa" w:w="100"/>
+            </w:tcMar>
+          </w:tcPr>
+          <w:p>
+            <w:r>
+              <w:rPr>
+                <w:sz w:val="19"/>
+                <w:szCs w:val="19"/>
+              </w:rPr>
               <w:t xml:space="preserve">Classify, filter, score in general</w:t>
             </w:r>
           </w:p>
@@ -1213,7 +1298,7 @@
               <w:bottom w:val="single" w:color="BFC9D6" w:sz="4"/>
               <w:right w:val="single" w:color="BFC9D6" w:sz="4"/>
             </w:tcBorders>
-            <w:shd w:fill="FFFFFF" w:color="auto" w:val="clear"/>
+            <w:shd w:fill="F6F8FB" w:color="auto" w:val="clear"/>
             <w:tcMar>
               <w:top w:type="dxa" w:w="60"/>
               <w:left w:type="dxa" w:w="100"/>
@@ -1240,7 +1325,7 @@
               <w:bottom w:val="single" w:color="BFC9D6" w:sz="4"/>
               <w:right w:val="single" w:color="BFC9D6" w:sz="4"/>
             </w:tcBorders>
-            <w:shd w:fill="FFFFFF" w:color="auto" w:val="clear"/>
+            <w:shd w:fill="F6F8FB" w:color="auto" w:val="clear"/>
             <w:tcMar>
               <w:top w:type="dxa" w:w="60"/>
               <w:left w:type="dxa" w:w="100"/>
@@ -3418,6 +3503,95 @@
           </w:p>
         </w:tc>
       </w:tr>
+      <w:tr>
+        <w:tc>
+          <w:tcPr>
+            <w:tcW w:type="dxa" w:w="3300"/>
+            <w:tcBorders>
+              <w:top w:val="single" w:color="BFC9D6" w:sz="4"/>
+              <w:left w:val="single" w:color="BFC9D6" w:sz="4"/>
+              <w:bottom w:val="single" w:color="BFC9D6" w:sz="4"/>
+              <w:right w:val="single" w:color="BFC9D6" w:sz="4"/>
+            </w:tcBorders>
+            <w:shd w:fill="F6F8FB" w:color="auto" w:val="clear"/>
+            <w:tcMar>
+              <w:top w:type="dxa" w:w="60"/>
+              <w:left w:type="dxa" w:w="100"/>
+              <w:bottom w:type="dxa" w:w="60"/>
+              <w:right w:type="dxa" w:w="100"/>
+            </w:tcMar>
+          </w:tcPr>
+          <w:p>
+            <w:r>
+              <w:rPr>
+                <w:rFonts w:ascii="Consolas" w:cs="Consolas" w:eastAsia="Consolas" w:hAnsi="Consolas"/>
+                <w:color w:val="0B4F8A"/>
+                <w:sz w:val="19"/>
+                <w:szCs w:val="19"/>
+              </w:rPr>
+              <w:t xml:space="preserve">uMakerAi.Jev.Batch</w:t>
+            </w:r>
+          </w:p>
+        </w:tc>
+        <w:tc>
+          <w:tcPr>
+            <w:tcW w:type="dxa" w:w="1700"/>
+            <w:tcBorders>
+              <w:top w:val="single" w:color="BFC9D6" w:sz="4"/>
+              <w:left w:val="single" w:color="BFC9D6" w:sz="4"/>
+              <w:bottom w:val="single" w:color="BFC9D6" w:sz="4"/>
+              <w:right w:val="single" w:color="BFC9D6" w:sz="4"/>
+            </w:tcBorders>
+            <w:shd w:fill="F6F8FB" w:color="auto" w:val="clear"/>
+            <w:tcMar>
+              <w:top w:type="dxa" w:w="60"/>
+              <w:left w:type="dxa" w:w="100"/>
+              <w:bottom w:type="dxa" w:w="60"/>
+              <w:right w:type="dxa" w:w="100"/>
+            </w:tcMar>
+          </w:tcPr>
+          <w:p>
+            <w:r>
+              <w:rPr>
+                <w:rFonts w:ascii="Consolas" w:cs="Consolas" w:eastAsia="Consolas" w:hAnsi="Consolas"/>
+                <w:color w:val="0B4F8A"/>
+                <w:sz w:val="19"/>
+                <w:szCs w:val="19"/>
+              </w:rPr>
+              <w:t xml:space="preserve">Source/Tools</w:t>
+            </w:r>
+          </w:p>
+        </w:tc>
+        <w:tc>
+          <w:tcPr>
+            <w:tcW w:type="dxa" w:w="4360"/>
+            <w:tcBorders>
+              <w:top w:val="single" w:color="BFC9D6" w:sz="4"/>
+              <w:left w:val="single" w:color="BFC9D6" w:sz="4"/>
+              <w:bottom w:val="single" w:color="BFC9D6" w:sz="4"/>
+              <w:right w:val="single" w:color="BFC9D6" w:sz="4"/>
+            </w:tcBorders>
+            <w:shd w:fill="F6F8FB" w:color="auto" w:val="clear"/>
+            <w:tcMar>
+              <w:top w:type="dxa" w:w="60"/>
+              <w:left w:type="dxa" w:w="100"/>
+              <w:bottom w:type="dxa" w:w="60"/>
+              <w:right w:type="dxa" w:w="100"/>
+            </w:tcMar>
+          </w:tcPr>
+          <w:p>
+            <w:r>
+              <w:rPr>
+                <w:rFonts w:ascii="Consolas" w:cs="Consolas" w:eastAsia="Consolas" w:hAnsi="Consolas"/>
+                <w:color w:val="0B4F8A"/>
+                <w:sz w:val="19"/>
+                <w:szCs w:val="19"/>
+              </w:rPr>
+              <w:t xml:space="preserve">TAiJevBatchLabeler</w:t>
+            </w:r>
+          </w:p>
+        </w:tc>
+      </w:tr>
     </w:tbl>
     <w:p>
       <w:pPr>
@@ -12878,7 +13052,7 @@
         <w:pageBreakBefore/>
       </w:pPr>
       <w:r>
-        <w:t xml:space="preserve">8. Evals and RAG</w:t>
+        <w:t xml:space="preserve">8. Evals, RAG and bulk labeling</w:t>
       </w:r>
     </w:p>
     <w:p>
@@ -14191,6 +14365,792 @@
     </w:p>
     <w:p>
       <w:pPr>
+        <w:pStyle w:val="Heading2"/>
+      </w:pPr>
+      <w:r>
+        <w:t xml:space="preserve">8.3 Bulk labeling</w:t>
+      </w:r>
+    </w:p>
+    <w:p>
+      <w:pPr>
+        <w:spacing w:after="120"/>
+      </w:pPr>
+      <w:r>
+        <w:rPr>
+          <w:rFonts w:ascii="Consolas" w:cs="Consolas" w:eastAsia="Consolas" w:hAnsi="Consolas"/>
+          <w:color w:val="0B4F8A"/>
+          <w:sz w:val="19"/>
+          <w:szCs w:val="19"/>
+        </w:rPr>
+        <w:t xml:space="preserve">TAiJevBatchLabeler</w:t>
+      </w:r>
+      <w:r>
+        <w:t xml:space="preserve"> runs the same questions over many rows, one call per row and in parallel, and returns a report with each row's label, confidence and top-3 alternatives, the total cost, and the rows worth a human review.</w:t>
+      </w:r>
+    </w:p>
+    <w:p>
+      <w:pPr>
+        <w:pBdr>
+          <w:left w:val="single" w:color="2E75B6" w:sz="12" w:space="6"/>
+        </w:pBdr>
+        <w:shd w:fill="F3F5F8" w:color="auto" w:val="clear"/>
+        <w:spacing w:after="0" w:before="60" w:line="260"/>
+        <w:ind w:left="120"/>
+      </w:pPr>
+      <w:r>
+        <w:rPr>
+          <w:rFonts w:ascii="Consolas" w:cs="Consolas" w:eastAsia="Consolas" w:hAnsi="Consolas"/>
+          <w:sz w:val="17"/>
+          <w:szCs w:val="17"/>
+        </w:rPr>
+        <w:t xml:space="preserve">uses uMakerAi.Jev.Batch;</w:t>
+      </w:r>
+    </w:p>
+    <w:p>
+      <w:pPr>
+        <w:pBdr>
+          <w:left w:val="single" w:color="2E75B6" w:sz="12" w:space="6"/>
+        </w:pBdr>
+        <w:shd w:fill="F3F5F8" w:color="auto" w:val="clear"/>
+        <w:spacing w:after="0" w:before="0" w:line="260"/>
+        <w:ind w:left="120"/>
+      </w:pPr>
+      <w:r>
+        <w:rPr>
+          <w:rFonts w:ascii="Consolas" w:cs="Consolas" w:eastAsia="Consolas" w:hAnsi="Consolas"/>
+          <w:sz w:val="17"/>
+          <w:szCs w:val="17"/>
+        </w:rPr>
+        <w:t xml:space="preserve"> </w:t>
+      </w:r>
+    </w:p>
+    <w:p>
+      <w:pPr>
+        <w:pBdr>
+          <w:left w:val="single" w:color="2E75B6" w:sz="12" w:space="6"/>
+        </w:pBdr>
+        <w:shd w:fill="F3F5F8" w:color="auto" w:val="clear"/>
+        <w:spacing w:after="0" w:before="0" w:line="260"/>
+        <w:ind w:left="120"/>
+      </w:pPr>
+      <w:r>
+        <w:rPr>
+          <w:rFonts w:ascii="Consolas" w:cs="Consolas" w:eastAsia="Consolas" w:hAnsi="Consolas"/>
+          <w:sz w:val="17"/>
+          <w:szCs w:val="17"/>
+        </w:rPr>
+        <w:t xml:space="preserve">Labeler := TAiJevBatchLabeler.Create(nil);</w:t>
+      </w:r>
+    </w:p>
+    <w:p>
+      <w:pPr>
+        <w:pBdr>
+          <w:left w:val="single" w:color="2E75B6" w:sz="12" w:space="6"/>
+        </w:pBdr>
+        <w:shd w:fill="F3F5F8" w:color="auto" w:val="clear"/>
+        <w:spacing w:after="0" w:before="0" w:line="260"/>
+        <w:ind w:left="120"/>
+      </w:pPr>
+      <w:r>
+        <w:rPr>
+          <w:rFonts w:ascii="Consolas" w:cs="Consolas" w:eastAsia="Consolas" w:hAnsi="Consolas"/>
+          <w:sz w:val="17"/>
+          <w:szCs w:val="17"/>
+        </w:rPr>
+        <w:t xml:space="preserve">Labeler.Questions.AddChoice('category', 'Which category does `item` belong to?',</w:t>
+      </w:r>
+    </w:p>
+    <w:p>
+      <w:pPr>
+        <w:pBdr>
+          <w:left w:val="single" w:color="2E75B6" w:sz="12" w:space="6"/>
+        </w:pBdr>
+        <w:shd w:fill="F3F5F8" w:color="auto" w:val="clear"/>
+        <w:spacing w:after="0" w:before="0" w:line="260"/>
+        <w:ind w:left="120"/>
+      </w:pPr>
+      <w:r>
+        <w:rPr>
+          <w:rFonts w:ascii="Consolas" w:cs="Consolas" w:eastAsia="Consolas" w:hAnsi="Consolas"/>
+          <w:sz w:val="17"/>
+          <w:szCs w:val="17"/>
+        </w:rPr>
+        <w:t xml:space="preserve">  ['spam=Unsolicited advertising', 'urgent=Needs action today', 'archive']);</w:t>
+      </w:r>
+    </w:p>
+    <w:p>
+      <w:pPr>
+        <w:pBdr>
+          <w:left w:val="single" w:color="2E75B6" w:sz="12" w:space="6"/>
+        </w:pBdr>
+        <w:shd w:fill="F3F5F8" w:color="auto" w:val="clear"/>
+        <w:spacing w:after="0" w:before="0" w:line="260"/>
+        <w:ind w:left="120"/>
+      </w:pPr>
+      <w:r>
+        <w:rPr>
+          <w:rFonts w:ascii="Consolas" w:cs="Consolas" w:eastAsia="Consolas" w:hAnsi="Consolas"/>
+          <w:sz w:val="17"/>
+          <w:szCs w:val="17"/>
+        </w:rPr>
+        <w:t xml:space="preserve">Labeler.ReviewThreshold := 0.8;</w:t>
+      </w:r>
+    </w:p>
+    <w:p>
+      <w:pPr>
+        <w:pBdr>
+          <w:left w:val="single" w:color="2E75B6" w:sz="12" w:space="6"/>
+        </w:pBdr>
+        <w:shd w:fill="F3F5F8" w:color="auto" w:val="clear"/>
+        <w:spacing w:after="0" w:before="0" w:line="260"/>
+        <w:ind w:left="120"/>
+      </w:pPr>
+      <w:r>
+        <w:rPr>
+          <w:rFonts w:ascii="Consolas" w:cs="Consolas" w:eastAsia="Consolas" w:hAnsi="Consolas"/>
+          <w:sz w:val="17"/>
+          <w:szCs w:val="17"/>
+        </w:rPr>
+        <w:t xml:space="preserve">Labeler.MaxParallel := 16;</w:t>
+      </w:r>
+    </w:p>
+    <w:p>
+      <w:pPr>
+        <w:pBdr>
+          <w:left w:val="single" w:color="2E75B6" w:sz="12" w:space="6"/>
+        </w:pBdr>
+        <w:shd w:fill="F3F5F8" w:color="auto" w:val="clear"/>
+        <w:spacing w:after="0" w:before="0" w:line="260"/>
+        <w:ind w:left="120"/>
+      </w:pPr>
+      <w:r>
+        <w:rPr>
+          <w:rFonts w:ascii="Consolas" w:cs="Consolas" w:eastAsia="Consolas" w:hAnsi="Consolas"/>
+          <w:sz w:val="17"/>
+          <w:szCs w:val="17"/>
+        </w:rPr>
+        <w:t xml:space="preserve"> </w:t>
+      </w:r>
+    </w:p>
+    <w:p>
+      <w:pPr>
+        <w:pBdr>
+          <w:left w:val="single" w:color="2E75B6" w:sz="12" w:space="6"/>
+        </w:pBdr>
+        <w:shd w:fill="F3F5F8" w:color="auto" w:val="clear"/>
+        <w:spacing w:after="0" w:before="0" w:line="260"/>
+        <w:ind w:left="120"/>
+      </w:pPr>
+      <w:r>
+        <w:rPr>
+          <w:rFonts w:ascii="Consolas" w:cs="Consolas" w:eastAsia="Consolas" w:hAnsi="Consolas"/>
+          <w:sz w:val="17"/>
+          <w:szCs w:val="17"/>
+        </w:rPr>
+        <w:t xml:space="preserve">Report := Labeler.Run(Texts);               // or Run(JsonStates) for multi-field rows</w:t>
+      </w:r>
+    </w:p>
+    <w:p>
+      <w:pPr>
+        <w:pBdr>
+          <w:left w:val="single" w:color="2E75B6" w:sz="12" w:space="6"/>
+        </w:pBdr>
+        <w:shd w:fill="F3F5F8" w:color="auto" w:val="clear"/>
+        <w:spacing w:after="0" w:before="0" w:line="260"/>
+        <w:ind w:left="120"/>
+      </w:pPr>
+      <w:r>
+        <w:rPr>
+          <w:rFonts w:ascii="Consolas" w:cs="Consolas" w:eastAsia="Consolas" w:hAnsi="Consolas"/>
+          <w:sz w:val="17"/>
+          <w:szCs w:val="17"/>
+        </w:rPr>
+        <w:t xml:space="preserve">try</w:t>
+      </w:r>
+    </w:p>
+    <w:p>
+      <w:pPr>
+        <w:pBdr>
+          <w:left w:val="single" w:color="2E75B6" w:sz="12" w:space="6"/>
+        </w:pBdr>
+        <w:shd w:fill="F3F5F8" w:color="auto" w:val="clear"/>
+        <w:spacing w:after="0" w:before="0" w:line="260"/>
+        <w:ind w:left="120"/>
+      </w:pPr>
+      <w:r>
+        <w:rPr>
+          <w:rFonts w:ascii="Consolas" w:cs="Consolas" w:eastAsia="Consolas" w:hAnsi="Consolas"/>
+          <w:sz w:val="17"/>
+          <w:szCs w:val="17"/>
+        </w:rPr>
+        <w:t xml:space="preserve">  for Item in Report.NeedsReview do         // what deserves a human look</w:t>
+      </w:r>
+    </w:p>
+    <w:p>
+      <w:pPr>
+        <w:pBdr>
+          <w:left w:val="single" w:color="2E75B6" w:sz="12" w:space="6"/>
+        </w:pBdr>
+        <w:shd w:fill="F3F5F8" w:color="auto" w:val="clear"/>
+        <w:spacing w:after="0" w:before="0" w:line="260"/>
+        <w:ind w:left="120"/>
+      </w:pPr>
+      <w:r>
+        <w:rPr>
+          <w:rFonts w:ascii="Consolas" w:cs="Consolas" w:eastAsia="Consolas" w:hAnsi="Consolas"/>
+          <w:sz w:val="17"/>
+          <w:szCs w:val="17"/>
+        </w:rPr>
+        <w:t xml:space="preserve">    Writeln(Item.Input, ' -&gt; ', string.Join(', ', Item.Top));</w:t>
+      </w:r>
+    </w:p>
+    <w:p>
+      <w:pPr>
+        <w:pBdr>
+          <w:left w:val="single" w:color="2E75B6" w:sz="12" w:space="6"/>
+        </w:pBdr>
+        <w:shd w:fill="F3F5F8" w:color="auto" w:val="clear"/>
+        <w:spacing w:after="0" w:before="0" w:line="260"/>
+        <w:ind w:left="120"/>
+      </w:pPr>
+      <w:r>
+        <w:rPr>
+          <w:rFonts w:ascii="Consolas" w:cs="Consolas" w:eastAsia="Consolas" w:hAnsi="Consolas"/>
+          <w:sz w:val="17"/>
+          <w:szCs w:val="17"/>
+        </w:rPr>
+        <w:t xml:space="preserve">  Report.SaveToCSV('results.csv');</w:t>
+      </w:r>
+    </w:p>
+    <w:p>
+      <w:pPr>
+        <w:pBdr>
+          <w:left w:val="single" w:color="2E75B6" w:sz="12" w:space="6"/>
+        </w:pBdr>
+        <w:shd w:fill="F3F5F8" w:color="auto" w:val="clear"/>
+        <w:spacing w:after="0" w:before="0" w:line="260"/>
+        <w:ind w:left="120"/>
+      </w:pPr>
+      <w:r>
+        <w:rPr>
+          <w:rFonts w:ascii="Consolas" w:cs="Consolas" w:eastAsia="Consolas" w:hAnsi="Consolas"/>
+          <w:sz w:val="17"/>
+          <w:szCs w:val="17"/>
+        </w:rPr>
+        <w:t xml:space="preserve">  Writeln(Format('US$%.4f in %d ms', [Report.CostUSD, Report.ElapsedMs]));</w:t>
+      </w:r>
+    </w:p>
+    <w:p>
+      <w:pPr>
+        <w:pBdr>
+          <w:left w:val="single" w:color="2E75B6" w:sz="12" w:space="6"/>
+        </w:pBdr>
+        <w:shd w:fill="F3F5F8" w:color="auto" w:val="clear"/>
+        <w:spacing w:after="0" w:before="0" w:line="260"/>
+        <w:ind w:left="120"/>
+      </w:pPr>
+      <w:r>
+        <w:rPr>
+          <w:rFonts w:ascii="Consolas" w:cs="Consolas" w:eastAsia="Consolas" w:hAnsi="Consolas"/>
+          <w:sz w:val="17"/>
+          <w:szCs w:val="17"/>
+        </w:rPr>
+        <w:t xml:space="preserve">finally</w:t>
+      </w:r>
+    </w:p>
+    <w:p>
+      <w:pPr>
+        <w:pBdr>
+          <w:left w:val="single" w:color="2E75B6" w:sz="12" w:space="6"/>
+        </w:pBdr>
+        <w:shd w:fill="F3F5F8" w:color="auto" w:val="clear"/>
+        <w:spacing w:after="0" w:before="0" w:line="260"/>
+        <w:ind w:left="120"/>
+      </w:pPr>
+      <w:r>
+        <w:rPr>
+          <w:rFonts w:ascii="Consolas" w:cs="Consolas" w:eastAsia="Consolas" w:hAnsi="Consolas"/>
+          <w:sz w:val="17"/>
+          <w:szCs w:val="17"/>
+        </w:rPr>
+        <w:t xml:space="preserve">  Report.Free;</w:t>
+      </w:r>
+    </w:p>
+    <w:p>
+      <w:pPr>
+        <w:pBdr>
+          <w:left w:val="single" w:color="2E75B6" w:sz="12" w:space="6"/>
+        </w:pBdr>
+        <w:shd w:fill="F3F5F8" w:color="auto" w:val="clear"/>
+        <w:spacing w:after="180" w:before="0" w:line="260"/>
+        <w:ind w:left="120"/>
+      </w:pPr>
+      <w:r>
+        <w:rPr>
+          <w:rFonts w:ascii="Consolas" w:cs="Consolas" w:eastAsia="Consolas" w:hAnsi="Consolas"/>
+          <w:sz w:val="17"/>
+          <w:szCs w:val="17"/>
+        </w:rPr>
+        <w:t xml:space="preserve">end;</w:t>
+      </w:r>
+    </w:p>
+    <w:p>
+      <w:pPr>
+        <w:pStyle w:val="ListParagraph"/>
+        <w:numPr>
+          <w:ilvl w:val="0"/>
+          <w:numId w:val="2"/>
+        </w:numPr>
+        <w:spacing w:after="60"/>
+      </w:pPr>
+      <w:r>
+        <w:rPr>
+          <w:b/>
+          <w:bCs/>
+        </w:rPr>
+        <w:t xml:space="preserve">A failing row never stops the batch</w:t>
+      </w:r>
+      <w:r>
+        <w:t xml:space="preserve">: it keeps its </w:t>
+      </w:r>
+      <w:r>
+        <w:rPr>
+          <w:rFonts w:ascii="Consolas" w:cs="Consolas" w:eastAsia="Consolas" w:hAnsi="Consolas"/>
+          <w:color w:val="0B4F8A"/>
+          <w:sz w:val="19"/>
+          <w:szCs w:val="19"/>
+        </w:rPr>
+        <w:t xml:space="preserve">Error</w:t>
+      </w:r>
+      <w:r>
+        <w:t xml:space="preserve"> and the rest continue.</w:t>
+      </w:r>
+    </w:p>
+    <w:p>
+      <w:pPr>
+        <w:pStyle w:val="ListParagraph"/>
+        <w:numPr>
+          <w:ilvl w:val="0"/>
+          <w:numId w:val="2"/>
+        </w:numPr>
+        <w:spacing w:after="60"/>
+      </w:pPr>
+      <w:r>
+        <w:t xml:space="preserve">Questions are validated before the first call. </w:t>
+      </w:r>
+      <w:r>
+        <w:rPr>
+          <w:rFonts w:ascii="Consolas" w:cs="Consolas" w:eastAsia="Consolas" w:hAnsi="Consolas"/>
+          <w:color w:val="0B4F8A"/>
+          <w:sz w:val="19"/>
+          <w:szCs w:val="19"/>
+        </w:rPr>
+        <w:t xml:space="preserve">Cancel</w:t>
+      </w:r>
+      <w:r>
+        <w:t xml:space="preserve"> stops the batch from another thread.</w:t>
+      </w:r>
+    </w:p>
+    <w:p>
+      <w:pPr>
+        <w:pStyle w:val="ListParagraph"/>
+        <w:numPr>
+          <w:ilvl w:val="0"/>
+          <w:numId w:val="2"/>
+        </w:numPr>
+        <w:spacing w:after="60"/>
+      </w:pPr>
+      <w:r>
+        <w:rPr>
+          <w:rFonts w:ascii="Consolas" w:cs="Consolas" w:eastAsia="Consolas" w:hAnsi="Consolas"/>
+          <w:color w:val="0B4F8A"/>
+          <w:sz w:val="19"/>
+          <w:szCs w:val="19"/>
+        </w:rPr>
+        <w:t xml:space="preserve">OnProgress</w:t>
+      </w:r>
+      <w:r>
+        <w:t xml:space="preserve"> fires from pool threads: for UI work, use </w:t>
+      </w:r>
+      <w:r>
+        <w:rPr>
+          <w:rFonts w:ascii="Consolas" w:cs="Consolas" w:eastAsia="Consolas" w:hAnsi="Consolas"/>
+          <w:color w:val="0B4F8A"/>
+          <w:sz w:val="19"/>
+          <w:szCs w:val="19"/>
+        </w:rPr>
+        <w:t xml:space="preserve">TThread.Queue</w:t>
+      </w:r>
+      <w:r>
+        <w:t xml:space="preserve">.</w:t>
+      </w:r>
+    </w:p>
+    <w:p>
+      <w:pPr>
+        <w:pStyle w:val="ListParagraph"/>
+        <w:numPr>
+          <w:ilvl w:val="0"/>
+          <w:numId w:val="2"/>
+        </w:numPr>
+        <w:spacing w:after="60"/>
+      </w:pPr>
+      <w:r>
+        <w:t xml:space="preserve">Each row uses its own </w:t>
+      </w:r>
+      <w:r>
+        <w:rPr>
+          <w:rFonts w:ascii="Consolas" w:cs="Consolas" w:eastAsia="Consolas" w:hAnsi="Consolas"/>
+          <w:color w:val="0B4F8A"/>
+          <w:sz w:val="19"/>
+          <w:szCs w:val="19"/>
+        </w:rPr>
+        <w:t xml:space="preserve">TAiJev</w:t>
+      </w:r>
+      <w:r>
+        <w:t xml:space="preserve">; with an external </w:t>
+      </w:r>
+      <w:r>
+        <w:rPr>
+          <w:rFonts w:ascii="Consolas" w:cs="Consolas" w:eastAsia="Consolas" w:hAnsi="Consolas"/>
+          <w:color w:val="0B4F8A"/>
+          <w:sz w:val="19"/>
+          <w:szCs w:val="19"/>
+        </w:rPr>
+        <w:t xml:space="preserve">Jev</w:t>
+      </w:r>
+      <w:r>
+        <w:t xml:space="preserve"> assigned, rows run serially.</w:t>
+      </w:r>
+    </w:p>
+    <w:tbl>
+      <w:tblPr>
+        <w:tblW w:type="dxa" w:w="9360"/>
+        <w:tblBorders>
+          <w:top w:val="single" w:color="auto" w:sz="4"/>
+          <w:left w:val="single" w:color="auto" w:sz="4"/>
+          <w:bottom w:val="single" w:color="auto" w:sz="4"/>
+          <w:right w:val="single" w:color="auto" w:sz="4"/>
+          <w:insideH w:val="single" w:color="auto" w:sz="4"/>
+          <w:insideV w:val="single" w:color="auto" w:sz="4"/>
+        </w:tblBorders>
+      </w:tblPr>
+      <w:tblGrid>
+        <w:gridCol w:w="4200"/>
+        <w:gridCol w:w="5160"/>
+      </w:tblGrid>
+      <w:tr>
+        <w:trPr>
+          <w:tblHeader/>
+        </w:trPr>
+        <w:tc>
+          <w:tcPr>
+            <w:tcW w:type="dxa" w:w="4200"/>
+            <w:tcBorders>
+              <w:top w:val="single" w:color="BFC9D6" w:sz="4"/>
+              <w:left w:val="single" w:color="BFC9D6" w:sz="4"/>
+              <w:bottom w:val="single" w:color="BFC9D6" w:sz="4"/>
+              <w:right w:val="single" w:color="BFC9D6" w:sz="4"/>
+            </w:tcBorders>
+            <w:shd w:fill="1F3A5F" w:color="auto" w:val="clear"/>
+            <w:tcMar>
+              <w:top w:type="dxa" w:w="60"/>
+              <w:left w:type="dxa" w:w="100"/>
+              <w:bottom w:type="dxa" w:w="60"/>
+              <w:right w:type="dxa" w:w="100"/>
+            </w:tcMar>
+          </w:tcPr>
+          <w:p>
+            <w:r>
+              <w:rPr>
+                <w:b/>
+                <w:bCs/>
+                <w:color w:val="FFFFFF"/>
+                <w:sz w:val="19"/>
+                <w:szCs w:val="19"/>
+              </w:rPr>
+              <w:t xml:space="preserve">Measurement (126 entries, 225 chart-of-accounts codes)</w:t>
+            </w:r>
+          </w:p>
+        </w:tc>
+        <w:tc>
+          <w:tcPr>
+            <w:tcW w:type="dxa" w:w="5160"/>
+            <w:tcBorders>
+              <w:top w:val="single" w:color="BFC9D6" w:sz="4"/>
+              <w:left w:val="single" w:color="BFC9D6" w:sz="4"/>
+              <w:bottom w:val="single" w:color="BFC9D6" w:sz="4"/>
+              <w:right w:val="single" w:color="BFC9D6" w:sz="4"/>
+            </w:tcBorders>
+            <w:shd w:fill="1F3A5F" w:color="auto" w:val="clear"/>
+            <w:tcMar>
+              <w:top w:type="dxa" w:w="60"/>
+              <w:left w:type="dxa" w:w="100"/>
+              <w:bottom w:type="dxa" w:w="60"/>
+              <w:right w:type="dxa" w:w="100"/>
+            </w:tcMar>
+          </w:tcPr>
+          <w:p>
+            <w:r>
+              <w:rPr>
+                <w:b/>
+                <w:bCs/>
+                <w:color w:val="FFFFFF"/>
+                <w:sz w:val="19"/>
+                <w:szCs w:val="19"/>
+              </w:rPr>
+              <w:t xml:space="preserve">Result</w:t>
+            </w:r>
+          </w:p>
+        </w:tc>
+      </w:tr>
+      <w:tr>
+        <w:tc>
+          <w:tcPr>
+            <w:tcW w:type="dxa" w:w="4200"/>
+            <w:tcBorders>
+              <w:top w:val="single" w:color="BFC9D6" w:sz="4"/>
+              <w:left w:val="single" w:color="BFC9D6" w:sz="4"/>
+              <w:bottom w:val="single" w:color="BFC9D6" w:sz="4"/>
+              <w:right w:val="single" w:color="BFC9D6" w:sz="4"/>
+            </w:tcBorders>
+            <w:shd w:fill="FFFFFF" w:color="auto" w:val="clear"/>
+            <w:tcMar>
+              <w:top w:type="dxa" w:w="60"/>
+              <w:left w:type="dxa" w:w="100"/>
+              <w:bottom w:type="dxa" w:w="60"/>
+              <w:right w:type="dxa" w:w="100"/>
+            </w:tcMar>
+          </w:tcPr>
+          <w:p>
+            <w:r>
+              <w:rPr>
+                <w:sz w:val="19"/>
+                <w:szCs w:val="19"/>
+              </w:rPr>
+              <w:t xml:space="preserve">Overall accuracy</w:t>
+            </w:r>
+          </w:p>
+        </w:tc>
+        <w:tc>
+          <w:tcPr>
+            <w:tcW w:type="dxa" w:w="5160"/>
+            <w:tcBorders>
+              <w:top w:val="single" w:color="BFC9D6" w:sz="4"/>
+              <w:left w:val="single" w:color="BFC9D6" w:sz="4"/>
+              <w:bottom w:val="single" w:color="BFC9D6" w:sz="4"/>
+              <w:right w:val="single" w:color="BFC9D6" w:sz="4"/>
+            </w:tcBorders>
+            <w:shd w:fill="FFFFFF" w:color="auto" w:val="clear"/>
+            <w:tcMar>
+              <w:top w:type="dxa" w:w="60"/>
+              <w:left w:type="dxa" w:w="100"/>
+              <w:bottom w:type="dxa" w:w="60"/>
+              <w:right w:type="dxa" w:w="100"/>
+            </w:tcMar>
+          </w:tcPr>
+          <w:p>
+            <w:r>
+              <w:rPr>
+                <w:sz w:val="19"/>
+                <w:szCs w:val="19"/>
+              </w:rPr>
+              <w:t xml:space="preserve">117/126 (92.9%); the Python prototype scored 119/126</w:t>
+            </w:r>
+          </w:p>
+        </w:tc>
+      </w:tr>
+      <w:tr>
+        <w:tc>
+          <w:tcPr>
+            <w:tcW w:type="dxa" w:w="4200"/>
+            <w:tcBorders>
+              <w:top w:val="single" w:color="BFC9D6" w:sz="4"/>
+              <w:left w:val="single" w:color="BFC9D6" w:sz="4"/>
+              <w:bottom w:val="single" w:color="BFC9D6" w:sz="4"/>
+              <w:right w:val="single" w:color="BFC9D6" w:sz="4"/>
+            </w:tcBorders>
+            <w:shd w:fill="F6F8FB" w:color="auto" w:val="clear"/>
+            <w:tcMar>
+              <w:top w:type="dxa" w:w="60"/>
+              <w:left w:type="dxa" w:w="100"/>
+              <w:bottom w:type="dxa" w:w="60"/>
+              <w:right w:type="dxa" w:w="100"/>
+            </w:tcMar>
+          </w:tcPr>
+          <w:p>
+            <w:r>
+              <w:rPr>
+                <w:sz w:val="19"/>
+                <w:szCs w:val="19"/>
+              </w:rPr>
+              <w:t xml:space="preserve">Automatic (confidence ≥ 0.8)</w:t>
+            </w:r>
+          </w:p>
+        </w:tc>
+        <w:tc>
+          <w:tcPr>
+            <w:tcW w:type="dxa" w:w="5160"/>
+            <w:tcBorders>
+              <w:top w:val="single" w:color="BFC9D6" w:sz="4"/>
+              <w:left w:val="single" w:color="BFC9D6" w:sz="4"/>
+              <w:bottom w:val="single" w:color="BFC9D6" w:sz="4"/>
+              <w:right w:val="single" w:color="BFC9D6" w:sz="4"/>
+            </w:tcBorders>
+            <w:shd w:fill="F6F8FB" w:color="auto" w:val="clear"/>
+            <w:tcMar>
+              <w:top w:type="dxa" w:w="60"/>
+              <w:left w:type="dxa" w:w="100"/>
+              <w:bottom w:type="dxa" w:w="60"/>
+              <w:right w:type="dxa" w:w="100"/>
+            </w:tcMar>
+          </w:tcPr>
+          <w:p>
+            <w:r>
+              <w:rPr>
+                <w:sz w:val="19"/>
+                <w:szCs w:val="19"/>
+              </w:rPr>
+              <w:t xml:space="preserve">77 rows (61%) with </w:t>
+            </w:r>
+            <w:r>
+              <w:rPr>
+                <w:b/>
+                <w:bCs/>
+                <w:sz w:val="19"/>
+                <w:szCs w:val="19"/>
+              </w:rPr>
+              <w:t xml:space="preserve">100%</w:t>
+            </w:r>
+            <w:r>
+              <w:rPr>
+                <w:sz w:val="19"/>
+                <w:szCs w:val="19"/>
+              </w:rPr>
+              <w:t xml:space="preserve"> accuracy</w:t>
+            </w:r>
+          </w:p>
+        </w:tc>
+      </w:tr>
+      <w:tr>
+        <w:tc>
+          <w:tcPr>
+            <w:tcW w:type="dxa" w:w="4200"/>
+            <w:tcBorders>
+              <w:top w:val="single" w:color="BFC9D6" w:sz="4"/>
+              <w:left w:val="single" w:color="BFC9D6" w:sz="4"/>
+              <w:bottom w:val="single" w:color="BFC9D6" w:sz="4"/>
+              <w:right w:val="single" w:color="BFC9D6" w:sz="4"/>
+            </w:tcBorders>
+            <w:shd w:fill="FFFFFF" w:color="auto" w:val="clear"/>
+            <w:tcMar>
+              <w:top w:type="dxa" w:w="60"/>
+              <w:left w:type="dxa" w:w="100"/>
+              <w:bottom w:type="dxa" w:w="60"/>
+              <w:right w:type="dxa" w:w="100"/>
+            </w:tcMar>
+          </w:tcPr>
+          <w:p>
+            <w:r>
+              <w:rPr>
+                <w:sz w:val="19"/>
+                <w:szCs w:val="19"/>
+              </w:rPr>
+              <w:t xml:space="preserve">Tokens / cost / time</w:t>
+            </w:r>
+          </w:p>
+        </w:tc>
+        <w:tc>
+          <w:tcPr>
+            <w:tcW w:type="dxa" w:w="5160"/>
+            <w:tcBorders>
+              <w:top w:val="single" w:color="BFC9D6" w:sz="4"/>
+              <w:left w:val="single" w:color="BFC9D6" w:sz="4"/>
+              <w:bottom w:val="single" w:color="BFC9D6" w:sz="4"/>
+              <w:right w:val="single" w:color="BFC9D6" w:sz="4"/>
+            </w:tcBorders>
+            <w:shd w:fill="FFFFFF" w:color="auto" w:val="clear"/>
+            <w:tcMar>
+              <w:top w:type="dxa" w:w="60"/>
+              <w:left w:type="dxa" w:w="100"/>
+              <w:bottom w:type="dxa" w:w="60"/>
+              <w:right w:type="dxa" w:w="100"/>
+            </w:tcMar>
+          </w:tcPr>
+          <w:p>
+            <w:r>
+              <w:rPr>
+                <w:sz w:val="19"/>
+                <w:szCs w:val="19"/>
+              </w:rPr>
+              <w:t xml:space="preserve">1,191,860 (identical to the prototype) / US$0.05 / 4.2 s with 16 in parallel</w:t>
+            </w:r>
+          </w:p>
+        </w:tc>
+      </w:tr>
+      <w:tr>
+        <w:tc>
+          <w:tcPr>
+            <w:tcW w:type="dxa" w:w="4200"/>
+            <w:tcBorders>
+              <w:top w:val="single" w:color="BFC9D6" w:sz="4"/>
+              <w:left w:val="single" w:color="BFC9D6" w:sz="4"/>
+              <w:bottom w:val="single" w:color="BFC9D6" w:sz="4"/>
+              <w:right w:val="single" w:color="BFC9D6" w:sz="4"/>
+            </w:tcBorders>
+            <w:shd w:fill="F6F8FB" w:color="auto" w:val="clear"/>
+            <w:tcMar>
+              <w:top w:type="dxa" w:w="60"/>
+              <w:left w:type="dxa" w:w="100"/>
+              <w:bottom w:type="dxa" w:w="60"/>
+              <w:right w:type="dxa" w:w="100"/>
+            </w:tcMar>
+          </w:tcPr>
+          <w:p>
+            <w:r>
+              <w:rPr>
+                <w:sz w:val="19"/>
+                <w:szCs w:val="19"/>
+              </w:rPr>
+              <w:t xml:space="preserve">Wrong rows</w:t>
+            </w:r>
+          </w:p>
+        </w:tc>
+        <w:tc>
+          <w:tcPr>
+            <w:tcW w:type="dxa" w:w="5160"/>
+            <w:tcBorders>
+              <w:top w:val="single" w:color="BFC9D6" w:sz="4"/>
+              <w:left w:val="single" w:color="BFC9D6" w:sz="4"/>
+              <w:bottom w:val="single" w:color="BFC9D6" w:sz="4"/>
+              <w:right w:val="single" w:color="BFC9D6" w:sz="4"/>
+            </w:tcBorders>
+            <w:shd w:fill="F6F8FB" w:color="auto" w:val="clear"/>
+            <w:tcMar>
+              <w:top w:type="dxa" w:w="60"/>
+              <w:left w:type="dxa" w:w="100"/>
+              <w:bottom w:type="dxa" w:w="60"/>
+              <w:right w:type="dxa" w:w="100"/>
+            </w:tcMar>
+          </w:tcPr>
+          <w:p>
+            <w:r>
+              <w:rPr>
+                <w:sz w:val="19"/>
+                <w:szCs w:val="19"/>
+              </w:rPr>
+              <w:t xml:space="preserve">All 9 had confidence &lt; 0.8; in 7 the right account was among the top-3 suggestions</w:t>
+            </w:r>
+          </w:p>
+        </w:tc>
+      </w:tr>
+    </w:tbl>
+    <w:p>
+      <w:pPr>
+        <w:spacing w:after="80"/>
+      </w:pPr>
+    </w:p>
+    <w:p>
+      <w:pPr>
         <w:pStyle w:val="Heading1"/>
         <w:pageBreakBefore/>
       </w:pPr>
@@ -15431,7 +16391,7 @@
         <w:t xml:space="preserve">with no network and no API key</w:t>
       </w:r>
       <w:r>
-        <w:t xml:space="preserve">, with 19 new cases (57 in total).</w:t>
+        <w:t xml:space="preserve">, with 20 new cases (58 in total).</w:t>
       </w:r>
     </w:p>
     <w:p>
@@ -16288,7 +17248,7 @@
                 <w:sz w:val="19"/>
                 <w:szCs w:val="19"/>
               </w:rPr>
-              <w:t xml:space="preserve">evals.score.jev-scorer</w:t>
+              <w:t xml:space="preserve">jev.batch.labeler</w:t>
             </w:r>
           </w:p>
         </w:tc>
@@ -16312,19 +17272,10 @@
           <w:p>
             <w:r>
               <w:rPr>
-                <w:rFonts w:ascii="Consolas" w:cs="Consolas" w:eastAsia="Consolas" w:hAnsi="Consolas"/>
-                <w:color w:val="0B4F8A"/>
-                <w:sz w:val="19"/>
-                <w:szCs w:val="19"/>
-              </w:rPr>
-              <w:t xml:space="preserve">ExpectScore</w:t>
-            </w:r>
-            <w:r>
-              <w:rPr>
-                <w:sz w:val="19"/>
-                <w:szCs w:val="19"/>
-              </w:rPr>
-              <w:t xml:space="preserve"> passes, fails with the score in the reason; a Jev error fails the check without raising</w:t>
+                <w:sz w:val="19"/>
+                <w:szCs w:val="19"/>
+              </w:rPr>
+              <w:t xml:space="preserve">Label per row, isolated errors, rows to review, tokens, upfront validation, JSON states, cancellation</w:t>
             </w:r>
           </w:p>
         </w:tc>
@@ -16355,6 +17306,73 @@
                 <w:sz w:val="19"/>
                 <w:szCs w:val="19"/>
               </w:rPr>
+              <w:t xml:space="preserve">evals.score.jev-scorer</w:t>
+            </w:r>
+          </w:p>
+        </w:tc>
+        <w:tc>
+          <w:tcPr>
+            <w:tcW w:type="dxa" w:w="6360"/>
+            <w:tcBorders>
+              <w:top w:val="single" w:color="BFC9D6" w:sz="4"/>
+              <w:left w:val="single" w:color="BFC9D6" w:sz="4"/>
+              <w:bottom w:val="single" w:color="BFC9D6" w:sz="4"/>
+              <w:right w:val="single" w:color="BFC9D6" w:sz="4"/>
+            </w:tcBorders>
+            <w:shd w:fill="F6F8FB" w:color="auto" w:val="clear"/>
+            <w:tcMar>
+              <w:top w:type="dxa" w:w="60"/>
+              <w:left w:type="dxa" w:w="100"/>
+              <w:bottom w:type="dxa" w:w="60"/>
+              <w:right w:type="dxa" w:w="100"/>
+            </w:tcMar>
+          </w:tcPr>
+          <w:p>
+            <w:r>
+              <w:rPr>
+                <w:rFonts w:ascii="Consolas" w:cs="Consolas" w:eastAsia="Consolas" w:hAnsi="Consolas"/>
+                <w:color w:val="0B4F8A"/>
+                <w:sz w:val="19"/>
+                <w:szCs w:val="19"/>
+              </w:rPr>
+              <w:t xml:space="preserve">ExpectScore</w:t>
+            </w:r>
+            <w:r>
+              <w:rPr>
+                <w:sz w:val="19"/>
+                <w:szCs w:val="19"/>
+              </w:rPr>
+              <w:t xml:space="preserve"> passes, fails with the score in the reason; a Jev error fails the check without raising</w:t>
+            </w:r>
+          </w:p>
+        </w:tc>
+      </w:tr>
+      <w:tr>
+        <w:tc>
+          <w:tcPr>
+            <w:tcW w:type="dxa" w:w="3000"/>
+            <w:tcBorders>
+              <w:top w:val="single" w:color="BFC9D6" w:sz="4"/>
+              <w:left w:val="single" w:color="BFC9D6" w:sz="4"/>
+              <w:bottom w:val="single" w:color="BFC9D6" w:sz="4"/>
+              <w:right w:val="single" w:color="BFC9D6" w:sz="4"/>
+            </w:tcBorders>
+            <w:shd w:fill="FFFFFF" w:color="auto" w:val="clear"/>
+            <w:tcMar>
+              <w:top w:type="dxa" w:w="60"/>
+              <w:left w:type="dxa" w:w="100"/>
+              <w:bottom w:type="dxa" w:w="60"/>
+              <w:right w:type="dxa" w:w="100"/>
+            </w:tcMar>
+          </w:tcPr>
+          <w:p>
+            <w:r>
+              <w:rPr>
+                <w:rFonts w:ascii="Consolas" w:cs="Consolas" w:eastAsia="Consolas" w:hAnsi="Consolas"/>
+                <w:color w:val="0B4F8A"/>
+                <w:sz w:val="19"/>
+                <w:szCs w:val="19"/>
+              </w:rPr>
               <w:t xml:space="preserve">rag.rerank.jev-semantic</w:t>
             </w:r>
             <w:r>
@@ -16384,7 +17402,7 @@
               <w:bottom w:val="single" w:color="BFC9D6" w:sz="4"/>
               <w:right w:val="single" w:color="BFC9D6" w:sz="4"/>
             </w:tcBorders>
-            <w:shd w:fill="F6F8FB" w:color="auto" w:val="clear"/>
+            <w:shd w:fill="FFFFFF" w:color="auto" w:val="clear"/>
             <w:tcMar>
               <w:top w:type="dxa" w:w="60"/>
               <w:left w:type="dxa" w:w="100"/>
@@ -16758,6 +17776,64 @@
                 <w:sz w:val="19"/>
                 <w:szCs w:val="19"/>
               </w:rPr>
+              <w:t xml:space="preserve">087-JevBatchLabeling</w:t>
+            </w:r>
+          </w:p>
+        </w:tc>
+        <w:tc>
+          <w:tcPr>
+            <w:tcW w:type="dxa" w:w="6760"/>
+            <w:tcBorders>
+              <w:top w:val="single" w:color="BFC9D6" w:sz="4"/>
+              <w:left w:val="single" w:color="BFC9D6" w:sz="4"/>
+              <w:bottom w:val="single" w:color="BFC9D6" w:sz="4"/>
+              <w:right w:val="single" w:color="BFC9D6" w:sz="4"/>
+            </w:tcBorders>
+            <w:shd w:fill="FFFFFF" w:color="auto" w:val="clear"/>
+            <w:tcMar>
+              <w:top w:type="dxa" w:w="60"/>
+              <w:left w:type="dxa" w:w="100"/>
+              <w:bottom w:type="dxa" w:w="60"/>
+              <w:right w:type="dxa" w:w="100"/>
+            </w:tcMar>
+          </w:tcPr>
+          <w:p>
+            <w:r>
+              <w:rPr>
+                <w:sz w:val="19"/>
+                <w:szCs w:val="19"/>
+              </w:rPr>
+              <w:t xml:space="preserve">Bulk labeling: 126 accounting entries against 225 chart-of-accounts codes, in parallel, with accuracy, cost and rows to review</w:t>
+            </w:r>
+          </w:p>
+        </w:tc>
+      </w:tr>
+      <w:tr>
+        <w:tc>
+          <w:tcPr>
+            <w:tcW w:type="dxa" w:w="2600"/>
+            <w:tcBorders>
+              <w:top w:val="single" w:color="BFC9D6" w:sz="4"/>
+              <w:left w:val="single" w:color="BFC9D6" w:sz="4"/>
+              <w:bottom w:val="single" w:color="BFC9D6" w:sz="4"/>
+              <w:right w:val="single" w:color="BFC9D6" w:sz="4"/>
+            </w:tcBorders>
+            <w:shd w:fill="F6F8FB" w:color="auto" w:val="clear"/>
+            <w:tcMar>
+              <w:top w:type="dxa" w:w="60"/>
+              <w:left w:type="dxa" w:w="100"/>
+              <w:bottom w:type="dxa" w:w="60"/>
+              <w:right w:type="dxa" w:w="100"/>
+            </w:tcMar>
+          </w:tcPr>
+          <w:p>
+            <w:r>
+              <w:rPr>
+                <w:rFonts w:ascii="Consolas" w:cs="Consolas" w:eastAsia="Consolas" w:hAnsi="Consolas"/>
+                <w:color w:val="0B4F8A"/>
+                <w:sz w:val="19"/>
+                <w:szCs w:val="19"/>
+              </w:rPr>
               <w:t xml:space="preserve">086-JevEvalsRag</w:t>
             </w:r>
           </w:p>
@@ -16771,7 +17847,7 @@
               <w:bottom w:val="single" w:color="BFC9D6" w:sz="4"/>
               <w:right w:val="single" w:color="BFC9D6" w:sz="4"/>
             </w:tcBorders>
-            <w:shd w:fill="FFFFFF" w:color="auto" w:val="clear"/>
+            <w:shd w:fill="F6F8FB" w:color="auto" w:val="clear"/>
             <w:tcMar>
               <w:top w:type="dxa" w:w="60"/>
               <w:left w:type="dxa" w:w="100"/>
@@ -17341,7 +18417,7 @@
                 <w:sz w:val="19"/>
                 <w:szCs w:val="19"/>
               </w:rPr>
-              <w:t xml:space="preserve">Source/Core/uMakerAi.Evals.pas</w:t>
+              <w:t xml:space="preserve">Source/Tools/uMakerAi.Jev.Batch.pas</w:t>
             </w:r>
           </w:p>
         </w:tc>
@@ -17365,44 +18441,10 @@
           <w:p>
             <w:r>
               <w:rPr>
-                <w:rFonts w:ascii="Consolas" w:cs="Consolas" w:eastAsia="Consolas" w:hAnsi="Consolas"/>
-                <w:color w:val="0B4F8A"/>
-                <w:sz w:val="19"/>
-                <w:szCs w:val="19"/>
-              </w:rPr>
-              <w:t xml:space="preserve">Scorer</w:t>
-            </w:r>
-            <w:r>
-              <w:rPr>
-                <w:sz w:val="19"/>
-                <w:szCs w:val="19"/>
-              </w:rPr>
-              <w:t xml:space="preserve">, </w:t>
-            </w:r>
-            <w:r>
-              <w:rPr>
-                <w:rFonts w:ascii="Consolas" w:cs="Consolas" w:eastAsia="Consolas" w:hAnsi="Consolas"/>
-                <w:color w:val="0B4F8A"/>
-                <w:sz w:val="19"/>
-                <w:szCs w:val="19"/>
-              </w:rPr>
-              <w:t xml:space="preserve">TAiEvalScorerBase</w:t>
-            </w:r>
-            <w:r>
-              <w:rPr>
-                <w:sz w:val="19"/>
-                <w:szCs w:val="19"/>
-              </w:rPr>
-              <w:t xml:space="preserve">, </w:t>
-            </w:r>
-            <w:r>
-              <w:rPr>
-                <w:rFonts w:ascii="Consolas" w:cs="Consolas" w:eastAsia="Consolas" w:hAnsi="Consolas"/>
-                <w:color w:val="0B4F8A"/>
-                <w:sz w:val="19"/>
-                <w:szCs w:val="19"/>
-              </w:rPr>
-              <w:t xml:space="preserve">ExpectScore</w:t>
+                <w:sz w:val="19"/>
+                <w:szCs w:val="19"/>
+              </w:rPr>
+              <w:t xml:space="preserve">Bulk labeling</w:t>
             </w:r>
           </w:p>
         </w:tc>
@@ -17433,7 +18475,7 @@
                 <w:sz w:val="19"/>
                 <w:szCs w:val="19"/>
               </w:rPr>
-              <w:t xml:space="preserve">Source/RAG/uMakerAi.RAG.Vectors.pas</w:t>
+              <w:t xml:space="preserve">Source/Core/uMakerAi.Evals.pas</w:t>
             </w:r>
           </w:p>
         </w:tc>
@@ -17462,7 +18504,7 @@
                 <w:sz w:val="19"/>
                 <w:szCs w:val="19"/>
               </w:rPr>
-              <w:t xml:space="preserve">Reranker</w:t>
+              <w:t xml:space="preserve">Scorer</w:t>
             </w:r>
             <w:r>
               <w:rPr>
@@ -17478,7 +18520,7 @@
                 <w:sz w:val="19"/>
                 <w:szCs w:val="19"/>
               </w:rPr>
-              <w:t xml:space="preserve">TAiRAGRerankerBase</w:t>
+              <w:t xml:space="preserve">TAiEvalScorerBase</w:t>
             </w:r>
             <w:r>
               <w:rPr>
@@ -17494,7 +18536,7 @@
                 <w:sz w:val="19"/>
                 <w:szCs w:val="19"/>
               </w:rPr>
-              <w:t xml:space="preserve">RerankWith</w:t>
+              <w:t xml:space="preserve">ExpectScore</w:t>
             </w:r>
           </w:p>
         </w:tc>
@@ -17525,7 +18567,7 @@
                 <w:sz w:val="19"/>
                 <w:szCs w:val="19"/>
               </w:rPr>
-              <w:t xml:space="preserve">Source/Core/uMakerAi.Chat.Tools.pas</w:t>
+              <w:t xml:space="preserve">Source/RAG/uMakerAi.RAG.Vectors.pas</w:t>
             </w:r>
           </w:p>
         </w:tc>
@@ -17554,7 +18596,7 @@
                 <w:sz w:val="19"/>
                 <w:szCs w:val="19"/>
               </w:rPr>
-              <w:t xml:space="preserve">IAiDispatchClassifier</w:t>
+              <w:t xml:space="preserve">Reranker</w:t>
             </w:r>
             <w:r>
               <w:rPr>
@@ -17570,7 +18612,23 @@
                 <w:sz w:val="19"/>
                 <w:szCs w:val="19"/>
               </w:rPr>
-              <w:t xml:space="preserve">TAiDispatchClassifierBase</w:t>
+              <w:t xml:space="preserve">TAiRAGRerankerBase</w:t>
+            </w:r>
+            <w:r>
+              <w:rPr>
+                <w:sz w:val="19"/>
+                <w:szCs w:val="19"/>
+              </w:rPr>
+              <w:t xml:space="preserve">, </w:t>
+            </w:r>
+            <w:r>
+              <w:rPr>
+                <w:rFonts w:ascii="Consolas" w:cs="Consolas" w:eastAsia="Consolas" w:hAnsi="Consolas"/>
+                <w:color w:val="0B4F8A"/>
+                <w:sz w:val="19"/>
+                <w:szCs w:val="19"/>
+              </w:rPr>
+              <w:t xml:space="preserve">RerankWith</w:t>
             </w:r>
           </w:p>
         </w:tc>
@@ -17601,7 +18659,7 @@
                 <w:sz w:val="19"/>
                 <w:szCs w:val="19"/>
               </w:rPr>
-              <w:t xml:space="preserve">Source/Core/uMakerAi.Chat.pas</w:t>
+              <w:t xml:space="preserve">Source/Core/uMakerAi.Chat.Tools.pas</w:t>
             </w:r>
           </w:p>
         </w:tc>
@@ -17630,23 +18688,7 @@
                 <w:sz w:val="19"/>
                 <w:szCs w:val="19"/>
               </w:rPr>
-              <w:t xml:space="preserve">ChatTools.DispatchClassifier</w:t>
-            </w:r>
-            <w:r>
-              <w:rPr>
-                <w:sz w:val="19"/>
-                <w:szCs w:val="19"/>
-              </w:rPr>
-              <w:t xml:space="preserve"> and </w:t>
-            </w:r>
-            <w:r>
-              <w:rPr>
-                <w:rFonts w:ascii="Consolas" w:cs="Consolas" w:eastAsia="Consolas" w:hAnsi="Consolas"/>
-                <w:color w:val="0B4F8A"/>
-                <w:sz w:val="19"/>
-                <w:szCs w:val="19"/>
-              </w:rPr>
-              <w:t xml:space="preserve">PromptGuard</w:t>
+              <w:t xml:space="preserve">IAiDispatchClassifier</w:t>
             </w:r>
             <w:r>
               <w:rPr>
@@ -17662,39 +18704,7 @@
                 <w:sz w:val="19"/>
                 <w:szCs w:val="19"/>
               </w:rPr>
-              <w:t xml:space="preserve">OnPromptGuard</w:t>
-            </w:r>
-            <w:r>
-              <w:rPr>
-                <w:sz w:val="19"/>
-                <w:szCs w:val="19"/>
-              </w:rPr>
-              <w:t xml:space="preserve">, </w:t>
-            </w:r>
-            <w:r>
-              <w:rPr>
-                <w:rFonts w:ascii="Consolas" w:cs="Consolas" w:eastAsia="Consolas" w:hAnsi="Consolas"/>
-                <w:color w:val="0B4F8A"/>
-                <w:sz w:val="19"/>
-                <w:szCs w:val="19"/>
-              </w:rPr>
-              <w:t xml:space="preserve">ClassifySmartDispatch</w:t>
-            </w:r>
-            <w:r>
-              <w:rPr>
-                <w:sz w:val="19"/>
-                <w:szCs w:val="19"/>
-              </w:rPr>
-              <w:t xml:space="preserve">, </w:t>
-            </w:r>
-            <w:r>
-              <w:rPr>
-                <w:rFonts w:ascii="Consolas" w:cs="Consolas" w:eastAsia="Consolas" w:hAnsi="Consolas"/>
-                <w:color w:val="0B4F8A"/>
-                <w:sz w:val="19"/>
-                <w:szCs w:val="19"/>
-              </w:rPr>
-              <w:t xml:space="preserve">RunSmartDispatchTool</w:t>
+              <w:t xml:space="preserve">TAiDispatchClassifierBase</w:t>
             </w:r>
           </w:p>
         </w:tc>
@@ -17725,7 +18735,7 @@
                 <w:sz w:val="19"/>
                 <w:szCs w:val="19"/>
               </w:rPr>
-              <w:t xml:space="preserve">Source/Tools/uMakerAi.Guardrails.pas</w:t>
+              <w:t xml:space="preserve">Source/Core/uMakerAi.Chat.pas</w:t>
             </w:r>
           </w:p>
         </w:tc>
@@ -17754,7 +18764,23 @@
                 <w:sz w:val="19"/>
                 <w:szCs w:val="19"/>
               </w:rPr>
-              <w:t xml:space="preserve">Classifier</w:t>
+              <w:t xml:space="preserve">ChatTools.DispatchClassifier</w:t>
+            </w:r>
+            <w:r>
+              <w:rPr>
+                <w:sz w:val="19"/>
+                <w:szCs w:val="19"/>
+              </w:rPr>
+              <w:t xml:space="preserve"> and </w:t>
+            </w:r>
+            <w:r>
+              <w:rPr>
+                <w:rFonts w:ascii="Consolas" w:cs="Consolas" w:eastAsia="Consolas" w:hAnsi="Consolas"/>
+                <w:color w:val="0B4F8A"/>
+                <w:sz w:val="19"/>
+                <w:szCs w:val="19"/>
+              </w:rPr>
+              <w:t xml:space="preserve">PromptGuard</w:t>
             </w:r>
             <w:r>
               <w:rPr>
@@ -17770,7 +18796,39 @@
                 <w:sz w:val="19"/>
                 <w:szCs w:val="19"/>
               </w:rPr>
-              <w:t xml:space="preserve">TAiGuardrailClassifierBase</w:t>
+              <w:t xml:space="preserve">OnPromptGuard</w:t>
+            </w:r>
+            <w:r>
+              <w:rPr>
+                <w:sz w:val="19"/>
+                <w:szCs w:val="19"/>
+              </w:rPr>
+              <w:t xml:space="preserve">, </w:t>
+            </w:r>
+            <w:r>
+              <w:rPr>
+                <w:rFonts w:ascii="Consolas" w:cs="Consolas" w:eastAsia="Consolas" w:hAnsi="Consolas"/>
+                <w:color w:val="0B4F8A"/>
+                <w:sz w:val="19"/>
+                <w:szCs w:val="19"/>
+              </w:rPr>
+              <w:t xml:space="preserve">ClassifySmartDispatch</w:t>
+            </w:r>
+            <w:r>
+              <w:rPr>
+                <w:sz w:val="19"/>
+                <w:szCs w:val="19"/>
+              </w:rPr>
+              <w:t xml:space="preserve">, </w:t>
+            </w:r>
+            <w:r>
+              <w:rPr>
+                <w:rFonts w:ascii="Consolas" w:cs="Consolas" w:eastAsia="Consolas" w:hAnsi="Consolas"/>
+                <w:color w:val="0B4F8A"/>
+                <w:sz w:val="19"/>
+                <w:szCs w:val="19"/>
+              </w:rPr>
+              <w:t xml:space="preserve">RunSmartDispatchTool</w:t>
             </w:r>
           </w:p>
         </w:tc>
@@ -17801,6 +18859,82 @@
                 <w:sz w:val="19"/>
                 <w:szCs w:val="19"/>
               </w:rPr>
+              <w:t xml:space="preserve">Source/Tools/uMakerAi.Guardrails.pas</w:t>
+            </w:r>
+          </w:p>
+        </w:tc>
+        <w:tc>
+          <w:tcPr>
+            <w:tcW w:type="dxa" w:w="4560"/>
+            <w:tcBorders>
+              <w:top w:val="single" w:color="BFC9D6" w:sz="4"/>
+              <w:left w:val="single" w:color="BFC9D6" w:sz="4"/>
+              <w:bottom w:val="single" w:color="BFC9D6" w:sz="4"/>
+              <w:right w:val="single" w:color="BFC9D6" w:sz="4"/>
+            </w:tcBorders>
+            <w:shd w:fill="FFFFFF" w:color="auto" w:val="clear"/>
+            <w:tcMar>
+              <w:top w:type="dxa" w:w="60"/>
+              <w:left w:type="dxa" w:w="100"/>
+              <w:bottom w:type="dxa" w:w="60"/>
+              <w:right w:type="dxa" w:w="100"/>
+            </w:tcMar>
+          </w:tcPr>
+          <w:p>
+            <w:r>
+              <w:rPr>
+                <w:rFonts w:ascii="Consolas" w:cs="Consolas" w:eastAsia="Consolas" w:hAnsi="Consolas"/>
+                <w:color w:val="0B4F8A"/>
+                <w:sz w:val="19"/>
+                <w:szCs w:val="19"/>
+              </w:rPr>
+              <w:t xml:space="preserve">Classifier</w:t>
+            </w:r>
+            <w:r>
+              <w:rPr>
+                <w:sz w:val="19"/>
+                <w:szCs w:val="19"/>
+              </w:rPr>
+              <w:t xml:space="preserve">, </w:t>
+            </w:r>
+            <w:r>
+              <w:rPr>
+                <w:rFonts w:ascii="Consolas" w:cs="Consolas" w:eastAsia="Consolas" w:hAnsi="Consolas"/>
+                <w:color w:val="0B4F8A"/>
+                <w:sz w:val="19"/>
+                <w:szCs w:val="19"/>
+              </w:rPr>
+              <w:t xml:space="preserve">TAiGuardrailClassifierBase</w:t>
+            </w:r>
+          </w:p>
+        </w:tc>
+      </w:tr>
+      <w:tr>
+        <w:tc>
+          <w:tcPr>
+            <w:tcW w:type="dxa" w:w="4800"/>
+            <w:tcBorders>
+              <w:top w:val="single" w:color="BFC9D6" w:sz="4"/>
+              <w:left w:val="single" w:color="BFC9D6" w:sz="4"/>
+              <w:bottom w:val="single" w:color="BFC9D6" w:sz="4"/>
+              <w:right w:val="single" w:color="BFC9D6" w:sz="4"/>
+            </w:tcBorders>
+            <w:shd w:fill="F6F8FB" w:color="auto" w:val="clear"/>
+            <w:tcMar>
+              <w:top w:type="dxa" w:w="60"/>
+              <w:left w:type="dxa" w:w="100"/>
+              <w:bottom w:type="dxa" w:w="60"/>
+              <w:right w:type="dxa" w:w="100"/>
+            </w:tcMar>
+          </w:tcPr>
+          <w:p>
+            <w:r>
+              <w:rPr>
+                <w:rFonts w:ascii="Consolas" w:cs="Consolas" w:eastAsia="Consolas" w:hAnsi="Consolas"/>
+                <w:color w:val="0B4F8A"/>
+                <w:sz w:val="19"/>
+                <w:szCs w:val="19"/>
+              </w:rPr>
               <w:t xml:space="preserve">Source/Agents/uMakerAi.Agents.pas</w:t>
             </w:r>
           </w:p>
@@ -17814,7 +18948,7 @@
               <w:bottom w:val="single" w:color="BFC9D6" w:sz="4"/>
               <w:right w:val="single" w:color="BFC9D6" w:sz="4"/>
             </w:tcBorders>
-            <w:shd w:fill="FFFFFF" w:color="auto" w:val="clear"/>
+            <w:shd w:fill="F6F8FB" w:color="auto" w:val="clear"/>
             <w:tcMar>
               <w:top w:type="dxa" w:w="60"/>
               <w:left w:type="dxa" w:w="100"/>

</xml_diff>

<commit_message>
docs(jev): consumo y cobro por uso en las guias ES y EN
Nueva seccion 4.7: Usage, ResetUsage, precios y OnUsage; que es una
operacion en cada componente (el reranker en paralelo da un solo evento);
cobro en un servidor (evento sincrono en el hilo de la peticion), aviso de
no contar dos veces con un Jev compartido, y las cifras medidas en vivo.
Portada y capitulo de pruebas al dia (commits, 75 casos, jev.usage.adapters).
Los bloques de codigo cortos ya no se parten entre paginas.

Co-Authored-By: Claude Opus 5.5 (1M context) <noreply@anthropic.com>
</commit_message>
<xml_diff>
--- a/Docs/Version 3/uMakerAi-Jev-TypeSafe-EN.docx
+++ b/Docs/Version 3/uMakerAi-Jev-TypeSafe-EN.docx
@@ -248,7 +248,23 @@
                 <w:sz w:val="19"/>
                 <w:szCs w:val="19"/>
               </w:rPr>
-              <w:t xml:space="preserve"> (SmartDispatch and Guardrails), phase 4 (Evals and RAG)</w:t>
+              <w:t xml:space="preserve"> (SmartDispatch and Guardrails), phase 4 (Evals and RAG), phases 5–8, </w:t>
+            </w:r>
+            <w:r>
+              <w:rPr>
+                <w:rFonts w:ascii="Consolas" w:cs="Consolas" w:eastAsia="Consolas" w:hAnsi="Consolas"/>
+                <w:color w:val="0B4F8A"/>
+                <w:sz w:val="19"/>
+                <w:szCs w:val="19"/>
+              </w:rPr>
+              <w:t xml:space="preserve">560a704</w:t>
+            </w:r>
+            <w:r>
+              <w:rPr>
+                <w:sz w:val="19"/>
+                <w:szCs w:val="19"/>
+              </w:rPr>
+              <w:t xml:space="preserve"> (usage metering and billing)</w:t>
             </w:r>
           </w:p>
         </w:tc>
@@ -3826,6 +3842,8 @@
     </w:p>
     <w:p>
       <w:pPr>
+        <w:keepNext w:val="false"/>
+        <w:keepLines/>
         <w:pBdr>
           <w:left w:val="single" w:color="2E75B6" w:sz="12" w:space="6"/>
         </w:pBdr>
@@ -5174,6 +5192,8 @@
     </w:p>
     <w:p>
       <w:pPr>
+        <w:keepNext w:val="false"/>
+        <w:keepLines/>
         <w:pBdr>
           <w:left w:val="single" w:color="2E75B6" w:sz="12" w:space="6"/>
         </w:pBdr>
@@ -5192,6 +5212,8 @@
     </w:p>
     <w:p>
       <w:pPr>
+        <w:keepNext w:val="false"/>
+        <w:keepLines/>
         <w:pBdr>
           <w:left w:val="single" w:color="2E75B6" w:sz="12" w:space="6"/>
         </w:pBdr>
@@ -5210,6 +5232,8 @@
     </w:p>
     <w:p>
       <w:pPr>
+        <w:keepNext w:val="false"/>
+        <w:keepLines/>
         <w:pBdr>
           <w:left w:val="single" w:color="2E75B6" w:sz="12" w:space="6"/>
         </w:pBdr>
@@ -5228,6 +5252,8 @@
     </w:p>
     <w:p>
       <w:pPr>
+        <w:keepNext w:val="false"/>
+        <w:keepLines/>
         <w:pBdr>
           <w:left w:val="single" w:color="2E75B6" w:sz="12" w:space="6"/>
         </w:pBdr>
@@ -5246,6 +5272,8 @@
     </w:p>
     <w:p>
       <w:pPr>
+        <w:keepNext w:val="false"/>
+        <w:keepLines/>
         <w:pBdr>
           <w:left w:val="single" w:color="2E75B6" w:sz="12" w:space="6"/>
         </w:pBdr>
@@ -5264,6 +5292,8 @@
     </w:p>
     <w:p>
       <w:pPr>
+        <w:keepNext w:val="false"/>
+        <w:keepLines/>
         <w:pBdr>
           <w:left w:val="single" w:color="2E75B6" w:sz="12" w:space="6"/>
         </w:pBdr>
@@ -5282,6 +5312,8 @@
     </w:p>
     <w:p>
       <w:pPr>
+        <w:keepNext w:val="false"/>
+        <w:keepLines/>
         <w:pBdr>
           <w:left w:val="single" w:color="2E75B6" w:sz="12" w:space="6"/>
         </w:pBdr>
@@ -5300,6 +5332,8 @@
     </w:p>
     <w:p>
       <w:pPr>
+        <w:keepNext w:val="false"/>
+        <w:keepLines/>
         <w:pBdr>
           <w:left w:val="single" w:color="2E75B6" w:sz="12" w:space="6"/>
         </w:pBdr>
@@ -5318,6 +5352,8 @@
     </w:p>
     <w:p>
       <w:pPr>
+        <w:keepNext w:val="false"/>
+        <w:keepLines/>
         <w:pBdr>
           <w:left w:val="single" w:color="2E75B6" w:sz="12" w:space="6"/>
         </w:pBdr>
@@ -5336,6 +5372,8 @@
     </w:p>
     <w:p>
       <w:pPr>
+        <w:keepNext w:val="false"/>
+        <w:keepLines/>
         <w:pBdr>
           <w:left w:val="single" w:color="2E75B6" w:sz="12" w:space="6"/>
         </w:pBdr>
@@ -5354,6 +5392,8 @@
     </w:p>
     <w:p>
       <w:pPr>
+        <w:keepNext w:val="false"/>
+        <w:keepLines/>
         <w:pBdr>
           <w:left w:val="single" w:color="2E75B6" w:sz="12" w:space="6"/>
         </w:pBdr>
@@ -5372,6 +5412,8 @@
     </w:p>
     <w:p>
       <w:pPr>
+        <w:keepNext w:val="false"/>
+        <w:keepLines/>
         <w:pBdr>
           <w:left w:val="single" w:color="2E75B6" w:sz="12" w:space="6"/>
         </w:pBdr>
@@ -5390,6 +5432,8 @@
     </w:p>
     <w:p>
       <w:pPr>
+        <w:keepNext w:val="false"/>
+        <w:keepLines/>
         <w:pBdr>
           <w:left w:val="single" w:color="2E75B6" w:sz="12" w:space="6"/>
         </w:pBdr>
@@ -5408,6 +5452,8 @@
     </w:p>
     <w:p>
       <w:pPr>
+        <w:keepNext w:val="false"/>
+        <w:keepLines/>
         <w:pBdr>
           <w:left w:val="single" w:color="2E75B6" w:sz="12" w:space="6"/>
         </w:pBdr>
@@ -5426,6 +5472,8 @@
     </w:p>
     <w:p>
       <w:pPr>
+        <w:keepNext w:val="false"/>
+        <w:keepLines/>
         <w:pBdr>
           <w:left w:val="single" w:color="2E75B6" w:sz="12" w:space="6"/>
         </w:pBdr>
@@ -5444,6 +5492,8 @@
     </w:p>
     <w:p>
       <w:pPr>
+        <w:keepNext w:val="false"/>
+        <w:keepLines/>
         <w:pBdr>
           <w:left w:val="single" w:color="2E75B6" w:sz="12" w:space="6"/>
         </w:pBdr>
@@ -5462,6 +5512,8 @@
     </w:p>
     <w:p>
       <w:pPr>
+        <w:keepNext w:val="false"/>
+        <w:keepLines/>
         <w:pBdr>
           <w:left w:val="single" w:color="2E75B6" w:sz="12" w:space="6"/>
         </w:pBdr>
@@ -5480,6 +5532,8 @@
     </w:p>
     <w:p>
       <w:pPr>
+        <w:keepNext w:val="false"/>
+        <w:keepLines/>
         <w:pBdr>
           <w:left w:val="single" w:color="2E75B6" w:sz="12" w:space="6"/>
         </w:pBdr>
@@ -5498,6 +5552,8 @@
     </w:p>
     <w:p>
       <w:pPr>
+        <w:keepNext w:val="false"/>
+        <w:keepLines/>
         <w:pBdr>
           <w:left w:val="single" w:color="2E75B6" w:sz="12" w:space="6"/>
         </w:pBdr>
@@ -5516,6 +5572,8 @@
     </w:p>
     <w:p>
       <w:pPr>
+        <w:keepNext w:val="false"/>
+        <w:keepLines/>
         <w:pBdr>
           <w:left w:val="single" w:color="2E75B6" w:sz="12" w:space="6"/>
         </w:pBdr>
@@ -5534,6 +5592,8 @@
     </w:p>
     <w:p>
       <w:pPr>
+        <w:keepNext w:val="false"/>
+        <w:keepLines/>
         <w:pBdr>
           <w:left w:val="single" w:color="2E75B6" w:sz="12" w:space="6"/>
         </w:pBdr>
@@ -5552,6 +5612,8 @@
     </w:p>
     <w:p>
       <w:pPr>
+        <w:keepNext w:val="false"/>
+        <w:keepLines/>
         <w:pBdr>
           <w:left w:val="single" w:color="2E75B6" w:sz="12" w:space="6"/>
         </w:pBdr>
@@ -5570,6 +5632,8 @@
     </w:p>
     <w:p>
       <w:pPr>
+        <w:keepNext w:val="false"/>
+        <w:keepLines/>
         <w:pBdr>
           <w:left w:val="single" w:color="2E75B6" w:sz="12" w:space="6"/>
         </w:pBdr>
@@ -5588,6 +5652,8 @@
     </w:p>
     <w:p>
       <w:pPr>
+        <w:keepNext w:val="false"/>
+        <w:keepLines/>
         <w:pBdr>
           <w:left w:val="single" w:color="2E75B6" w:sz="12" w:space="6"/>
         </w:pBdr>
@@ -5606,6 +5672,8 @@
     </w:p>
     <w:p>
       <w:pPr>
+        <w:keepNext w:val="false"/>
+        <w:keepLines/>
         <w:pBdr>
           <w:left w:val="single" w:color="2E75B6" w:sz="12" w:space="6"/>
         </w:pBdr>
@@ -5624,6 +5692,8 @@
     </w:p>
     <w:p>
       <w:pPr>
+        <w:keepNext w:val="false"/>
+        <w:keepLines/>
         <w:pBdr>
           <w:left w:val="single" w:color="2E75B6" w:sz="12" w:space="6"/>
         </w:pBdr>
@@ -5642,6 +5712,8 @@
     </w:p>
     <w:p>
       <w:pPr>
+        <w:keepNext w:val="false"/>
+        <w:keepLines/>
         <w:pBdr>
           <w:left w:val="single" w:color="2E75B6" w:sz="12" w:space="6"/>
         </w:pBdr>
@@ -5660,6 +5732,8 @@
     </w:p>
     <w:p>
       <w:pPr>
+        <w:keepNext w:val="false"/>
+        <w:keepLines/>
         <w:pBdr>
           <w:left w:val="single" w:color="2E75B6" w:sz="12" w:space="6"/>
         </w:pBdr>
@@ -5678,6 +5752,8 @@
     </w:p>
     <w:p>
       <w:pPr>
+        <w:keepNext w:val="false"/>
+        <w:keepLines/>
         <w:pBdr>
           <w:left w:val="single" w:color="2E75B6" w:sz="12" w:space="6"/>
         </w:pBdr>
@@ -5696,6 +5772,8 @@
     </w:p>
     <w:p>
       <w:pPr>
+        <w:keepNext w:val="false"/>
+        <w:keepLines/>
         <w:pBdr>
           <w:left w:val="single" w:color="2E75B6" w:sz="12" w:space="6"/>
         </w:pBdr>
@@ -5714,6 +5792,8 @@
     </w:p>
     <w:p>
       <w:pPr>
+        <w:keepNext w:val="false"/>
+        <w:keepLines/>
         <w:pBdr>
           <w:left w:val="single" w:color="2E75B6" w:sz="12" w:space="6"/>
         </w:pBdr>
@@ -5732,6 +5812,8 @@
     </w:p>
     <w:p>
       <w:pPr>
+        <w:keepNext w:val="false"/>
+        <w:keepLines/>
         <w:pBdr>
           <w:left w:val="single" w:color="2E75B6" w:sz="12" w:space="6"/>
         </w:pBdr>
@@ -5750,6 +5832,8 @@
     </w:p>
     <w:p>
       <w:pPr>
+        <w:keepNext w:val="false"/>
+        <w:keepLines/>
         <w:pBdr>
           <w:left w:val="single" w:color="2E75B6" w:sz="12" w:space="6"/>
         </w:pBdr>
@@ -5768,6 +5852,8 @@
     </w:p>
     <w:p>
       <w:pPr>
+        <w:keepNext w:val="false"/>
+        <w:keepLines/>
         <w:pBdr>
           <w:left w:val="single" w:color="2E75B6" w:sz="12" w:space="6"/>
         </w:pBdr>
@@ -5786,6 +5872,8 @@
     </w:p>
     <w:p>
       <w:pPr>
+        <w:keepNext w:val="false"/>
+        <w:keepLines/>
         <w:pBdr>
           <w:left w:val="single" w:color="2E75B6" w:sz="12" w:space="6"/>
         </w:pBdr>
@@ -5804,6 +5892,8 @@
     </w:p>
     <w:p>
       <w:pPr>
+        <w:keepNext w:val="false"/>
+        <w:keepLines/>
         <w:pBdr>
           <w:left w:val="single" w:color="2E75B6" w:sz="12" w:space="6"/>
         </w:pBdr>
@@ -5830,6 +5920,8 @@
     </w:p>
     <w:p>
       <w:pPr>
+        <w:keepNext/>
+        <w:keepLines/>
         <w:pBdr>
           <w:left w:val="single" w:color="2E75B6" w:sz="12" w:space="6"/>
         </w:pBdr>
@@ -5848,6 +5940,8 @@
     </w:p>
     <w:p>
       <w:pPr>
+        <w:keepNext/>
+        <w:keepLines/>
         <w:pBdr>
           <w:left w:val="single" w:color="2E75B6" w:sz="12" w:space="6"/>
         </w:pBdr>
@@ -5866,6 +5960,8 @@
     </w:p>
     <w:p>
       <w:pPr>
+        <w:keepNext/>
+        <w:keepLines/>
         <w:pBdr>
           <w:left w:val="single" w:color="2E75B6" w:sz="12" w:space="6"/>
         </w:pBdr>
@@ -5884,6 +5980,8 @@
     </w:p>
     <w:p>
       <w:pPr>
+        <w:keepNext w:val="false"/>
+        <w:keepLines/>
         <w:pBdr>
           <w:left w:val="single" w:color="2E75B6" w:sz="12" w:space="6"/>
         </w:pBdr>
@@ -6795,17 +6893,19 @@
     </w:p>
     <w:p>
       <w:pPr>
-        <w:pStyle w:val="Heading1"/>
-        <w:pageBreakBefore/>
-      </w:pPr>
-      <w:r>
-        <w:t xml:space="preserve">5. Routing agent graphs: TAiJevRouterTool</w:t>
+        <w:pStyle w:val="Heading2"/>
+      </w:pPr>
+      <w:r>
+        <w:t xml:space="preserve">4.7 Usage metering and usage-based billing</w:t>
       </w:r>
     </w:p>
     <w:p>
       <w:pPr>
         <w:spacing w:after="120"/>
       </w:pPr>
+      <w:r>
+        <w:t xml:space="preserve">Every Jev response carries the tokens it consumed. </w:t>
+      </w:r>
       <w:r>
         <w:rPr>
           <w:rFonts w:ascii="Consolas" w:cs="Consolas" w:eastAsia="Consolas" w:hAnsi="Consolas"/>
@@ -6813,11 +6913,1318 @@
           <w:sz w:val="19"/>
           <w:szCs w:val="19"/>
         </w:rPr>
-        <w:t xml:space="preserve">TAiJevRouterTool</w:t>
-      </w:r>
-      <w:r>
-        <w:t xml:space="preserve"> is a node tool. It asks Jev which of its </w:t>
-      </w:r>
+        <w:t xml:space="preserve">TAiJev</w:t>
+      </w:r>
+      <w:r>
+        <w:t xml:space="preserve"> and </w:t>
+      </w:r>
+      <w:r>
+        <w:rPr>
+          <w:b/>
+          <w:bCs/>
+        </w:rPr>
+        <w:t xml:space="preserve">all eight adapters</w:t>
+      </w:r>
+      <w:r>
+        <w:t xml:space="preserve"> accumulate and expose them, so you can show the cost or bill each customer for actual usage.</w:t>
+      </w:r>
+    </w:p>
+    <w:tbl>
+      <w:tblPr>
+        <w:tblW w:type="dxa" w:w="9360"/>
+        <w:tblBorders>
+          <w:top w:val="single" w:color="auto" w:sz="4"/>
+          <w:left w:val="single" w:color="auto" w:sz="4"/>
+          <w:bottom w:val="single" w:color="auto" w:sz="4"/>
+          <w:right w:val="single" w:color="auto" w:sz="4"/>
+          <w:insideH w:val="single" w:color="auto" w:sz="4"/>
+          <w:insideV w:val="single" w:color="auto" w:sz="4"/>
+        </w:tblBorders>
+      </w:tblPr>
+      <w:tblGrid>
+        <w:gridCol w:w="3000"/>
+        <w:gridCol w:w="6360"/>
+      </w:tblGrid>
+      <w:tr>
+        <w:trPr>
+          <w:tblHeader/>
+        </w:trPr>
+        <w:tc>
+          <w:tcPr>
+            <w:tcW w:type="dxa" w:w="3000"/>
+            <w:tcBorders>
+              <w:top w:val="single" w:color="BFC9D6" w:sz="4"/>
+              <w:left w:val="single" w:color="BFC9D6" w:sz="4"/>
+              <w:bottom w:val="single" w:color="BFC9D6" w:sz="4"/>
+              <w:right w:val="single" w:color="BFC9D6" w:sz="4"/>
+            </w:tcBorders>
+            <w:shd w:fill="1F3A5F" w:color="auto" w:val="clear"/>
+            <w:tcMar>
+              <w:top w:type="dxa" w:w="60"/>
+              <w:left w:type="dxa" w:w="100"/>
+              <w:bottom w:type="dxa" w:w="60"/>
+              <w:right w:type="dxa" w:w="100"/>
+            </w:tcMar>
+          </w:tcPr>
+          <w:p>
+            <w:r>
+              <w:rPr>
+                <w:b/>
+                <w:bCs/>
+                <w:color w:val="FFFFFF"/>
+                <w:sz w:val="19"/>
+                <w:szCs w:val="19"/>
+              </w:rPr>
+              <w:t xml:space="preserve">Member</w:t>
+            </w:r>
+          </w:p>
+        </w:tc>
+        <w:tc>
+          <w:tcPr>
+            <w:tcW w:type="dxa" w:w="6360"/>
+            <w:tcBorders>
+              <w:top w:val="single" w:color="BFC9D6" w:sz="4"/>
+              <w:left w:val="single" w:color="BFC9D6" w:sz="4"/>
+              <w:bottom w:val="single" w:color="BFC9D6" w:sz="4"/>
+              <w:right w:val="single" w:color="BFC9D6" w:sz="4"/>
+            </w:tcBorders>
+            <w:shd w:fill="1F3A5F" w:color="auto" w:val="clear"/>
+            <w:tcMar>
+              <w:top w:type="dxa" w:w="60"/>
+              <w:left w:type="dxa" w:w="100"/>
+              <w:bottom w:type="dxa" w:w="60"/>
+              <w:right w:type="dxa" w:w="100"/>
+            </w:tcMar>
+          </w:tcPr>
+          <w:p>
+            <w:r>
+              <w:rPr>
+                <w:b/>
+                <w:bCs/>
+                <w:color w:val="FFFFFF"/>
+                <w:sz w:val="19"/>
+                <w:szCs w:val="19"/>
+              </w:rPr>
+              <w:t xml:space="preserve">What it is</w:t>
+            </w:r>
+          </w:p>
+        </w:tc>
+      </w:tr>
+      <w:tr>
+        <w:tc>
+          <w:tcPr>
+            <w:tcW w:type="dxa" w:w="3000"/>
+            <w:tcBorders>
+              <w:top w:val="single" w:color="BFC9D6" w:sz="4"/>
+              <w:left w:val="single" w:color="BFC9D6" w:sz="4"/>
+              <w:bottom w:val="single" w:color="BFC9D6" w:sz="4"/>
+              <w:right w:val="single" w:color="BFC9D6" w:sz="4"/>
+            </w:tcBorders>
+            <w:shd w:fill="FFFFFF" w:color="auto" w:val="clear"/>
+            <w:tcMar>
+              <w:top w:type="dxa" w:w="60"/>
+              <w:left w:type="dxa" w:w="100"/>
+              <w:bottom w:type="dxa" w:w="60"/>
+              <w:right w:type="dxa" w:w="100"/>
+            </w:tcMar>
+          </w:tcPr>
+          <w:p>
+            <w:r>
+              <w:rPr>
+                <w:rFonts w:ascii="Consolas" w:cs="Consolas" w:eastAsia="Consolas" w:hAnsi="Consolas"/>
+                <w:color w:val="0B4F8A"/>
+                <w:sz w:val="19"/>
+                <w:szCs w:val="19"/>
+              </w:rPr>
+              <w:t xml:space="preserve">Usage: TAiJevUsage</w:t>
+            </w:r>
+          </w:p>
+        </w:tc>
+        <w:tc>
+          <w:tcPr>
+            <w:tcW w:type="dxa" w:w="6360"/>
+            <w:tcBorders>
+              <w:top w:val="single" w:color="BFC9D6" w:sz="4"/>
+              <w:left w:val="single" w:color="BFC9D6" w:sz="4"/>
+              <w:bottom w:val="single" w:color="BFC9D6" w:sz="4"/>
+              <w:right w:val="single" w:color="BFC9D6" w:sz="4"/>
+            </w:tcBorders>
+            <w:shd w:fill="FFFFFF" w:color="auto" w:val="clear"/>
+            <w:tcMar>
+              <w:top w:type="dxa" w:w="60"/>
+              <w:left w:type="dxa" w:w="100"/>
+              <w:bottom w:type="dxa" w:w="60"/>
+              <w:right w:type="dxa" w:w="100"/>
+            </w:tcMar>
+          </w:tcPr>
+          <w:p>
+            <w:r>
+              <w:rPr>
+                <w:sz w:val="19"/>
+                <w:szCs w:val="19"/>
+              </w:rPr>
+              <w:t xml:space="preserve">Accumulated since </w:t>
+            </w:r>
+            <w:r>
+              <w:rPr>
+                <w:rFonts w:ascii="Consolas" w:cs="Consolas" w:eastAsia="Consolas" w:hAnsi="Consolas"/>
+                <w:color w:val="0B4F8A"/>
+                <w:sz w:val="19"/>
+                <w:szCs w:val="19"/>
+              </w:rPr>
+              <w:t xml:space="preserve">Create</w:t>
+            </w:r>
+            <w:r>
+              <w:rPr>
+                <w:sz w:val="19"/>
+                <w:szCs w:val="19"/>
+              </w:rPr>
+              <w:t xml:space="preserve"> or </w:t>
+            </w:r>
+            <w:r>
+              <w:rPr>
+                <w:rFonts w:ascii="Consolas" w:cs="Consolas" w:eastAsia="Consolas" w:hAnsi="Consolas"/>
+                <w:color w:val="0B4F8A"/>
+                <w:sz w:val="19"/>
+                <w:szCs w:val="19"/>
+              </w:rPr>
+              <w:t xml:space="preserve">ResetUsage</w:t>
+            </w:r>
+            <w:r>
+              <w:rPr>
+                <w:sz w:val="19"/>
+                <w:szCs w:val="19"/>
+              </w:rPr>
+              <w:t xml:space="preserve">: </w:t>
+            </w:r>
+            <w:r>
+              <w:rPr>
+                <w:rFonts w:ascii="Consolas" w:cs="Consolas" w:eastAsia="Consolas" w:hAnsi="Consolas"/>
+                <w:color w:val="0B4F8A"/>
+                <w:sz w:val="19"/>
+                <w:szCs w:val="19"/>
+              </w:rPr>
+              <w:t xml:space="preserve">Requests</w:t>
+            </w:r>
+            <w:r>
+              <w:rPr>
+                <w:sz w:val="19"/>
+                <w:szCs w:val="19"/>
+              </w:rPr>
+              <w:t xml:space="preserve">, </w:t>
+            </w:r>
+            <w:r>
+              <w:rPr>
+                <w:rFonts w:ascii="Consolas" w:cs="Consolas" w:eastAsia="Consolas" w:hAnsi="Consolas"/>
+                <w:color w:val="0B4F8A"/>
+                <w:sz w:val="19"/>
+                <w:szCs w:val="19"/>
+              </w:rPr>
+              <w:t xml:space="preserve">InputTokens</w:t>
+            </w:r>
+            <w:r>
+              <w:rPr>
+                <w:sz w:val="19"/>
+                <w:szCs w:val="19"/>
+              </w:rPr>
+              <w:t xml:space="preserve">, </w:t>
+            </w:r>
+            <w:r>
+              <w:rPr>
+                <w:rFonts w:ascii="Consolas" w:cs="Consolas" w:eastAsia="Consolas" w:hAnsi="Consolas"/>
+                <w:color w:val="0B4F8A"/>
+                <w:sz w:val="19"/>
+                <w:szCs w:val="19"/>
+              </w:rPr>
+              <w:t xml:space="preserve">OutputTokens</w:t>
+            </w:r>
+            <w:r>
+              <w:rPr>
+                <w:sz w:val="19"/>
+                <w:szCs w:val="19"/>
+              </w:rPr>
+              <w:t xml:space="preserve">, </w:t>
+            </w:r>
+            <w:r>
+              <w:rPr>
+                <w:rFonts w:ascii="Consolas" w:cs="Consolas" w:eastAsia="Consolas" w:hAnsi="Consolas"/>
+                <w:color w:val="0B4F8A"/>
+                <w:sz w:val="19"/>
+                <w:szCs w:val="19"/>
+              </w:rPr>
+              <w:t xml:space="preserve">CostUSD</w:t>
+            </w:r>
+            <w:r>
+              <w:rPr>
+                <w:sz w:val="19"/>
+                <w:szCs w:val="19"/>
+              </w:rPr>
+              <w:t xml:space="preserve">. Thread-safe</w:t>
+            </w:r>
+          </w:p>
+        </w:tc>
+      </w:tr>
+      <w:tr>
+        <w:tc>
+          <w:tcPr>
+            <w:tcW w:type="dxa" w:w="3000"/>
+            <w:tcBorders>
+              <w:top w:val="single" w:color="BFC9D6" w:sz="4"/>
+              <w:left w:val="single" w:color="BFC9D6" w:sz="4"/>
+              <w:bottom w:val="single" w:color="BFC9D6" w:sz="4"/>
+              <w:right w:val="single" w:color="BFC9D6" w:sz="4"/>
+            </w:tcBorders>
+            <w:shd w:fill="F6F8FB" w:color="auto" w:val="clear"/>
+            <w:tcMar>
+              <w:top w:type="dxa" w:w="60"/>
+              <w:left w:type="dxa" w:w="100"/>
+              <w:bottom w:type="dxa" w:w="60"/>
+              <w:right w:type="dxa" w:w="100"/>
+            </w:tcMar>
+          </w:tcPr>
+          <w:p>
+            <w:r>
+              <w:rPr>
+                <w:rFonts w:ascii="Consolas" w:cs="Consolas" w:eastAsia="Consolas" w:hAnsi="Consolas"/>
+                <w:color w:val="0B4F8A"/>
+                <w:sz w:val="19"/>
+                <w:szCs w:val="19"/>
+              </w:rPr>
+              <w:t xml:space="preserve">ResetUsage</w:t>
+            </w:r>
+          </w:p>
+        </w:tc>
+        <w:tc>
+          <w:tcPr>
+            <w:tcW w:type="dxa" w:w="6360"/>
+            <w:tcBorders>
+              <w:top w:val="single" w:color="BFC9D6" w:sz="4"/>
+              <w:left w:val="single" w:color="BFC9D6" w:sz="4"/>
+              <w:bottom w:val="single" w:color="BFC9D6" w:sz="4"/>
+              <w:right w:val="single" w:color="BFC9D6" w:sz="4"/>
+            </w:tcBorders>
+            <w:shd w:fill="F6F8FB" w:color="auto" w:val="clear"/>
+            <w:tcMar>
+              <w:top w:type="dxa" w:w="60"/>
+              <w:left w:type="dxa" w:w="100"/>
+              <w:bottom w:type="dxa" w:w="60"/>
+              <w:right w:type="dxa" w:w="100"/>
+            </w:tcMar>
+          </w:tcPr>
+          <w:p>
+            <w:r>
+              <w:rPr>
+                <w:sz w:val="19"/>
+                <w:szCs w:val="19"/>
+              </w:rPr>
+              <w:t xml:space="preserve">Resets the totals (e.g. when closing a billing period)</w:t>
+            </w:r>
+          </w:p>
+        </w:tc>
+      </w:tr>
+      <w:tr>
+        <w:tc>
+          <w:tcPr>
+            <w:tcW w:type="dxa" w:w="3000"/>
+            <w:tcBorders>
+              <w:top w:val="single" w:color="BFC9D6" w:sz="4"/>
+              <w:left w:val="single" w:color="BFC9D6" w:sz="4"/>
+              <w:bottom w:val="single" w:color="BFC9D6" w:sz="4"/>
+              <w:right w:val="single" w:color="BFC9D6" w:sz="4"/>
+            </w:tcBorders>
+            <w:shd w:fill="FFFFFF" w:color="auto" w:val="clear"/>
+            <w:tcMar>
+              <w:top w:type="dxa" w:w="60"/>
+              <w:left w:type="dxa" w:w="100"/>
+              <w:bottom w:type="dxa" w:w="60"/>
+              <w:right w:type="dxa" w:w="100"/>
+            </w:tcMar>
+          </w:tcPr>
+          <w:p>
+            <w:r>
+              <w:rPr>
+                <w:rFonts w:ascii="Consolas" w:cs="Consolas" w:eastAsia="Consolas" w:hAnsi="Consolas"/>
+                <w:color w:val="0B4F8A"/>
+                <w:sz w:val="19"/>
+                <w:szCs w:val="19"/>
+              </w:rPr>
+              <w:t xml:space="preserve">PricePerMillionInput</w:t>
+            </w:r>
+          </w:p>
+        </w:tc>
+        <w:tc>
+          <w:tcPr>
+            <w:tcW w:type="dxa" w:w="6360"/>
+            <w:tcBorders>
+              <w:top w:val="single" w:color="BFC9D6" w:sz="4"/>
+              <w:left w:val="single" w:color="BFC9D6" w:sz="4"/>
+              <w:bottom w:val="single" w:color="BFC9D6" w:sz="4"/>
+              <w:right w:val="single" w:color="BFC9D6" w:sz="4"/>
+            </w:tcBorders>
+            <w:shd w:fill="FFFFFF" w:color="auto" w:val="clear"/>
+            <w:tcMar>
+              <w:top w:type="dxa" w:w="60"/>
+              <w:left w:type="dxa" w:w="100"/>
+              <w:bottom w:type="dxa" w:w="60"/>
+              <w:right w:type="dxa" w:w="100"/>
+            </w:tcMar>
+          </w:tcPr>
+          <w:p>
+            <w:r>
+              <w:rPr>
+                <w:sz w:val="19"/>
+                <w:szCs w:val="19"/>
+              </w:rPr>
+              <w:t xml:space="preserve">US$ per million input tokens. Default 0.042 (current price)</w:t>
+            </w:r>
+          </w:p>
+        </w:tc>
+      </w:tr>
+      <w:tr>
+        <w:tc>
+          <w:tcPr>
+            <w:tcW w:type="dxa" w:w="3000"/>
+            <w:tcBorders>
+              <w:top w:val="single" w:color="BFC9D6" w:sz="4"/>
+              <w:left w:val="single" w:color="BFC9D6" w:sz="4"/>
+              <w:bottom w:val="single" w:color="BFC9D6" w:sz="4"/>
+              <w:right w:val="single" w:color="BFC9D6" w:sz="4"/>
+            </w:tcBorders>
+            <w:shd w:fill="F6F8FB" w:color="auto" w:val="clear"/>
+            <w:tcMar>
+              <w:top w:type="dxa" w:w="60"/>
+              <w:left w:type="dxa" w:w="100"/>
+              <w:bottom w:type="dxa" w:w="60"/>
+              <w:right w:type="dxa" w:w="100"/>
+            </w:tcMar>
+          </w:tcPr>
+          <w:p>
+            <w:r>
+              <w:rPr>
+                <w:rFonts w:ascii="Consolas" w:cs="Consolas" w:eastAsia="Consolas" w:hAnsi="Consolas"/>
+                <w:color w:val="0B4F8A"/>
+                <w:sz w:val="19"/>
+                <w:szCs w:val="19"/>
+              </w:rPr>
+              <w:t xml:space="preserve">PricePerMillionOutput</w:t>
+            </w:r>
+          </w:p>
+        </w:tc>
+        <w:tc>
+          <w:tcPr>
+            <w:tcW w:type="dxa" w:w="6360"/>
+            <w:tcBorders>
+              <w:top w:val="single" w:color="BFC9D6" w:sz="4"/>
+              <w:left w:val="single" w:color="BFC9D6" w:sz="4"/>
+              <w:bottom w:val="single" w:color="BFC9D6" w:sz="4"/>
+              <w:right w:val="single" w:color="BFC9D6" w:sz="4"/>
+            </w:tcBorders>
+            <w:shd w:fill="F6F8FB" w:color="auto" w:val="clear"/>
+            <w:tcMar>
+              <w:top w:type="dxa" w:w="60"/>
+              <w:left w:type="dxa" w:w="100"/>
+              <w:bottom w:type="dxa" w:w="60"/>
+              <w:right w:type="dxa" w:w="100"/>
+            </w:tcMar>
+          </w:tcPr>
+          <w:p>
+            <w:r>
+              <w:rPr>
+                <w:sz w:val="19"/>
+                <w:szCs w:val="19"/>
+              </w:rPr>
+              <w:t xml:space="preserve">US$ per million output tokens. Default 0: output is not billed today</w:t>
+            </w:r>
+          </w:p>
+        </w:tc>
+      </w:tr>
+      <w:tr>
+        <w:tc>
+          <w:tcPr>
+            <w:tcW w:type="dxa" w:w="3000"/>
+            <w:tcBorders>
+              <w:top w:val="single" w:color="BFC9D6" w:sz="4"/>
+              <w:left w:val="single" w:color="BFC9D6" w:sz="4"/>
+              <w:bottom w:val="single" w:color="BFC9D6" w:sz="4"/>
+              <w:right w:val="single" w:color="BFC9D6" w:sz="4"/>
+            </w:tcBorders>
+            <w:shd w:fill="FFFFFF" w:color="auto" w:val="clear"/>
+            <w:tcMar>
+              <w:top w:type="dxa" w:w="60"/>
+              <w:left w:type="dxa" w:w="100"/>
+              <w:bottom w:type="dxa" w:w="60"/>
+              <w:right w:type="dxa" w:w="100"/>
+            </w:tcMar>
+          </w:tcPr>
+          <w:p>
+            <w:r>
+              <w:rPr>
+                <w:rFonts w:ascii="Consolas" w:cs="Consolas" w:eastAsia="Consolas" w:hAnsi="Consolas"/>
+                <w:color w:val="0B4F8A"/>
+                <w:sz w:val="19"/>
+                <w:szCs w:val="19"/>
+              </w:rPr>
+              <w:t xml:space="preserve">OnUsage</w:t>
+            </w:r>
+          </w:p>
+        </w:tc>
+        <w:tc>
+          <w:tcPr>
+            <w:tcW w:type="dxa" w:w="6360"/>
+            <w:tcBorders>
+              <w:top w:val="single" w:color="BFC9D6" w:sz="4"/>
+              <w:left w:val="single" w:color="BFC9D6" w:sz="4"/>
+              <w:bottom w:val="single" w:color="BFC9D6" w:sz="4"/>
+              <w:right w:val="single" w:color="BFC9D6" w:sz="4"/>
+            </w:tcBorders>
+            <w:shd w:fill="FFFFFF" w:color="auto" w:val="clear"/>
+            <w:tcMar>
+              <w:top w:type="dxa" w:w="60"/>
+              <w:left w:type="dxa" w:w="100"/>
+              <w:bottom w:type="dxa" w:w="60"/>
+              <w:right w:type="dxa" w:w="100"/>
+            </w:tcMar>
+          </w:tcPr>
+          <w:p>
+            <w:r>
+              <w:rPr>
+                <w:sz w:val="19"/>
+                <w:szCs w:val="19"/>
+              </w:rPr>
+              <w:t xml:space="preserve">Event with the usage of </w:t>
+            </w:r>
+            <w:r>
+              <w:rPr>
+                <w:b/>
+                <w:bCs/>
+                <w:sz w:val="19"/>
+                <w:szCs w:val="19"/>
+              </w:rPr>
+              <w:t xml:space="preserve">one operation</w:t>
+            </w:r>
+            <w:r>
+              <w:rPr>
+                <w:sz w:val="19"/>
+                <w:szCs w:val="19"/>
+              </w:rPr>
+              <w:t xml:space="preserve"> (see below)</w:t>
+            </w:r>
+          </w:p>
+        </w:tc>
+      </w:tr>
+    </w:tbl>
+    <w:p>
+      <w:pPr>
+        <w:spacing w:after="80"/>
+      </w:pPr>
+    </w:p>
+    <w:p>
+      <w:pPr>
+        <w:pStyle w:val="Heading3"/>
+      </w:pPr>
+      <w:r>
+        <w:t xml:space="preserve">What an operation is</w:t>
+      </w:r>
+    </w:p>
+    <w:tbl>
+      <w:tblPr>
+        <w:tblW w:type="dxa" w:w="9360"/>
+        <w:tblBorders>
+          <w:top w:val="single" w:color="auto" w:sz="4"/>
+          <w:left w:val="single" w:color="auto" w:sz="4"/>
+          <w:bottom w:val="single" w:color="auto" w:sz="4"/>
+          <w:right w:val="single" w:color="auto" w:sz="4"/>
+          <w:insideH w:val="single" w:color="auto" w:sz="4"/>
+          <w:insideV w:val="single" w:color="auto" w:sz="4"/>
+        </w:tblBorders>
+      </w:tblPr>
+      <w:tblGrid>
+        <w:gridCol w:w="3200"/>
+        <w:gridCol w:w="6160"/>
+      </w:tblGrid>
+      <w:tr>
+        <w:trPr>
+          <w:tblHeader/>
+        </w:trPr>
+        <w:tc>
+          <w:tcPr>
+            <w:tcW w:type="dxa" w:w="3200"/>
+            <w:tcBorders>
+              <w:top w:val="single" w:color="BFC9D6" w:sz="4"/>
+              <w:left w:val="single" w:color="BFC9D6" w:sz="4"/>
+              <w:bottom w:val="single" w:color="BFC9D6" w:sz="4"/>
+              <w:right w:val="single" w:color="BFC9D6" w:sz="4"/>
+            </w:tcBorders>
+            <w:shd w:fill="1F3A5F" w:color="auto" w:val="clear"/>
+            <w:tcMar>
+              <w:top w:type="dxa" w:w="60"/>
+              <w:left w:type="dxa" w:w="100"/>
+              <w:bottom w:type="dxa" w:w="60"/>
+              <w:right w:type="dxa" w:w="100"/>
+            </w:tcMar>
+          </w:tcPr>
+          <w:p>
+            <w:r>
+              <w:rPr>
+                <w:b/>
+                <w:bCs/>
+                <w:color w:val="FFFFFF"/>
+                <w:sz w:val="19"/>
+                <w:szCs w:val="19"/>
+              </w:rPr>
+              <w:t xml:space="preserve">Component</w:t>
+            </w:r>
+          </w:p>
+        </w:tc>
+        <w:tc>
+          <w:tcPr>
+            <w:tcW w:type="dxa" w:w="6160"/>
+            <w:tcBorders>
+              <w:top w:val="single" w:color="BFC9D6" w:sz="4"/>
+              <w:left w:val="single" w:color="BFC9D6" w:sz="4"/>
+              <w:bottom w:val="single" w:color="BFC9D6" w:sz="4"/>
+              <w:right w:val="single" w:color="BFC9D6" w:sz="4"/>
+            </w:tcBorders>
+            <w:shd w:fill="1F3A5F" w:color="auto" w:val="clear"/>
+            <w:tcMar>
+              <w:top w:type="dxa" w:w="60"/>
+              <w:left w:type="dxa" w:w="100"/>
+              <w:bottom w:type="dxa" w:w="60"/>
+              <w:right w:type="dxa" w:w="100"/>
+            </w:tcMar>
+          </w:tcPr>
+          <w:p>
+            <w:r>
+              <w:rPr>
+                <w:b/>
+                <w:bCs/>
+                <w:color w:val="FFFFFF"/>
+                <w:sz w:val="19"/>
+                <w:szCs w:val="19"/>
+              </w:rPr>
+              <w:t xml:space="preserve">One OnUsage per…</w:t>
+            </w:r>
+          </w:p>
+        </w:tc>
+      </w:tr>
+      <w:tr>
+        <w:tc>
+          <w:tcPr>
+            <w:tcW w:type="dxa" w:w="3200"/>
+            <w:tcBorders>
+              <w:top w:val="single" w:color="BFC9D6" w:sz="4"/>
+              <w:left w:val="single" w:color="BFC9D6" w:sz="4"/>
+              <w:bottom w:val="single" w:color="BFC9D6" w:sz="4"/>
+              <w:right w:val="single" w:color="BFC9D6" w:sz="4"/>
+            </w:tcBorders>
+            <w:shd w:fill="FFFFFF" w:color="auto" w:val="clear"/>
+            <w:tcMar>
+              <w:top w:type="dxa" w:w="60"/>
+              <w:left w:type="dxa" w:w="100"/>
+              <w:bottom w:type="dxa" w:w="60"/>
+              <w:right w:type="dxa" w:w="100"/>
+            </w:tcMar>
+          </w:tcPr>
+          <w:p>
+            <w:r>
+              <w:rPr>
+                <w:rFonts w:ascii="Consolas" w:cs="Consolas" w:eastAsia="Consolas" w:hAnsi="Consolas"/>
+                <w:color w:val="0B4F8A"/>
+                <w:sz w:val="19"/>
+                <w:szCs w:val="19"/>
+              </w:rPr>
+              <w:t xml:space="preserve">TAiJev</w:t>
+            </w:r>
+          </w:p>
+        </w:tc>
+        <w:tc>
+          <w:tcPr>
+            <w:tcW w:type="dxa" w:w="6160"/>
+            <w:tcBorders>
+              <w:top w:val="single" w:color="BFC9D6" w:sz="4"/>
+              <w:left w:val="single" w:color="BFC9D6" w:sz="4"/>
+              <w:bottom w:val="single" w:color="BFC9D6" w:sz="4"/>
+              <w:right w:val="single" w:color="BFC9D6" w:sz="4"/>
+            </w:tcBorders>
+            <w:shd w:fill="FFFFFF" w:color="auto" w:val="clear"/>
+            <w:tcMar>
+              <w:top w:type="dxa" w:w="60"/>
+              <w:left w:type="dxa" w:w="100"/>
+              <w:bottom w:type="dxa" w:w="60"/>
+              <w:right w:type="dxa" w:w="100"/>
+            </w:tcMar>
+          </w:tcPr>
+          <w:p>
+            <w:r>
+              <w:rPr>
+                <w:sz w:val="19"/>
+                <w:szCs w:val="19"/>
+              </w:rPr>
+              <w:t xml:space="preserve">each successful HTTP call (</w:t>
+            </w:r>
+            <w:r>
+              <w:rPr>
+                <w:rFonts w:ascii="Consolas" w:cs="Consolas" w:eastAsia="Consolas" w:hAnsi="Consolas"/>
+                <w:color w:val="0B4F8A"/>
+                <w:sz w:val="19"/>
+                <w:szCs w:val="19"/>
+              </w:rPr>
+              <w:t xml:space="preserve">Ask</w:t>
+            </w:r>
+            <w:r>
+              <w:rPr>
+                <w:sz w:val="19"/>
+                <w:szCs w:val="19"/>
+              </w:rPr>
+              <w:t xml:space="preserve">, </w:t>
+            </w:r>
+            <w:r>
+              <w:rPr>
+                <w:rFonts w:ascii="Consolas" w:cs="Consolas" w:eastAsia="Consolas" w:hAnsi="Consolas"/>
+                <w:color w:val="0B4F8A"/>
+                <w:sz w:val="19"/>
+                <w:szCs w:val="19"/>
+              </w:rPr>
+              <w:t xml:space="preserve">Choose</w:t>
+            </w:r>
+            <w:r>
+              <w:rPr>
+                <w:sz w:val="19"/>
+                <w:szCs w:val="19"/>
+              </w:rPr>
+              <w:t xml:space="preserve">, </w:t>
+            </w:r>
+            <w:r>
+              <w:rPr>
+                <w:rFonts w:ascii="Consolas" w:cs="Consolas" w:eastAsia="Consolas" w:hAnsi="Consolas"/>
+                <w:color w:val="0B4F8A"/>
+                <w:sz w:val="19"/>
+                <w:szCs w:val="19"/>
+              </w:rPr>
+              <w:t xml:space="preserve">Noul</w:t>
+            </w:r>
+            <w:r>
+              <w:rPr>
+                <w:sz w:val="19"/>
+                <w:szCs w:val="19"/>
+              </w:rPr>
+              <w:t xml:space="preserve">)</w:t>
+            </w:r>
+          </w:p>
+        </w:tc>
+      </w:tr>
+      <w:tr>
+        <w:tc>
+          <w:tcPr>
+            <w:tcW w:type="dxa" w:w="3200"/>
+            <w:tcBorders>
+              <w:top w:val="single" w:color="BFC9D6" w:sz="4"/>
+              <w:left w:val="single" w:color="BFC9D6" w:sz="4"/>
+              <w:bottom w:val="single" w:color="BFC9D6" w:sz="4"/>
+              <w:right w:val="single" w:color="BFC9D6" w:sz="4"/>
+            </w:tcBorders>
+            <w:shd w:fill="F6F8FB" w:color="auto" w:val="clear"/>
+            <w:tcMar>
+              <w:top w:type="dxa" w:w="60"/>
+              <w:left w:type="dxa" w:w="100"/>
+              <w:bottom w:type="dxa" w:w="60"/>
+              <w:right w:type="dxa" w:w="100"/>
+            </w:tcMar>
+          </w:tcPr>
+          <w:p>
+            <w:r>
+              <w:rPr>
+                <w:rFonts w:ascii="Consolas" w:cs="Consolas" w:eastAsia="Consolas" w:hAnsi="Consolas"/>
+                <w:color w:val="0B4F8A"/>
+                <w:sz w:val="19"/>
+                <w:szCs w:val="19"/>
+              </w:rPr>
+              <w:t xml:space="preserve">TAiJevPromptGuard</w:t>
+            </w:r>
+          </w:p>
+        </w:tc>
+        <w:tc>
+          <w:tcPr>
+            <w:tcW w:type="dxa" w:w="6160"/>
+            <w:tcBorders>
+              <w:top w:val="single" w:color="BFC9D6" w:sz="4"/>
+              <w:left w:val="single" w:color="BFC9D6" w:sz="4"/>
+              <w:bottom w:val="single" w:color="BFC9D6" w:sz="4"/>
+              <w:right w:val="single" w:color="BFC9D6" w:sz="4"/>
+            </w:tcBorders>
+            <w:shd w:fill="F6F8FB" w:color="auto" w:val="clear"/>
+            <w:tcMar>
+              <w:top w:type="dxa" w:w="60"/>
+              <w:left w:type="dxa" w:w="100"/>
+              <w:bottom w:type="dxa" w:w="60"/>
+              <w:right w:type="dxa" w:w="100"/>
+            </w:tcMar>
+          </w:tcPr>
+          <w:p>
+            <w:r>
+              <w:rPr>
+                <w:sz w:val="19"/>
+                <w:szCs w:val="19"/>
+              </w:rPr>
+              <w:t xml:space="preserve">each </w:t>
+            </w:r>
+            <w:r>
+              <w:rPr>
+                <w:rFonts w:ascii="Consolas" w:cs="Consolas" w:eastAsia="Consolas" w:hAnsi="Consolas"/>
+                <w:color w:val="0B4F8A"/>
+                <w:sz w:val="19"/>
+                <w:szCs w:val="19"/>
+              </w:rPr>
+              <w:t xml:space="preserve">CheckPrompt</w:t>
+            </w:r>
+          </w:p>
+        </w:tc>
+      </w:tr>
+      <w:tr>
+        <w:tc>
+          <w:tcPr>
+            <w:tcW w:type="dxa" w:w="3200"/>
+            <w:tcBorders>
+              <w:top w:val="single" w:color="BFC9D6" w:sz="4"/>
+              <w:left w:val="single" w:color="BFC9D6" w:sz="4"/>
+              <w:bottom w:val="single" w:color="BFC9D6" w:sz="4"/>
+              <w:right w:val="single" w:color="BFC9D6" w:sz="4"/>
+            </w:tcBorders>
+            <w:shd w:fill="FFFFFF" w:color="auto" w:val="clear"/>
+            <w:tcMar>
+              <w:top w:type="dxa" w:w="60"/>
+              <w:left w:type="dxa" w:w="100"/>
+              <w:bottom w:type="dxa" w:w="60"/>
+              <w:right w:type="dxa" w:w="100"/>
+            </w:tcMar>
+          </w:tcPr>
+          <w:p>
+            <w:r>
+              <w:rPr>
+                <w:rFonts w:ascii="Consolas" w:cs="Consolas" w:eastAsia="Consolas" w:hAnsi="Consolas"/>
+                <w:color w:val="0B4F8A"/>
+                <w:sz w:val="19"/>
+                <w:szCs w:val="19"/>
+              </w:rPr>
+              <w:t xml:space="preserve">TAiJevDispatchClassifier</w:t>
+            </w:r>
+          </w:p>
+        </w:tc>
+        <w:tc>
+          <w:tcPr>
+            <w:tcW w:type="dxa" w:w="6160"/>
+            <w:tcBorders>
+              <w:top w:val="single" w:color="BFC9D6" w:sz="4"/>
+              <w:left w:val="single" w:color="BFC9D6" w:sz="4"/>
+              <w:bottom w:val="single" w:color="BFC9D6" w:sz="4"/>
+              <w:right w:val="single" w:color="BFC9D6" w:sz="4"/>
+            </w:tcBorders>
+            <w:shd w:fill="FFFFFF" w:color="auto" w:val="clear"/>
+            <w:tcMar>
+              <w:top w:type="dxa" w:w="60"/>
+              <w:left w:type="dxa" w:w="100"/>
+              <w:bottom w:type="dxa" w:w="60"/>
+              <w:right w:type="dxa" w:w="100"/>
+            </w:tcMar>
+          </w:tcPr>
+          <w:p>
+            <w:r>
+              <w:rPr>
+                <w:sz w:val="19"/>
+                <w:szCs w:val="19"/>
+              </w:rPr>
+              <w:t xml:space="preserve">each SmartDispatch classification</w:t>
+            </w:r>
+          </w:p>
+        </w:tc>
+      </w:tr>
+      <w:tr>
+        <w:tc>
+          <w:tcPr>
+            <w:tcW w:type="dxa" w:w="3200"/>
+            <w:tcBorders>
+              <w:top w:val="single" w:color="BFC9D6" w:sz="4"/>
+              <w:left w:val="single" w:color="BFC9D6" w:sz="4"/>
+              <w:bottom w:val="single" w:color="BFC9D6" w:sz="4"/>
+              <w:right w:val="single" w:color="BFC9D6" w:sz="4"/>
+            </w:tcBorders>
+            <w:shd w:fill="F6F8FB" w:color="auto" w:val="clear"/>
+            <w:tcMar>
+              <w:top w:type="dxa" w:w="60"/>
+              <w:left w:type="dxa" w:w="100"/>
+              <w:bottom w:type="dxa" w:w="60"/>
+              <w:right w:type="dxa" w:w="100"/>
+            </w:tcMar>
+          </w:tcPr>
+          <w:p>
+            <w:r>
+              <w:rPr>
+                <w:rFonts w:ascii="Consolas" w:cs="Consolas" w:eastAsia="Consolas" w:hAnsi="Consolas"/>
+                <w:color w:val="0B4F8A"/>
+                <w:sz w:val="19"/>
+                <w:szCs w:val="19"/>
+              </w:rPr>
+              <w:t xml:space="preserve">TAiJevGuardrailClassifier</w:t>
+            </w:r>
+          </w:p>
+        </w:tc>
+        <w:tc>
+          <w:tcPr>
+            <w:tcW w:type="dxa" w:w="6160"/>
+            <w:tcBorders>
+              <w:top w:val="single" w:color="BFC9D6" w:sz="4"/>
+              <w:left w:val="single" w:color="BFC9D6" w:sz="4"/>
+              <w:bottom w:val="single" w:color="BFC9D6" w:sz="4"/>
+              <w:right w:val="single" w:color="BFC9D6" w:sz="4"/>
+            </w:tcBorders>
+            <w:shd w:fill="F6F8FB" w:color="auto" w:val="clear"/>
+            <w:tcMar>
+              <w:top w:type="dxa" w:w="60"/>
+              <w:left w:type="dxa" w:w="100"/>
+              <w:bottom w:type="dxa" w:w="60"/>
+              <w:right w:type="dxa" w:w="100"/>
+            </w:tcMar>
+          </w:tcPr>
+          <w:p>
+            <w:r>
+              <w:rPr>
+                <w:sz w:val="19"/>
+                <w:szCs w:val="19"/>
+              </w:rPr>
+              <w:t xml:space="preserve">each </w:t>
+            </w:r>
+            <w:r>
+              <w:rPr>
+                <w:rFonts w:ascii="Consolas" w:cs="Consolas" w:eastAsia="Consolas" w:hAnsi="Consolas"/>
+                <w:color w:val="0B4F8A"/>
+                <w:sz w:val="19"/>
+                <w:szCs w:val="19"/>
+              </w:rPr>
+              <w:t xml:space="preserve">CheckToolCall</w:t>
+            </w:r>
+          </w:p>
+        </w:tc>
+      </w:tr>
+      <w:tr>
+        <w:tc>
+          <w:tcPr>
+            <w:tcW w:type="dxa" w:w="3200"/>
+            <w:tcBorders>
+              <w:top w:val="single" w:color="BFC9D6" w:sz="4"/>
+              <w:left w:val="single" w:color="BFC9D6" w:sz="4"/>
+              <w:bottom w:val="single" w:color="BFC9D6" w:sz="4"/>
+              <w:right w:val="single" w:color="BFC9D6" w:sz="4"/>
+            </w:tcBorders>
+            <w:shd w:fill="FFFFFF" w:color="auto" w:val="clear"/>
+            <w:tcMar>
+              <w:top w:type="dxa" w:w="60"/>
+              <w:left w:type="dxa" w:w="100"/>
+              <w:bottom w:type="dxa" w:w="60"/>
+              <w:right w:type="dxa" w:w="100"/>
+            </w:tcMar>
+          </w:tcPr>
+          <w:p>
+            <w:r>
+              <w:rPr>
+                <w:rFonts w:ascii="Consolas" w:cs="Consolas" w:eastAsia="Consolas" w:hAnsi="Consolas"/>
+                <w:color w:val="0B4F8A"/>
+                <w:sz w:val="19"/>
+                <w:szCs w:val="19"/>
+              </w:rPr>
+              <w:t xml:space="preserve">TAiJevEvalScorer</w:t>
+            </w:r>
+          </w:p>
+        </w:tc>
+        <w:tc>
+          <w:tcPr>
+            <w:tcW w:type="dxa" w:w="6160"/>
+            <w:tcBorders>
+              <w:top w:val="single" w:color="BFC9D6" w:sz="4"/>
+              <w:left w:val="single" w:color="BFC9D6" w:sz="4"/>
+              <w:bottom w:val="single" w:color="BFC9D6" w:sz="4"/>
+              <w:right w:val="single" w:color="BFC9D6" w:sz="4"/>
+            </w:tcBorders>
+            <w:shd w:fill="FFFFFF" w:color="auto" w:val="clear"/>
+            <w:tcMar>
+              <w:top w:type="dxa" w:w="60"/>
+              <w:left w:type="dxa" w:w="100"/>
+              <w:bottom w:type="dxa" w:w="60"/>
+              <w:right w:type="dxa" w:w="100"/>
+            </w:tcMar>
+          </w:tcPr>
+          <w:p>
+            <w:r>
+              <w:rPr>
+                <w:sz w:val="19"/>
+                <w:szCs w:val="19"/>
+              </w:rPr>
+              <w:t xml:space="preserve">each </w:t>
+            </w:r>
+            <w:r>
+              <w:rPr>
+                <w:rFonts w:ascii="Consolas" w:cs="Consolas" w:eastAsia="Consolas" w:hAnsi="Consolas"/>
+                <w:color w:val="0B4F8A"/>
+                <w:sz w:val="19"/>
+                <w:szCs w:val="19"/>
+              </w:rPr>
+              <w:t xml:space="preserve">Score</w:t>
+            </w:r>
+            <w:r>
+              <w:rPr>
+                <w:sz w:val="19"/>
+                <w:szCs w:val="19"/>
+              </w:rPr>
+              <w:t xml:space="preserve"> (one eval check)</w:t>
+            </w:r>
+          </w:p>
+        </w:tc>
+      </w:tr>
+      <w:tr>
+        <w:tc>
+          <w:tcPr>
+            <w:tcW w:type="dxa" w:w="3200"/>
+            <w:tcBorders>
+              <w:top w:val="single" w:color="BFC9D6" w:sz="4"/>
+              <w:left w:val="single" w:color="BFC9D6" w:sz="4"/>
+              <w:bottom w:val="single" w:color="BFC9D6" w:sz="4"/>
+              <w:right w:val="single" w:color="BFC9D6" w:sz="4"/>
+            </w:tcBorders>
+            <w:shd w:fill="F6F8FB" w:color="auto" w:val="clear"/>
+            <w:tcMar>
+              <w:top w:type="dxa" w:w="60"/>
+              <w:left w:type="dxa" w:w="100"/>
+              <w:bottom w:type="dxa" w:w="60"/>
+              <w:right w:type="dxa" w:w="100"/>
+            </w:tcMar>
+          </w:tcPr>
+          <w:p>
+            <w:r>
+              <w:rPr>
+                <w:rFonts w:ascii="Consolas" w:cs="Consolas" w:eastAsia="Consolas" w:hAnsi="Consolas"/>
+                <w:color w:val="0B4F8A"/>
+                <w:sz w:val="19"/>
+                <w:szCs w:val="19"/>
+              </w:rPr>
+              <w:t xml:space="preserve">TAiJevModelRouter</w:t>
+            </w:r>
+          </w:p>
+        </w:tc>
+        <w:tc>
+          <w:tcPr>
+            <w:tcW w:type="dxa" w:w="6160"/>
+            <w:tcBorders>
+              <w:top w:val="single" w:color="BFC9D6" w:sz="4"/>
+              <w:left w:val="single" w:color="BFC9D6" w:sz="4"/>
+              <w:bottom w:val="single" w:color="BFC9D6" w:sz="4"/>
+              <w:right w:val="single" w:color="BFC9D6" w:sz="4"/>
+            </w:tcBorders>
+            <w:shd w:fill="F6F8FB" w:color="auto" w:val="clear"/>
+            <w:tcMar>
+              <w:top w:type="dxa" w:w="60"/>
+              <w:left w:type="dxa" w:w="100"/>
+              <w:bottom w:type="dxa" w:w="60"/>
+              <w:right w:type="dxa" w:w="100"/>
+            </w:tcMar>
+          </w:tcPr>
+          <w:p>
+            <w:r>
+              <w:rPr>
+                <w:sz w:val="19"/>
+                <w:szCs w:val="19"/>
+              </w:rPr>
+              <w:t xml:space="preserve">each </w:t>
+            </w:r>
+            <w:r>
+              <w:rPr>
+                <w:rFonts w:ascii="Consolas" w:cs="Consolas" w:eastAsia="Consolas" w:hAnsi="Consolas"/>
+                <w:color w:val="0B4F8A"/>
+                <w:sz w:val="19"/>
+                <w:szCs w:val="19"/>
+              </w:rPr>
+              <w:t xml:space="preserve">Route</w:t>
+            </w:r>
+            <w:r>
+              <w:rPr>
+                <w:sz w:val="19"/>
+                <w:szCs w:val="19"/>
+              </w:rPr>
+              <w:t xml:space="preserve"> (also inside </w:t>
+            </w:r>
+            <w:r>
+              <w:rPr>
+                <w:rFonts w:ascii="Consolas" w:cs="Consolas" w:eastAsia="Consolas" w:hAnsi="Consolas"/>
+                <w:color w:val="0B4F8A"/>
+                <w:sz w:val="19"/>
+                <w:szCs w:val="19"/>
+              </w:rPr>
+              <w:t xml:space="preserve">Ask</w:t>
+            </w:r>
+            <w:r>
+              <w:rPr>
+                <w:sz w:val="19"/>
+                <w:szCs w:val="19"/>
+              </w:rPr>
+              <w:t xml:space="preserve">)</w:t>
+            </w:r>
+          </w:p>
+        </w:tc>
+      </w:tr>
+      <w:tr>
+        <w:tc>
+          <w:tcPr>
+            <w:tcW w:type="dxa" w:w="3200"/>
+            <w:tcBorders>
+              <w:top w:val="single" w:color="BFC9D6" w:sz="4"/>
+              <w:left w:val="single" w:color="BFC9D6" w:sz="4"/>
+              <w:bottom w:val="single" w:color="BFC9D6" w:sz="4"/>
+              <w:right w:val="single" w:color="BFC9D6" w:sz="4"/>
+            </w:tcBorders>
+            <w:shd w:fill="FFFFFF" w:color="auto" w:val="clear"/>
+            <w:tcMar>
+              <w:top w:type="dxa" w:w="60"/>
+              <w:left w:type="dxa" w:w="100"/>
+              <w:bottom w:type="dxa" w:w="60"/>
+              <w:right w:type="dxa" w:w="100"/>
+            </w:tcMar>
+          </w:tcPr>
+          <w:p>
+            <w:r>
+              <w:rPr>
+                <w:rFonts w:ascii="Consolas" w:cs="Consolas" w:eastAsia="Consolas" w:hAnsi="Consolas"/>
+                <w:color w:val="0B4F8A"/>
+                <w:sz w:val="19"/>
+                <w:szCs w:val="19"/>
+              </w:rPr>
+              <w:t xml:space="preserve">TAiJevRouterTool</w:t>
+            </w:r>
+          </w:p>
+        </w:tc>
+        <w:tc>
+          <w:tcPr>
+            <w:tcW w:type="dxa" w:w="6160"/>
+            <w:tcBorders>
+              <w:top w:val="single" w:color="BFC9D6" w:sz="4"/>
+              <w:left w:val="single" w:color="BFC9D6" w:sz="4"/>
+              <w:bottom w:val="single" w:color="BFC9D6" w:sz="4"/>
+              <w:right w:val="single" w:color="BFC9D6" w:sz="4"/>
+            </w:tcBorders>
+            <w:shd w:fill="FFFFFF" w:color="auto" w:val="clear"/>
+            <w:tcMar>
+              <w:top w:type="dxa" w:w="60"/>
+              <w:left w:type="dxa" w:w="100"/>
+              <w:bottom w:type="dxa" w:w="60"/>
+              <w:right w:type="dxa" w:w="100"/>
+            </w:tcMar>
+          </w:tcPr>
+          <w:p>
+            <w:r>
+              <w:rPr>
+                <w:sz w:val="19"/>
+                <w:szCs w:val="19"/>
+              </w:rPr>
+              <w:t xml:space="preserve">each node execution</w:t>
+            </w:r>
+          </w:p>
+        </w:tc>
+      </w:tr>
+      <w:tr>
+        <w:tc>
+          <w:tcPr>
+            <w:tcW w:type="dxa" w:w="3200"/>
+            <w:tcBorders>
+              <w:top w:val="single" w:color="BFC9D6" w:sz="4"/>
+              <w:left w:val="single" w:color="BFC9D6" w:sz="4"/>
+              <w:bottom w:val="single" w:color="BFC9D6" w:sz="4"/>
+              <w:right w:val="single" w:color="BFC9D6" w:sz="4"/>
+            </w:tcBorders>
+            <w:shd w:fill="F6F8FB" w:color="auto" w:val="clear"/>
+            <w:tcMar>
+              <w:top w:type="dxa" w:w="60"/>
+              <w:left w:type="dxa" w:w="100"/>
+              <w:bottom w:type="dxa" w:w="60"/>
+              <w:right w:type="dxa" w:w="100"/>
+            </w:tcMar>
+          </w:tcPr>
+          <w:p>
+            <w:r>
+              <w:rPr>
+                <w:rFonts w:ascii="Consolas" w:cs="Consolas" w:eastAsia="Consolas" w:hAnsi="Consolas"/>
+                <w:color w:val="0B4F8A"/>
+                <w:sz w:val="19"/>
+                <w:szCs w:val="19"/>
+              </w:rPr>
+              <w:t xml:space="preserve">TAiJevRAGReranker</w:t>
+            </w:r>
+          </w:p>
+        </w:tc>
+        <w:tc>
+          <w:tcPr>
+            <w:tcW w:type="dxa" w:w="6160"/>
+            <w:tcBorders>
+              <w:top w:val="single" w:color="BFC9D6" w:sz="4"/>
+              <w:left w:val="single" w:color="BFC9D6" w:sz="4"/>
+              <w:bottom w:val="single" w:color="BFC9D6" w:sz="4"/>
+              <w:right w:val="single" w:color="BFC9D6" w:sz="4"/>
+            </w:tcBorders>
+            <w:shd w:fill="F6F8FB" w:color="auto" w:val="clear"/>
+            <w:tcMar>
+              <w:top w:type="dxa" w:w="60"/>
+              <w:left w:type="dxa" w:w="100"/>
+              <w:bottom w:type="dxa" w:w="60"/>
+              <w:right w:type="dxa" w:w="100"/>
+            </w:tcMar>
+          </w:tcPr>
+          <w:p>
+            <w:r>
+              <w:rPr>
+                <w:sz w:val="19"/>
+                <w:szCs w:val="19"/>
+              </w:rPr>
+              <w:t xml:space="preserve">each </w:t>
+            </w:r>
+            <w:r>
+              <w:rPr>
+                <w:rFonts w:ascii="Consolas" w:cs="Consolas" w:eastAsia="Consolas" w:hAnsi="Consolas"/>
+                <w:color w:val="0B4F8A"/>
+                <w:sz w:val="19"/>
+                <w:szCs w:val="19"/>
+              </w:rPr>
+              <w:t xml:space="preserve">Score</w:t>
+            </w:r>
+            <w:r>
+              <w:rPr>
+                <w:sz w:val="19"/>
+                <w:szCs w:val="19"/>
+              </w:rPr>
+              <w:t xml:space="preserve"> — </w:t>
+            </w:r>
+            <w:r>
+              <w:rPr>
+                <w:b/>
+                <w:bCs/>
+                <w:sz w:val="19"/>
+                <w:szCs w:val="19"/>
+              </w:rPr>
+              <w:t xml:space="preserve">a single event with the total</w:t>
+            </w:r>
+            <w:r>
+              <w:rPr>
+                <w:sz w:val="19"/>
+                <w:szCs w:val="19"/>
+              </w:rPr>
+              <w:t xml:space="preserve"> even when it queries N passages in parallel</w:t>
+            </w:r>
+          </w:p>
+        </w:tc>
+      </w:tr>
+      <w:tr>
+        <w:tc>
+          <w:tcPr>
+            <w:tcW w:type="dxa" w:w="3200"/>
+            <w:tcBorders>
+              <w:top w:val="single" w:color="BFC9D6" w:sz="4"/>
+              <w:left w:val="single" w:color="BFC9D6" w:sz="4"/>
+              <w:bottom w:val="single" w:color="BFC9D6" w:sz="4"/>
+              <w:right w:val="single" w:color="BFC9D6" w:sz="4"/>
+            </w:tcBorders>
+            <w:shd w:fill="FFFFFF" w:color="auto" w:val="clear"/>
+            <w:tcMar>
+              <w:top w:type="dxa" w:w="60"/>
+              <w:left w:type="dxa" w:w="100"/>
+              <w:bottom w:type="dxa" w:w="60"/>
+              <w:right w:type="dxa" w:w="100"/>
+            </w:tcMar>
+          </w:tcPr>
+          <w:p>
+            <w:r>
+              <w:rPr>
+                <w:rFonts w:ascii="Consolas" w:cs="Consolas" w:eastAsia="Consolas" w:hAnsi="Consolas"/>
+                <w:color w:val="0B4F8A"/>
+                <w:sz w:val="19"/>
+                <w:szCs w:val="19"/>
+              </w:rPr>
+              <w:t xml:space="preserve">TAiJevBatchLabeler</w:t>
+            </w:r>
+          </w:p>
+        </w:tc>
+        <w:tc>
+          <w:tcPr>
+            <w:tcW w:type="dxa" w:w="6160"/>
+            <w:tcBorders>
+              <w:top w:val="single" w:color="BFC9D6" w:sz="4"/>
+              <w:left w:val="single" w:color="BFC9D6" w:sz="4"/>
+              <w:bottom w:val="single" w:color="BFC9D6" w:sz="4"/>
+              <w:right w:val="single" w:color="BFC9D6" w:sz="4"/>
+            </w:tcBorders>
+            <w:shd w:fill="FFFFFF" w:color="auto" w:val="clear"/>
+            <w:tcMar>
+              <w:top w:type="dxa" w:w="60"/>
+              <w:left w:type="dxa" w:w="100"/>
+              <w:bottom w:type="dxa" w:w="60"/>
+              <w:right w:type="dxa" w:w="100"/>
+            </w:tcMar>
+          </w:tcPr>
+          <w:p>
+            <w:r>
+              <w:rPr>
+                <w:sz w:val="19"/>
+                <w:szCs w:val="19"/>
+              </w:rPr>
+              <w:t xml:space="preserve">each </w:t>
+            </w:r>
+            <w:r>
+              <w:rPr>
+                <w:rFonts w:ascii="Consolas" w:cs="Consolas" w:eastAsia="Consolas" w:hAnsi="Consolas"/>
+                <w:color w:val="0B4F8A"/>
+                <w:sz w:val="19"/>
+                <w:szCs w:val="19"/>
+              </w:rPr>
+              <w:t xml:space="preserve">Run</w:t>
+            </w:r>
+            <w:r>
+              <w:rPr>
+                <w:sz w:val="19"/>
+                <w:szCs w:val="19"/>
+              </w:rPr>
+              <w:t xml:space="preserve"> (the whole batch). Keeps </w:t>
+            </w:r>
+            <w:r>
+              <w:rPr>
+                <w:rFonts w:ascii="Consolas" w:cs="Consolas" w:eastAsia="Consolas" w:hAnsi="Consolas"/>
+                <w:color w:val="0B4F8A"/>
+                <w:sz w:val="19"/>
+                <w:szCs w:val="19"/>
+              </w:rPr>
+              <w:t xml:space="preserve">PricePerMillion</w:t>
+            </w:r>
+            <w:r>
+              <w:rPr>
+                <w:sz w:val="19"/>
+                <w:szCs w:val="19"/>
+              </w:rPr>
+              <w:t xml:space="preserve"> as the input price</w:t>
+            </w:r>
+          </w:p>
+        </w:tc>
+      </w:tr>
+    </w:tbl>
+    <w:p>
+      <w:pPr>
+        <w:spacing w:after="80"/>
+      </w:pPr>
+    </w:p>
+    <w:p>
+      <w:pPr>
+        <w:pStyle w:val="Heading3"/>
+      </w:pPr>
+      <w:r>
+        <w:t xml:space="preserve">Billing in a server</w:t>
+      </w:r>
+    </w:p>
+    <w:p>
+      <w:pPr>
+        <w:spacing w:after="120"/>
+      </w:pPr>
       <w:r>
         <w:rPr>
           <w:rFonts w:ascii="Consolas" w:cs="Consolas" w:eastAsia="Consolas" w:hAnsi="Consolas"/>
@@ -6825,10 +8232,20 @@
           <w:sz w:val="19"/>
           <w:szCs w:val="19"/>
         </w:rPr>
-        <w:t xml:space="preserve">Routes</w:t>
-      </w:r>
-      <w:r>
-        <w:t xml:space="preserve"> matches the node input and writes the chosen key to </w:t>
+        <w:t xml:space="preserve">OnUsage</w:t>
+      </w:r>
+      <w:r>
+        <w:t xml:space="preserve"> fires </w:t>
+      </w:r>
+      <w:r>
+        <w:rPr>
+          <w:b/>
+          <w:bCs/>
+        </w:rPr>
+        <w:t xml:space="preserve">synchronously, on the thread that ran the operation</w:t>
+      </w:r>
+      <w:r>
+        <w:t xml:space="preserve"> (not through </w:t>
       </w:r>
       <w:r>
         <w:rPr>
@@ -6837,45 +8254,16 @@
           <w:sz w:val="19"/>
           <w:szCs w:val="19"/>
         </w:rPr>
-        <w:t xml:space="preserve">Blackboard['next_route']</w:t>
-      </w:r>
-      <w:r>
-        <w:t xml:space="preserve">, which is exactly what an </w:t>
-      </w:r>
-      <w:r>
-        <w:rPr>
-          <w:rFonts w:ascii="Consolas" w:cs="Consolas" w:eastAsia="Consolas" w:hAnsi="Consolas"/>
-          <w:color w:val="0B4F8A"/>
-          <w:sz w:val="19"/>
-          <w:szCs w:val="19"/>
-        </w:rPr>
-        <w:t xml:space="preserve">lmConditional</w:t>
-      </w:r>
-      <w:r>
-        <w:t xml:space="preserve"> </w:t>
-      </w:r>
-      <w:r>
-        <w:rPr>
-          <w:rFonts w:ascii="Consolas" w:cs="Consolas" w:eastAsia="Consolas" w:hAnsi="Consolas"/>
-          <w:color w:val="0B4F8A"/>
-          <w:sz w:val="19"/>
-          <w:szCs w:val="19"/>
-        </w:rPr>
-        <w:t xml:space="preserve">TAIAgentsLink</w:t>
-      </w:r>
-      <w:r>
-        <w:t xml:space="preserve"> already reads. </w:t>
-      </w:r>
-      <w:r>
-        <w:rPr>
-          <w:b/>
-          <w:bCs/>
-        </w:rPr>
-        <w:t xml:space="preserve">The agent engine does not change.</w:t>
-      </w:r>
-    </w:p>
-    <w:p>
-      <w:pPr>
+        <w:t xml:space="preserve">TThread.Queue</w:t>
+      </w:r>
+      <w:r>
+        <w:t xml:space="preserve">). In a server that is the request thread, so the handler knows which customer to charge without tricks. The reranker joins its parallel calls before firing the event, also on the caller thread.</w:t>
+      </w:r>
+    </w:p>
+    <w:p>
+      <w:pPr>
+        <w:keepNext/>
+        <w:keepLines/>
         <w:pBdr>
           <w:left w:val="single" w:color="2E75B6" w:sz="12" w:space="6"/>
         </w:pBdr>
@@ -6889,11 +8277,13 @@
           <w:sz w:val="17"/>
           <w:szCs w:val="17"/>
         </w:rPr>
-        <w:t xml:space="preserve">Reception --(lmConditional)--&gt; 'accounting' -&gt; accounting agent node</w:t>
-      </w:r>
-    </w:p>
-    <w:p>
-      <w:pPr>
+        <w:t xml:space="preserve">Guard.OnUsage := GuardUsage;</w:t>
+      </w:r>
+    </w:p>
+    <w:p>
+      <w:pPr>
+        <w:keepNext/>
+        <w:keepLines/>
         <w:pBdr>
           <w:left w:val="single" w:color="2E75B6" w:sz="12" w:space="6"/>
         </w:pBdr>
@@ -6907,11 +8297,193 @@
           <w:sz w:val="17"/>
           <w:szCs w:val="17"/>
         </w:rPr>
-        <w:t xml:space="preserve">                             -&gt; 'tax'        -&gt; tax agent node</w:t>
-      </w:r>
-    </w:p>
-    <w:p>
-      <w:pPr>
+        <w:t xml:space="preserve"> </w:t>
+      </w:r>
+    </w:p>
+    <w:p>
+      <w:pPr>
+        <w:keepNext/>
+        <w:keepLines/>
+        <w:pBdr>
+          <w:left w:val="single" w:color="2E75B6" w:sz="12" w:space="6"/>
+        </w:pBdr>
+        <w:shd w:fill="F3F5F8" w:color="auto" w:val="clear"/>
+        <w:spacing w:after="0" w:before="0" w:line="260"/>
+        <w:ind w:left="120"/>
+      </w:pPr>
+      <w:r>
+        <w:rPr>
+          <w:rFonts w:ascii="Consolas" w:cs="Consolas" w:eastAsia="Consolas" w:hAnsi="Consolas"/>
+          <w:sz w:val="17"/>
+          <w:szCs w:val="17"/>
+        </w:rPr>
+        <w:t xml:space="preserve">procedure TServer.GuardUsage(Sender: TObject; const AUsage: TAiJevUsage);</w:t>
+      </w:r>
+    </w:p>
+    <w:p>
+      <w:pPr>
+        <w:keepNext/>
+        <w:keepLines/>
+        <w:pBdr>
+          <w:left w:val="single" w:color="2E75B6" w:sz="12" w:space="6"/>
+        </w:pBdr>
+        <w:shd w:fill="F3F5F8" w:color="auto" w:val="clear"/>
+        <w:spacing w:after="0" w:before="0" w:line="260"/>
+        <w:ind w:left="120"/>
+      </w:pPr>
+      <w:r>
+        <w:rPr>
+          <w:rFonts w:ascii="Consolas" w:cs="Consolas" w:eastAsia="Consolas" w:hAnsi="Consolas"/>
+          <w:sz w:val="17"/>
+          <w:szCs w:val="17"/>
+        </w:rPr>
+        <w:t xml:space="preserve">begin</w:t>
+      </w:r>
+    </w:p>
+    <w:p>
+      <w:pPr>
+        <w:keepNext/>
+        <w:keepLines/>
+        <w:pBdr>
+          <w:left w:val="single" w:color="2E75B6" w:sz="12" w:space="6"/>
+        </w:pBdr>
+        <w:shd w:fill="F3F5F8" w:color="auto" w:val="clear"/>
+        <w:spacing w:after="0" w:before="0" w:line="260"/>
+        <w:ind w:left="120"/>
+      </w:pPr>
+      <w:r>
+        <w:rPr>
+          <w:rFonts w:ascii="Consolas" w:cs="Consolas" w:eastAsia="Consolas" w:hAnsi="Consolas"/>
+          <w:sz w:val="17"/>
+          <w:szCs w:val="17"/>
+        </w:rPr>
+        <w:t xml:space="preserve">  // Request thread: the current customer is the one to bill</w:t>
+      </w:r>
+    </w:p>
+    <w:p>
+      <w:pPr>
+        <w:keepNext/>
+        <w:keepLines/>
+        <w:pBdr>
+          <w:left w:val="single" w:color="2E75B6" w:sz="12" w:space="6"/>
+        </w:pBdr>
+        <w:shd w:fill="F3F5F8" w:color="auto" w:val="clear"/>
+        <w:spacing w:after="0" w:before="0" w:line="260"/>
+        <w:ind w:left="120"/>
+      </w:pPr>
+      <w:r>
+        <w:rPr>
+          <w:rFonts w:ascii="Consolas" w:cs="Consolas" w:eastAsia="Consolas" w:hAnsi="Consolas"/>
+          <w:sz w:val="17"/>
+          <w:szCs w:val="17"/>
+        </w:rPr>
+        <w:t xml:space="preserve">  Billing.Record(CurrentCustomer, 'jev.promptguard',</w:t>
+      </w:r>
+    </w:p>
+    <w:p>
+      <w:pPr>
+        <w:keepNext/>
+        <w:keepLines/>
+        <w:pBdr>
+          <w:left w:val="single" w:color="2E75B6" w:sz="12" w:space="6"/>
+        </w:pBdr>
+        <w:shd w:fill="F3F5F8" w:color="auto" w:val="clear"/>
+        <w:spacing w:after="0" w:before="0" w:line="260"/>
+        <w:ind w:left="120"/>
+      </w:pPr>
+      <w:r>
+        <w:rPr>
+          <w:rFonts w:ascii="Consolas" w:cs="Consolas" w:eastAsia="Consolas" w:hAnsi="Consolas"/>
+          <w:sz w:val="17"/>
+          <w:szCs w:val="17"/>
+        </w:rPr>
+        <w:t xml:space="preserve">    AUsage.Requests, AUsage.InputTokens, AUsage.CostUSD);</w:t>
+      </w:r>
+    </w:p>
+    <w:p>
+      <w:pPr>
+        <w:keepNext/>
+        <w:keepLines/>
+        <w:pBdr>
+          <w:left w:val="single" w:color="2E75B6" w:sz="12" w:space="6"/>
+        </w:pBdr>
+        <w:shd w:fill="F3F5F8" w:color="auto" w:val="clear"/>
+        <w:spacing w:after="0" w:before="0" w:line="260"/>
+        <w:ind w:left="120"/>
+      </w:pPr>
+      <w:r>
+        <w:rPr>
+          <w:rFonts w:ascii="Consolas" w:cs="Consolas" w:eastAsia="Consolas" w:hAnsi="Consolas"/>
+          <w:sz w:val="17"/>
+          <w:szCs w:val="17"/>
+        </w:rPr>
+        <w:t xml:space="preserve">end;</w:t>
+      </w:r>
+    </w:p>
+    <w:p>
+      <w:pPr>
+        <w:keepNext/>
+        <w:keepLines/>
+        <w:pBdr>
+          <w:left w:val="single" w:color="2E75B6" w:sz="12" w:space="6"/>
+        </w:pBdr>
+        <w:shd w:fill="F3F5F8" w:color="auto" w:val="clear"/>
+        <w:spacing w:after="0" w:before="0" w:line="260"/>
+        <w:ind w:left="120"/>
+      </w:pPr>
+      <w:r>
+        <w:rPr>
+          <w:rFonts w:ascii="Consolas" w:cs="Consolas" w:eastAsia="Consolas" w:hAnsi="Consolas"/>
+          <w:sz w:val="17"/>
+          <w:szCs w:val="17"/>
+        </w:rPr>
+        <w:t xml:space="preserve"> </w:t>
+      </w:r>
+    </w:p>
+    <w:p>
+      <w:pPr>
+        <w:keepNext/>
+        <w:keepLines/>
+        <w:pBdr>
+          <w:left w:val="single" w:color="2E75B6" w:sz="12" w:space="6"/>
+        </w:pBdr>
+        <w:shd w:fill="F3F5F8" w:color="auto" w:val="clear"/>
+        <w:spacing w:after="0" w:before="0" w:line="260"/>
+        <w:ind w:left="120"/>
+      </w:pPr>
+      <w:r>
+        <w:rPr>
+          <w:rFonts w:ascii="Consolas" w:cs="Consolas" w:eastAsia="Consolas" w:hAnsi="Consolas"/>
+          <w:sz w:val="17"/>
+          <w:szCs w:val="17"/>
+        </w:rPr>
+        <w:t xml:space="preserve">// At any time: component totals</w:t>
+      </w:r>
+    </w:p>
+    <w:p>
+      <w:pPr>
+        <w:keepNext/>
+        <w:keepLines/>
+        <w:pBdr>
+          <w:left w:val="single" w:color="2E75B6" w:sz="12" w:space="6"/>
+        </w:pBdr>
+        <w:shd w:fill="F3F5F8" w:color="auto" w:val="clear"/>
+        <w:spacing w:after="0" w:before="0" w:line="260"/>
+        <w:ind w:left="120"/>
+      </w:pPr>
+      <w:r>
+        <w:rPr>
+          <w:rFonts w:ascii="Consolas" w:cs="Consolas" w:eastAsia="Consolas" w:hAnsi="Consolas"/>
+          <w:sz w:val="17"/>
+          <w:szCs w:val="17"/>
+        </w:rPr>
+        <w:t xml:space="preserve">Writeln(Format('%d calls, US$%.6f', [Guard.Usage.Requests, Guard.Usage.CostUSD]));</w:t>
+      </w:r>
+    </w:p>
+    <w:p>
+      <w:pPr>
+        <w:keepNext w:val="false"/>
+        <w:keepLines/>
         <w:pBdr>
           <w:left w:val="single" w:color="2E75B6" w:sz="12" w:space="6"/>
         </w:pBdr>
@@ -6925,19 +8497,175 @@
           <w:sz w:val="17"/>
           <w:szCs w:val="17"/>
         </w:rPr>
-        <w:t xml:space="preserve">                             -&gt; NextNo       -&gt; 'human' (low confidence or error)</w:t>
-      </w:r>
-    </w:p>
-    <w:p>
-      <w:pPr>
-        <w:pStyle w:val="Heading2"/>
-      </w:pPr>
-      <w:r>
-        <w:t xml:space="preserve">5.1 Example</w:t>
-      </w:r>
-    </w:p>
-    <w:p>
-      <w:pPr>
+        <w:t xml:space="preserve">Guard.ResetUsage;</w:t>
+      </w:r>
+    </w:p>
+    <w:p>
+      <w:pPr>
+        <w:pBdr>
+          <w:left w:val="single" w:color="D08A2A" w:sz="18" w:space="8"/>
+        </w:pBdr>
+        <w:shd w:fill="FFF4E5" w:color="auto" w:val="clear"/>
+        <w:spacing w:after="160" w:before="80"/>
+        <w:ind w:left="120" w:right="120"/>
+      </w:pPr>
+      <w:r>
+        <w:rPr>
+          <w:b/>
+          <w:bCs/>
+          <w:color w:val="D08A2A"/>
+        </w:rPr>
+        <w:t xml:space="preserve">Do not count twice: </w:t>
+      </w:r>
+      <w:r>
+        <w:t xml:space="preserve">if several adapters share one external </w:t>
+      </w:r>
+      <w:r>
+        <w:rPr>
+          <w:rFonts w:ascii="Consolas" w:cs="Consolas" w:eastAsia="Consolas" w:hAnsi="Consolas"/>
+          <w:color w:val="0B4F8A"/>
+          <w:sz w:val="19"/>
+          <w:szCs w:val="19"/>
+        </w:rPr>
+        <w:t xml:space="preserve">TAiJev</w:t>
+      </w:r>
+      <w:r>
+        <w:t xml:space="preserve">, bill from the adapters </w:t>
+      </w:r>
+      <w:r>
+        <w:rPr>
+          <w:b/>
+          <w:bCs/>
+        </w:rPr>
+        <w:t xml:space="preserve">or</w:t>
+      </w:r>
+      <w:r>
+        <w:t xml:space="preserve"> from </w:t>
+      </w:r>
+      <w:r>
+        <w:rPr>
+          <w:rFonts w:ascii="Consolas" w:cs="Consolas" w:eastAsia="Consolas" w:hAnsi="Consolas"/>
+          <w:color w:val="0B4F8A"/>
+          <w:sz w:val="19"/>
+          <w:szCs w:val="19"/>
+        </w:rPr>
+        <w:t xml:space="preserve">TAiJev.OnUsage</w:t>
+      </w:r>
+      <w:r>
+        <w:t xml:space="preserve">, not both: the same call shows up in each.</w:t>
+      </w:r>
+    </w:p>
+    <w:p>
+      <w:pPr>
+        <w:pStyle w:val="ListParagraph"/>
+        <w:numPr>
+          <w:ilvl w:val="0"/>
+          <w:numId w:val="2"/>
+        </w:numPr>
+        <w:spacing w:after="60"/>
+      </w:pPr>
+      <w:r>
+        <w:t xml:space="preserve">If an operation fails halfway (e.g. one reranker passage), what the successful calls already consumed is still reported.</w:t>
+      </w:r>
+    </w:p>
+    <w:p>
+      <w:pPr>
+        <w:pStyle w:val="ListParagraph"/>
+        <w:numPr>
+          <w:ilvl w:val="0"/>
+          <w:numId w:val="2"/>
+        </w:numPr>
+        <w:spacing w:after="60"/>
+      </w:pPr>
+      <w:r>
+        <w:t xml:space="preserve">The figures are the ones the API returns. Measured live: two guard checks = 777 input tokens (US$0.0000326); a 4-passage parallel rerank = one event with 4 requests and 1,368 tokens (US$0.0000575). A passage sent straight to the API reported the same output tokens the component counted.</w:t>
+      </w:r>
+    </w:p>
+    <w:p>
+      <w:pPr>
+        <w:pStyle w:val="Heading1"/>
+        <w:pageBreakBefore/>
+      </w:pPr>
+      <w:r>
+        <w:t xml:space="preserve">5. Routing agent graphs: TAiJevRouterTool</w:t>
+      </w:r>
+    </w:p>
+    <w:p>
+      <w:pPr>
+        <w:spacing w:after="120"/>
+      </w:pPr>
+      <w:r>
+        <w:rPr>
+          <w:rFonts w:ascii="Consolas" w:cs="Consolas" w:eastAsia="Consolas" w:hAnsi="Consolas"/>
+          <w:color w:val="0B4F8A"/>
+          <w:sz w:val="19"/>
+          <w:szCs w:val="19"/>
+        </w:rPr>
+        <w:t xml:space="preserve">TAiJevRouterTool</w:t>
+      </w:r>
+      <w:r>
+        <w:t xml:space="preserve"> is a node tool. It asks Jev which of its </w:t>
+      </w:r>
+      <w:r>
+        <w:rPr>
+          <w:rFonts w:ascii="Consolas" w:cs="Consolas" w:eastAsia="Consolas" w:hAnsi="Consolas"/>
+          <w:color w:val="0B4F8A"/>
+          <w:sz w:val="19"/>
+          <w:szCs w:val="19"/>
+        </w:rPr>
+        <w:t xml:space="preserve">Routes</w:t>
+      </w:r>
+      <w:r>
+        <w:t xml:space="preserve"> matches the node input and writes the chosen key to </w:t>
+      </w:r>
+      <w:r>
+        <w:rPr>
+          <w:rFonts w:ascii="Consolas" w:cs="Consolas" w:eastAsia="Consolas" w:hAnsi="Consolas"/>
+          <w:color w:val="0B4F8A"/>
+          <w:sz w:val="19"/>
+          <w:szCs w:val="19"/>
+        </w:rPr>
+        <w:t xml:space="preserve">Blackboard['next_route']</w:t>
+      </w:r>
+      <w:r>
+        <w:t xml:space="preserve">, which is exactly what an </w:t>
+      </w:r>
+      <w:r>
+        <w:rPr>
+          <w:rFonts w:ascii="Consolas" w:cs="Consolas" w:eastAsia="Consolas" w:hAnsi="Consolas"/>
+          <w:color w:val="0B4F8A"/>
+          <w:sz w:val="19"/>
+          <w:szCs w:val="19"/>
+        </w:rPr>
+        <w:t xml:space="preserve">lmConditional</w:t>
+      </w:r>
+      <w:r>
+        <w:t xml:space="preserve"> </w:t>
+      </w:r>
+      <w:r>
+        <w:rPr>
+          <w:rFonts w:ascii="Consolas" w:cs="Consolas" w:eastAsia="Consolas" w:hAnsi="Consolas"/>
+          <w:color w:val="0B4F8A"/>
+          <w:sz w:val="19"/>
+          <w:szCs w:val="19"/>
+        </w:rPr>
+        <w:t xml:space="preserve">TAIAgentsLink</w:t>
+      </w:r>
+      <w:r>
+        <w:t xml:space="preserve"> already reads. </w:t>
+      </w:r>
+      <w:r>
+        <w:rPr>
+          <w:b/>
+          <w:bCs/>
+        </w:rPr>
+        <w:t xml:space="preserve">The agent engine does not change.</w:t>
+      </w:r>
+    </w:p>
+    <w:p>
+      <w:pPr>
+        <w:keepNext/>
+        <w:keepLines/>
         <w:pBdr>
           <w:left w:val="single" w:color="2E75B6" w:sz="12" w:space="6"/>
         </w:pBdr>
@@ -6951,11 +8679,13 @@
           <w:sz w:val="17"/>
           <w:szCs w:val="17"/>
         </w:rPr>
-        <w:t xml:space="preserve">uses uMakerAi.Agents, uMakerAi.Agents.Tools.JevRouter;</w:t>
-      </w:r>
-    </w:p>
-    <w:p>
-      <w:pPr>
+        <w:t xml:space="preserve">Reception --(lmConditional)--&gt; 'accounting' -&gt; accounting agent node</w:t>
+      </w:r>
+    </w:p>
+    <w:p>
+      <w:pPr>
+        <w:keepNext/>
+        <w:keepLines/>
         <w:pBdr>
           <w:left w:val="single" w:color="2E75B6" w:sz="12" w:space="6"/>
         </w:pBdr>
@@ -6969,11 +8699,61 @@
           <w:sz w:val="17"/>
           <w:szCs w:val="17"/>
         </w:rPr>
-        <w:t xml:space="preserve"> </w:t>
-      </w:r>
-    </w:p>
-    <w:p>
-      <w:pPr>
+        <w:t xml:space="preserve">                             -&gt; 'tax'        -&gt; tax agent node</w:t>
+      </w:r>
+    </w:p>
+    <w:p>
+      <w:pPr>
+        <w:keepNext w:val="false"/>
+        <w:keepLines/>
+        <w:pBdr>
+          <w:left w:val="single" w:color="2E75B6" w:sz="12" w:space="6"/>
+        </w:pBdr>
+        <w:shd w:fill="F3F5F8" w:color="auto" w:val="clear"/>
+        <w:spacing w:after="180" w:before="0" w:line="260"/>
+        <w:ind w:left="120"/>
+      </w:pPr>
+      <w:r>
+        <w:rPr>
+          <w:rFonts w:ascii="Consolas" w:cs="Consolas" w:eastAsia="Consolas" w:hAnsi="Consolas"/>
+          <w:sz w:val="17"/>
+          <w:szCs w:val="17"/>
+        </w:rPr>
+        <w:t xml:space="preserve">                             -&gt; NextNo       -&gt; 'human' (low confidence or error)</w:t>
+      </w:r>
+    </w:p>
+    <w:p>
+      <w:pPr>
+        <w:pStyle w:val="Heading2"/>
+      </w:pPr>
+      <w:r>
+        <w:t xml:space="preserve">5.1 Example</w:t>
+      </w:r>
+    </w:p>
+    <w:p>
+      <w:pPr>
+        <w:keepNext/>
+        <w:keepLines/>
+        <w:pBdr>
+          <w:left w:val="single" w:color="2E75B6" w:sz="12" w:space="6"/>
+        </w:pBdr>
+        <w:shd w:fill="F3F5F8" w:color="auto" w:val="clear"/>
+        <w:spacing w:after="0" w:before="60" w:line="260"/>
+        <w:ind w:left="120"/>
+      </w:pPr>
+      <w:r>
+        <w:rPr>
+          <w:rFonts w:ascii="Consolas" w:cs="Consolas" w:eastAsia="Consolas" w:hAnsi="Consolas"/>
+          <w:sz w:val="17"/>
+          <w:szCs w:val="17"/>
+        </w:rPr>
+        <w:t xml:space="preserve">uses uMakerAi.Agents, uMakerAi.Agents.Tools.JevRouter;</w:t>
+      </w:r>
+    </w:p>
+    <w:p>
+      <w:pPr>
+        <w:keepNext/>
+        <w:keepLines/>
         <w:pBdr>
           <w:left w:val="single" w:color="2E75B6" w:sz="12" w:space="6"/>
         </w:pBdr>
@@ -6987,11 +8767,13 @@
           <w:sz w:val="17"/>
           <w:szCs w:val="17"/>
         </w:rPr>
-        <w:t xml:space="preserve">Graph.AddNode('Reception', nil)             // no OnExecute: the Tool runs it</w:t>
-      </w:r>
-    </w:p>
-    <w:p>
-      <w:pPr>
+        <w:t xml:space="preserve"> </w:t>
+      </w:r>
+    </w:p>
+    <w:p>
+      <w:pPr>
+        <w:keepNext/>
+        <w:keepLines/>
         <w:pBdr>
           <w:left w:val="single" w:color="2E75B6" w:sz="12" w:space="6"/>
         </w:pBdr>
@@ -7005,11 +8787,13 @@
           <w:sz w:val="17"/>
           <w:szCs w:val="17"/>
         </w:rPr>
-        <w:t xml:space="preserve">     .AddNode('accounting', AccountingAgent)</w:t>
-      </w:r>
-    </w:p>
-    <w:p>
-      <w:pPr>
+        <w:t xml:space="preserve">Graph.AddNode('Reception', nil)             // no OnExecute: the Tool runs it</w:t>
+      </w:r>
+    </w:p>
+    <w:p>
+      <w:pPr>
+        <w:keepNext/>
+        <w:keepLines/>
         <w:pBdr>
           <w:left w:val="single" w:color="2E75B6" w:sz="12" w:space="6"/>
         </w:pBdr>
@@ -7023,11 +8807,13 @@
           <w:sz w:val="17"/>
           <w:szCs w:val="17"/>
         </w:rPr>
-        <w:t xml:space="preserve">     .AddNode('tax', TaxAgent)</w:t>
-      </w:r>
-    </w:p>
-    <w:p>
-      <w:pPr>
+        <w:t xml:space="preserve">     .AddNode('accounting', AccountingAgent)</w:t>
+      </w:r>
+    </w:p>
+    <w:p>
+      <w:pPr>
+        <w:keepNext/>
+        <w:keepLines/>
         <w:pBdr>
           <w:left w:val="single" w:color="2E75B6" w:sz="12" w:space="6"/>
         </w:pBdr>
@@ -7041,11 +8827,13 @@
           <w:sz w:val="17"/>
           <w:szCs w:val="17"/>
         </w:rPr>
-        <w:t xml:space="preserve">     .AddNode('human', HumanDesk);</w:t>
-      </w:r>
-    </w:p>
-    <w:p>
-      <w:pPr>
+        <w:t xml:space="preserve">     .AddNode('tax', TaxAgent)</w:t>
+      </w:r>
+    </w:p>
+    <w:p>
+      <w:pPr>
+        <w:keepNext/>
+        <w:keepLines/>
         <w:pBdr>
           <w:left w:val="single" w:color="2E75B6" w:sz="12" w:space="6"/>
         </w:pBdr>
@@ -7059,11 +8847,13 @@
           <w:sz w:val="17"/>
           <w:szCs w:val="17"/>
         </w:rPr>
-        <w:t xml:space="preserve"> </w:t>
-      </w:r>
-    </w:p>
-    <w:p>
-      <w:pPr>
+        <w:t xml:space="preserve">     .AddNode('human', HumanDesk);</w:t>
+      </w:r>
+    </w:p>
+    <w:p>
+      <w:pPr>
+        <w:keepNext/>
+        <w:keepLines/>
         <w:pBdr>
           <w:left w:val="single" w:color="2E75B6" w:sz="12" w:space="6"/>
         </w:pBdr>
@@ -7077,11 +8867,13 @@
           <w:sz w:val="17"/>
           <w:szCs w:val="17"/>
         </w:rPr>
-        <w:t xml:space="preserve">Router := TAiJevRouterTool.Create(Graph);</w:t>
-      </w:r>
-    </w:p>
-    <w:p>
-      <w:pPr>
+        <w:t xml:space="preserve"> </w:t>
+      </w:r>
+    </w:p>
+    <w:p>
+      <w:pPr>
+        <w:keepNext/>
+        <w:keepLines/>
         <w:pBdr>
           <w:left w:val="single" w:color="2E75B6" w:sz="12" w:space="6"/>
         </w:pBdr>
@@ -7095,11 +8887,13 @@
           <w:sz w:val="17"/>
           <w:szCs w:val="17"/>
         </w:rPr>
-        <w:t xml:space="preserve">Router.AddRoute('accounting', 'Journal entries, chart of accounts, financial statements, IFRS');</w:t>
-      </w:r>
-    </w:p>
-    <w:p>
-      <w:pPr>
+        <w:t xml:space="preserve">Router := TAiJevRouterTool.Create(Graph);</w:t>
+      </w:r>
+    </w:p>
+    <w:p>
+      <w:pPr>
+        <w:keepNext/>
+        <w:keepLines/>
         <w:pBdr>
           <w:left w:val="single" w:color="2E75B6" w:sz="12" w:space="6"/>
         </w:pBdr>
@@ -7113,11 +8907,13 @@
           <w:sz w:val="17"/>
           <w:szCs w:val="17"/>
         </w:rPr>
-        <w:t xml:space="preserve">Router.AddRoute('tax',        'Income tax, VAT, withholding, tax filings');</w:t>
-      </w:r>
-    </w:p>
-    <w:p>
-      <w:pPr>
+        <w:t xml:space="preserve">Router.AddRoute('accounting', 'Journal entries, chart of accounts, financial statements, IFRS');</w:t>
+      </w:r>
+    </w:p>
+    <w:p>
+      <w:pPr>
+        <w:keepNext/>
+        <w:keepLines/>
         <w:pBdr>
           <w:left w:val="single" w:color="2E75B6" w:sz="12" w:space="6"/>
         </w:pBdr>
@@ -7131,11 +8927,13 @@
           <w:sz w:val="17"/>
           <w:szCs w:val="17"/>
         </w:rPr>
-        <w:t xml:space="preserve">Router.AddRoute('general',    '');</w:t>
-      </w:r>
-    </w:p>
-    <w:p>
-      <w:pPr>
+        <w:t xml:space="preserve">Router.AddRoute('tax',        'Income tax, VAT, withholding, tax filings');</w:t>
+      </w:r>
+    </w:p>
+    <w:p>
+      <w:pPr>
+        <w:keepNext/>
+        <w:keepLines/>
         <w:pBdr>
           <w:left w:val="single" w:color="2E75B6" w:sz="12" w:space="6"/>
         </w:pBdr>
@@ -7149,11 +8947,13 @@
           <w:sz w:val="17"/>
           <w:szCs w:val="17"/>
         </w:rPr>
-        <w:t xml:space="preserve">Router.AddFlag('sources', 'Does answering `query` require citing a specific regulation?');</w:t>
-      </w:r>
-    </w:p>
-    <w:p>
-      <w:pPr>
+        <w:t xml:space="preserve">Router.AddRoute('general',    '');</w:t>
+      </w:r>
+    </w:p>
+    <w:p>
+      <w:pPr>
+        <w:keepNext/>
+        <w:keepLines/>
         <w:pBdr>
           <w:left w:val="single" w:color="2E75B6" w:sz="12" w:space="6"/>
         </w:pBdr>
@@ -7167,11 +8967,13 @@
           <w:sz w:val="17"/>
           <w:szCs w:val="17"/>
         </w:rPr>
-        <w:t xml:space="preserve">Router.InputField := 'query';</w:t>
-      </w:r>
-    </w:p>
-    <w:p>
-      <w:pPr>
+        <w:t xml:space="preserve">Router.AddFlag('sources', 'Does answering `query` require citing a specific regulation?');</w:t>
+      </w:r>
+    </w:p>
+    <w:p>
+      <w:pPr>
+        <w:keepNext/>
+        <w:keepLines/>
         <w:pBdr>
           <w:left w:val="single" w:color="2E75B6" w:sz="12" w:space="6"/>
         </w:pBdr>
@@ -7185,11 +8987,13 @@
           <w:sz w:val="17"/>
           <w:szCs w:val="17"/>
         </w:rPr>
-        <w:t xml:space="preserve">Router.Instructions := 'Which specialist should answer `query`?';</w:t>
-      </w:r>
-    </w:p>
-    <w:p>
-      <w:pPr>
+        <w:t xml:space="preserve">Router.InputField := 'query';</w:t>
+      </w:r>
+    </w:p>
+    <w:p>
+      <w:pPr>
+        <w:keepNext/>
+        <w:keepLines/>
         <w:pBdr>
           <w:left w:val="single" w:color="2E75B6" w:sz="12" w:space="6"/>
         </w:pBdr>
@@ -7203,11 +9007,13 @@
           <w:sz w:val="17"/>
           <w:szCs w:val="17"/>
         </w:rPr>
-        <w:t xml:space="preserve">Graph.FindNode('Reception').Tool := Router;</w:t>
-      </w:r>
-    </w:p>
-    <w:p>
-      <w:pPr>
+        <w:t xml:space="preserve">Router.Instructions := 'Which specialist should answer `query`?';</w:t>
+      </w:r>
+    </w:p>
+    <w:p>
+      <w:pPr>
+        <w:keepNext/>
+        <w:keepLines/>
         <w:pBdr>
           <w:left w:val="single" w:color="2E75B6" w:sz="12" w:space="6"/>
         </w:pBdr>
@@ -7221,11 +9027,13 @@
           <w:sz w:val="17"/>
           <w:szCs w:val="17"/>
         </w:rPr>
-        <w:t xml:space="preserve"> </w:t>
-      </w:r>
-    </w:p>
-    <w:p>
-      <w:pPr>
+        <w:t xml:space="preserve">Graph.FindNode('Reception').Tool := Router;</w:t>
+      </w:r>
+    </w:p>
+    <w:p>
+      <w:pPr>
+        <w:keepNext/>
+        <w:keepLines/>
         <w:pBdr>
           <w:left w:val="single" w:color="2E75B6" w:sz="12" w:space="6"/>
         </w:pBdr>
@@ -7239,11 +9047,13 @@
           <w:sz w:val="17"/>
           <w:szCs w:val="17"/>
         </w:rPr>
-        <w:t xml:space="preserve">Targets := TDictionary&lt;string, string&gt;.Create;   // route key -&gt; node</w:t>
-      </w:r>
-    </w:p>
-    <w:p>
-      <w:pPr>
+        <w:t xml:space="preserve"> </w:t>
+      </w:r>
+    </w:p>
+    <w:p>
+      <w:pPr>
+        <w:keepNext/>
+        <w:keepLines/>
         <w:pBdr>
           <w:left w:val="single" w:color="2E75B6" w:sz="12" w:space="6"/>
         </w:pBdr>
@@ -7257,11 +9067,13 @@
           <w:sz w:val="17"/>
           <w:szCs w:val="17"/>
         </w:rPr>
-        <w:t xml:space="preserve">Targets.Add('accounting', 'accounting');</w:t>
-      </w:r>
-    </w:p>
-    <w:p>
-      <w:pPr>
+        <w:t xml:space="preserve">Targets := TDictionary&lt;string, string&gt;.Create;   // route key -&gt; node</w:t>
+      </w:r>
+    </w:p>
+    <w:p>
+      <w:pPr>
+        <w:keepNext/>
+        <w:keepLines/>
         <w:pBdr>
           <w:left w:val="single" w:color="2E75B6" w:sz="12" w:space="6"/>
         </w:pBdr>
@@ -7275,11 +9087,13 @@
           <w:sz w:val="17"/>
           <w:szCs w:val="17"/>
         </w:rPr>
-        <w:t xml:space="preserve">Targets.Add('tax', 'tax');</w:t>
-      </w:r>
-    </w:p>
-    <w:p>
-      <w:pPr>
+        <w:t xml:space="preserve">Targets.Add('accounting', 'accounting');</w:t>
+      </w:r>
+    </w:p>
+    <w:p>
+      <w:pPr>
+        <w:keepNext/>
+        <w:keepLines/>
         <w:pBdr>
           <w:left w:val="single" w:color="2E75B6" w:sz="12" w:space="6"/>
         </w:pBdr>
@@ -7293,11 +9107,13 @@
           <w:sz w:val="17"/>
           <w:szCs w:val="17"/>
         </w:rPr>
-        <w:t xml:space="preserve">Graph.AddConditionalEdge('Reception', 'Router', Targets);</w:t>
-      </w:r>
-    </w:p>
-    <w:p>
-      <w:pPr>
+        <w:t xml:space="preserve">Targets.Add('tax', 'tax');</w:t>
+      </w:r>
+    </w:p>
+    <w:p>
+      <w:pPr>
+        <w:keepNext/>
+        <w:keepLines/>
         <w:pBdr>
           <w:left w:val="single" w:color="2E75B6" w:sz="12" w:space="6"/>
         </w:pBdr>
@@ -7311,11 +9127,33 @@
           <w:sz w:val="17"/>
           <w:szCs w:val="17"/>
         </w:rPr>
+        <w:t xml:space="preserve">Graph.AddConditionalEdge('Reception', 'Router', Targets);</w:t>
+      </w:r>
+    </w:p>
+    <w:p>
+      <w:pPr>
+        <w:keepNext/>
+        <w:keepLines/>
+        <w:pBdr>
+          <w:left w:val="single" w:color="2E75B6" w:sz="12" w:space="6"/>
+        </w:pBdr>
+        <w:shd w:fill="F3F5F8" w:color="auto" w:val="clear"/>
+        <w:spacing w:after="0" w:before="0" w:line="260"/>
+        <w:ind w:left="120"/>
+      </w:pPr>
+      <w:r>
+        <w:rPr>
+          <w:rFonts w:ascii="Consolas" w:cs="Consolas" w:eastAsia="Consolas" w:hAnsi="Consolas"/>
+          <w:sz w:val="17"/>
+          <w:szCs w:val="17"/>
+        </w:rPr>
         <w:t xml:space="preserve">Targets.Free;</w:t>
       </w:r>
     </w:p>
     <w:p>
       <w:pPr>
+        <w:keepNext w:val="false"/>
+        <w:keepLines/>
         <w:pBdr>
           <w:left w:val="single" w:color="2E75B6" w:sz="12" w:space="6"/>
         </w:pBdr>
@@ -9108,6 +10946,8 @@
     </w:p>
     <w:p>
       <w:pPr>
+        <w:keepNext/>
+        <w:keepLines/>
         <w:pBdr>
           <w:left w:val="single" w:color="2E75B6" w:sz="12" w:space="6"/>
         </w:pBdr>
@@ -9126,6 +10966,8 @@
     </w:p>
     <w:p>
       <w:pPr>
+        <w:keepNext/>
+        <w:keepLines/>
         <w:pBdr>
           <w:left w:val="single" w:color="2E75B6" w:sz="12" w:space="6"/>
         </w:pBdr>
@@ -9144,6 +10986,8 @@
     </w:p>
     <w:p>
       <w:pPr>
+        <w:keepNext/>
+        <w:keepLines/>
         <w:pBdr>
           <w:left w:val="single" w:color="2E75B6" w:sz="12" w:space="6"/>
         </w:pBdr>
@@ -9162,6 +11006,8 @@
     </w:p>
     <w:p>
       <w:pPr>
+        <w:keepNext/>
+        <w:keepLines/>
         <w:pBdr>
           <w:left w:val="single" w:color="2E75B6" w:sz="12" w:space="6"/>
         </w:pBdr>
@@ -9180,6 +11026,8 @@
     </w:p>
     <w:p>
       <w:pPr>
+        <w:keepNext/>
+        <w:keepLines/>
         <w:pBdr>
           <w:left w:val="single" w:color="2E75B6" w:sz="12" w:space="6"/>
         </w:pBdr>
@@ -9198,6 +11046,8 @@
     </w:p>
     <w:p>
       <w:pPr>
+        <w:keepNext/>
+        <w:keepLines/>
         <w:pBdr>
           <w:left w:val="single" w:color="2E75B6" w:sz="12" w:space="6"/>
         </w:pBdr>
@@ -9216,6 +11066,8 @@
     </w:p>
     <w:p>
       <w:pPr>
+        <w:keepNext/>
+        <w:keepLines/>
         <w:pBdr>
           <w:left w:val="single" w:color="2E75B6" w:sz="12" w:space="6"/>
         </w:pBdr>
@@ -9234,6 +11086,8 @@
     </w:p>
     <w:p>
       <w:pPr>
+        <w:keepNext/>
+        <w:keepLines/>
         <w:pBdr>
           <w:left w:val="single" w:color="2E75B6" w:sz="12" w:space="6"/>
         </w:pBdr>
@@ -9252,6 +11106,8 @@
     </w:p>
     <w:p>
       <w:pPr>
+        <w:keepNext w:val="false"/>
+        <w:keepLines/>
         <w:pBdr>
           <w:left w:val="single" w:color="2E75B6" w:sz="12" w:space="6"/>
         </w:pBdr>
@@ -9408,6 +11264,8 @@
     </w:p>
     <w:p>
       <w:pPr>
+        <w:keepNext/>
+        <w:keepLines/>
         <w:pBdr>
           <w:left w:val="single" w:color="2E75B6" w:sz="12" w:space="6"/>
         </w:pBdr>
@@ -9426,6 +11284,8 @@
     </w:p>
     <w:p>
       <w:pPr>
+        <w:keepNext/>
+        <w:keepLines/>
         <w:pBdr>
           <w:left w:val="single" w:color="2E75B6" w:sz="12" w:space="6"/>
         </w:pBdr>
@@ -9444,6 +11304,8 @@
     </w:p>
     <w:p>
       <w:pPr>
+        <w:keepNext/>
+        <w:keepLines/>
         <w:pBdr>
           <w:left w:val="single" w:color="2E75B6" w:sz="12" w:space="6"/>
         </w:pBdr>
@@ -9462,6 +11324,8 @@
     </w:p>
     <w:p>
       <w:pPr>
+        <w:keepNext/>
+        <w:keepLines/>
         <w:pBdr>
           <w:left w:val="single" w:color="2E75B6" w:sz="12" w:space="6"/>
         </w:pBdr>
@@ -9480,6 +11344,8 @@
     </w:p>
     <w:p>
       <w:pPr>
+        <w:keepNext/>
+        <w:keepLines/>
         <w:pBdr>
           <w:left w:val="single" w:color="2E75B6" w:sz="12" w:space="6"/>
         </w:pBdr>
@@ -9498,6 +11364,8 @@
     </w:p>
     <w:p>
       <w:pPr>
+        <w:keepNext/>
+        <w:keepLines/>
         <w:pBdr>
           <w:left w:val="single" w:color="2E75B6" w:sz="12" w:space="6"/>
         </w:pBdr>
@@ -9516,6 +11384,8 @@
     </w:p>
     <w:p>
       <w:pPr>
+        <w:keepNext/>
+        <w:keepLines/>
         <w:pBdr>
           <w:left w:val="single" w:color="2E75B6" w:sz="12" w:space="6"/>
         </w:pBdr>
@@ -9534,6 +11404,8 @@
     </w:p>
     <w:p>
       <w:pPr>
+        <w:keepNext/>
+        <w:keepLines/>
         <w:pBdr>
           <w:left w:val="single" w:color="2E75B6" w:sz="12" w:space="6"/>
         </w:pBdr>
@@ -9552,6 +11424,8 @@
     </w:p>
     <w:p>
       <w:pPr>
+        <w:keepNext/>
+        <w:keepLines/>
         <w:pBdr>
           <w:left w:val="single" w:color="2E75B6" w:sz="12" w:space="6"/>
         </w:pBdr>
@@ -9570,6 +11444,8 @@
     </w:p>
     <w:p>
       <w:pPr>
+        <w:keepNext w:val="false"/>
+        <w:keepLines/>
         <w:pBdr>
           <w:left w:val="single" w:color="2E75B6" w:sz="12" w:space="6"/>
         </w:pBdr>
@@ -9750,6 +11626,8 @@
     </w:p>
     <w:p>
       <w:pPr>
+        <w:keepNext/>
+        <w:keepLines/>
         <w:pBdr>
           <w:left w:val="single" w:color="2E75B6" w:sz="12" w:space="6"/>
         </w:pBdr>
@@ -9768,6 +11646,8 @@
     </w:p>
     <w:p>
       <w:pPr>
+        <w:keepNext/>
+        <w:keepLines/>
         <w:pBdr>
           <w:left w:val="single" w:color="2E75B6" w:sz="12" w:space="6"/>
         </w:pBdr>
@@ -9786,6 +11666,8 @@
     </w:p>
     <w:p>
       <w:pPr>
+        <w:keepNext/>
+        <w:keepLines/>
         <w:pBdr>
           <w:left w:val="single" w:color="2E75B6" w:sz="12" w:space="6"/>
         </w:pBdr>
@@ -9804,6 +11686,8 @@
     </w:p>
     <w:p>
       <w:pPr>
+        <w:keepNext/>
+        <w:keepLines/>
         <w:pBdr>
           <w:left w:val="single" w:color="2E75B6" w:sz="12" w:space="6"/>
         </w:pBdr>
@@ -9822,6 +11706,8 @@
     </w:p>
     <w:p>
       <w:pPr>
+        <w:keepNext/>
+        <w:keepLines/>
         <w:pBdr>
           <w:left w:val="single" w:color="2E75B6" w:sz="12" w:space="6"/>
         </w:pBdr>
@@ -9840,6 +11726,8 @@
     </w:p>
     <w:p>
       <w:pPr>
+        <w:keepNext w:val="false"/>
+        <w:keepLines/>
         <w:pBdr>
           <w:left w:val="single" w:color="2E75B6" w:sz="12" w:space="6"/>
         </w:pBdr>
@@ -11230,6 +13118,8 @@
     </w:p>
     <w:p>
       <w:pPr>
+        <w:keepNext/>
+        <w:keepLines/>
         <w:pBdr>
           <w:left w:val="single" w:color="2E75B6" w:sz="12" w:space="6"/>
         </w:pBdr>
@@ -11248,6 +13138,8 @@
     </w:p>
     <w:p>
       <w:pPr>
+        <w:keepNext/>
+        <w:keepLines/>
         <w:pBdr>
           <w:left w:val="single" w:color="2E75B6" w:sz="12" w:space="6"/>
         </w:pBdr>
@@ -11266,6 +13158,8 @@
     </w:p>
     <w:p>
       <w:pPr>
+        <w:keepNext/>
+        <w:keepLines/>
         <w:pBdr>
           <w:left w:val="single" w:color="2E75B6" w:sz="12" w:space="6"/>
         </w:pBdr>
@@ -11284,6 +13178,8 @@
     </w:p>
     <w:p>
       <w:pPr>
+        <w:keepNext/>
+        <w:keepLines/>
         <w:pBdr>
           <w:left w:val="single" w:color="2E75B6" w:sz="12" w:space="6"/>
         </w:pBdr>
@@ -11302,6 +13198,8 @@
     </w:p>
     <w:p>
       <w:pPr>
+        <w:keepNext/>
+        <w:keepLines/>
         <w:pBdr>
           <w:left w:val="single" w:color="2E75B6" w:sz="12" w:space="6"/>
         </w:pBdr>
@@ -11320,6 +13218,8 @@
     </w:p>
     <w:p>
       <w:pPr>
+        <w:keepNext w:val="false"/>
+        <w:keepLines/>
         <w:pBdr>
           <w:left w:val="single" w:color="2E75B6" w:sz="12" w:space="6"/>
         </w:pBdr>
@@ -11887,6 +13787,8 @@
     </w:p>
     <w:p>
       <w:pPr>
+        <w:keepNext/>
+        <w:keepLines/>
         <w:pBdr>
           <w:left w:val="single" w:color="2E75B6" w:sz="12" w:space="6"/>
         </w:pBdr>
@@ -11905,6 +13807,8 @@
     </w:p>
     <w:p>
       <w:pPr>
+        <w:keepNext w:val="false"/>
+        <w:keepLines/>
         <w:pBdr>
           <w:left w:val="single" w:color="2E75B6" w:sz="12" w:space="6"/>
         </w:pBdr>
@@ -12030,6 +13934,8 @@
     </w:p>
     <w:p>
       <w:pPr>
+        <w:keepNext/>
+        <w:keepLines/>
         <w:pBdr>
           <w:left w:val="single" w:color="2E75B6" w:sz="12" w:space="6"/>
         </w:pBdr>
@@ -12048,6 +13954,8 @@
     </w:p>
     <w:p>
       <w:pPr>
+        <w:keepNext/>
+        <w:keepLines/>
         <w:pBdr>
           <w:left w:val="single" w:color="2E75B6" w:sz="12" w:space="6"/>
         </w:pBdr>
@@ -12066,6 +13974,8 @@
     </w:p>
     <w:p>
       <w:pPr>
+        <w:keepNext/>
+        <w:keepLines/>
         <w:pBdr>
           <w:left w:val="single" w:color="2E75B6" w:sz="12" w:space="6"/>
         </w:pBdr>
@@ -12084,6 +13994,8 @@
     </w:p>
     <w:p>
       <w:pPr>
+        <w:keepNext/>
+        <w:keepLines/>
         <w:pBdr>
           <w:left w:val="single" w:color="2E75B6" w:sz="12" w:space="6"/>
         </w:pBdr>
@@ -12102,6 +14014,8 @@
     </w:p>
     <w:p>
       <w:pPr>
+        <w:keepNext/>
+        <w:keepLines/>
         <w:pBdr>
           <w:left w:val="single" w:color="2E75B6" w:sz="12" w:space="6"/>
         </w:pBdr>
@@ -12120,6 +14034,8 @@
     </w:p>
     <w:p>
       <w:pPr>
+        <w:keepNext/>
+        <w:keepLines/>
         <w:pBdr>
           <w:left w:val="single" w:color="2E75B6" w:sz="12" w:space="6"/>
         </w:pBdr>
@@ -12138,6 +14054,8 @@
     </w:p>
     <w:p>
       <w:pPr>
+        <w:keepNext/>
+        <w:keepLines/>
         <w:pBdr>
           <w:left w:val="single" w:color="2E75B6" w:sz="12" w:space="6"/>
         </w:pBdr>
@@ -12156,6 +14074,8 @@
     </w:p>
     <w:p>
       <w:pPr>
+        <w:keepNext w:val="false"/>
+        <w:keepLines/>
         <w:pBdr>
           <w:left w:val="single" w:color="2E75B6" w:sz="12" w:space="6"/>
         </w:pBdr>
@@ -12424,6 +14344,8 @@
     </w:p>
     <w:p>
       <w:pPr>
+        <w:keepNext/>
+        <w:keepLines/>
         <w:pBdr>
           <w:left w:val="single" w:color="2E75B6" w:sz="12" w:space="6"/>
         </w:pBdr>
@@ -12442,6 +14364,8 @@
     </w:p>
     <w:p>
       <w:pPr>
+        <w:keepNext/>
+        <w:keepLines/>
         <w:pBdr>
           <w:left w:val="single" w:color="2E75B6" w:sz="12" w:space="6"/>
         </w:pBdr>
@@ -12460,6 +14384,8 @@
     </w:p>
     <w:p>
       <w:pPr>
+        <w:keepNext/>
+        <w:keepLines/>
         <w:pBdr>
           <w:left w:val="single" w:color="2E75B6" w:sz="12" w:space="6"/>
         </w:pBdr>
@@ -12478,6 +14404,8 @@
     </w:p>
     <w:p>
       <w:pPr>
+        <w:keepNext/>
+        <w:keepLines/>
         <w:pBdr>
           <w:left w:val="single" w:color="2E75B6" w:sz="12" w:space="6"/>
         </w:pBdr>
@@ -12496,6 +14424,8 @@
     </w:p>
     <w:p>
       <w:pPr>
+        <w:keepNext/>
+        <w:keepLines/>
         <w:pBdr>
           <w:left w:val="single" w:color="2E75B6" w:sz="12" w:space="6"/>
         </w:pBdr>
@@ -12514,6 +14444,8 @@
     </w:p>
     <w:p>
       <w:pPr>
+        <w:keepNext/>
+        <w:keepLines/>
         <w:pBdr>
           <w:left w:val="single" w:color="2E75B6" w:sz="12" w:space="6"/>
         </w:pBdr>
@@ -12532,6 +14464,8 @@
     </w:p>
     <w:p>
       <w:pPr>
+        <w:keepNext w:val="false"/>
+        <w:keepLines/>
         <w:pBdr>
           <w:left w:val="single" w:color="2E75B6" w:sz="12" w:space="6"/>
         </w:pBdr>
@@ -13292,6 +15226,8 @@
     </w:p>
     <w:p>
       <w:pPr>
+        <w:keepNext/>
+        <w:keepLines/>
         <w:pBdr>
           <w:left w:val="single" w:color="2E75B6" w:sz="12" w:space="6"/>
         </w:pBdr>
@@ -13310,6 +15246,8 @@
     </w:p>
     <w:p>
       <w:pPr>
+        <w:keepNext/>
+        <w:keepLines/>
         <w:pBdr>
           <w:left w:val="single" w:color="2E75B6" w:sz="12" w:space="6"/>
         </w:pBdr>
@@ -13328,6 +15266,8 @@
     </w:p>
     <w:p>
       <w:pPr>
+        <w:keepNext/>
+        <w:keepLines/>
         <w:pBdr>
           <w:left w:val="single" w:color="2E75B6" w:sz="12" w:space="6"/>
         </w:pBdr>
@@ -13346,6 +15286,8 @@
     </w:p>
     <w:p>
       <w:pPr>
+        <w:keepNext/>
+        <w:keepLines/>
         <w:pBdr>
           <w:left w:val="single" w:color="2E75B6" w:sz="12" w:space="6"/>
         </w:pBdr>
@@ -13364,6 +15306,8 @@
     </w:p>
     <w:p>
       <w:pPr>
+        <w:keepNext/>
+        <w:keepLines/>
         <w:pBdr>
           <w:left w:val="single" w:color="2E75B6" w:sz="12" w:space="6"/>
         </w:pBdr>
@@ -13382,6 +15326,8 @@
     </w:p>
     <w:p>
       <w:pPr>
+        <w:keepNext/>
+        <w:keepLines/>
         <w:pBdr>
           <w:left w:val="single" w:color="2E75B6" w:sz="12" w:space="6"/>
         </w:pBdr>
@@ -13400,6 +15346,8 @@
     </w:p>
     <w:p>
       <w:pPr>
+        <w:keepNext/>
+        <w:keepLines/>
         <w:pBdr>
           <w:left w:val="single" w:color="2E75B6" w:sz="12" w:space="6"/>
         </w:pBdr>
@@ -13418,6 +15366,8 @@
     </w:p>
     <w:p>
       <w:pPr>
+        <w:keepNext/>
+        <w:keepLines/>
         <w:pBdr>
           <w:left w:val="single" w:color="2E75B6" w:sz="12" w:space="6"/>
         </w:pBdr>
@@ -13436,6 +15386,8 @@
     </w:p>
     <w:p>
       <w:pPr>
+        <w:keepNext/>
+        <w:keepLines/>
         <w:pBdr>
           <w:left w:val="single" w:color="2E75B6" w:sz="12" w:space="6"/>
         </w:pBdr>
@@ -13454,6 +15406,8 @@
     </w:p>
     <w:p>
       <w:pPr>
+        <w:keepNext w:val="false"/>
+        <w:keepLines/>
         <w:pBdr>
           <w:left w:val="single" w:color="2E75B6" w:sz="12" w:space="6"/>
         </w:pBdr>
@@ -13637,6 +15591,8 @@
     </w:p>
     <w:p>
       <w:pPr>
+        <w:keepNext/>
+        <w:keepLines/>
         <w:pBdr>
           <w:left w:val="single" w:color="2E75B6" w:sz="12" w:space="6"/>
         </w:pBdr>
@@ -13655,6 +15611,8 @@
     </w:p>
     <w:p>
       <w:pPr>
+        <w:keepNext/>
+        <w:keepLines/>
         <w:pBdr>
           <w:left w:val="single" w:color="2E75B6" w:sz="12" w:space="6"/>
         </w:pBdr>
@@ -13673,6 +15631,8 @@
     </w:p>
     <w:p>
       <w:pPr>
+        <w:keepNext/>
+        <w:keepLines/>
         <w:pBdr>
           <w:left w:val="single" w:color="2E75B6" w:sz="12" w:space="6"/>
         </w:pBdr>
@@ -13691,6 +15651,8 @@
     </w:p>
     <w:p>
       <w:pPr>
+        <w:keepNext/>
+        <w:keepLines/>
         <w:pBdr>
           <w:left w:val="single" w:color="2E75B6" w:sz="12" w:space="6"/>
         </w:pBdr>
@@ -13709,6 +15671,8 @@
     </w:p>
     <w:p>
       <w:pPr>
+        <w:keepNext/>
+        <w:keepLines/>
         <w:pBdr>
           <w:left w:val="single" w:color="2E75B6" w:sz="12" w:space="6"/>
         </w:pBdr>
@@ -13727,6 +15691,8 @@
     </w:p>
     <w:p>
       <w:pPr>
+        <w:keepNext/>
+        <w:keepLines/>
         <w:pBdr>
           <w:left w:val="single" w:color="2E75B6" w:sz="12" w:space="6"/>
         </w:pBdr>
@@ -13745,6 +15711,8 @@
     </w:p>
     <w:p>
       <w:pPr>
+        <w:keepNext/>
+        <w:keepLines/>
         <w:pBdr>
           <w:left w:val="single" w:color="2E75B6" w:sz="12" w:space="6"/>
         </w:pBdr>
@@ -13763,6 +15731,8 @@
     </w:p>
     <w:p>
       <w:pPr>
+        <w:keepNext/>
+        <w:keepLines/>
         <w:pBdr>
           <w:left w:val="single" w:color="2E75B6" w:sz="12" w:space="6"/>
         </w:pBdr>
@@ -13781,6 +15751,8 @@
     </w:p>
     <w:p>
       <w:pPr>
+        <w:keepNext/>
+        <w:keepLines/>
         <w:pBdr>
           <w:left w:val="single" w:color="2E75B6" w:sz="12" w:space="6"/>
         </w:pBdr>
@@ -13799,6 +15771,8 @@
     </w:p>
     <w:p>
       <w:pPr>
+        <w:keepNext w:val="false"/>
+        <w:keepLines/>
         <w:pBdr>
           <w:left w:val="single" w:color="2E75B6" w:sz="12" w:space="6"/>
         </w:pBdr>
@@ -14564,6 +16538,8 @@
     </w:p>
     <w:p>
       <w:pPr>
+        <w:keepNext/>
+        <w:keepLines/>
         <w:pBdr>
           <w:left w:val="single" w:color="2E75B6" w:sz="12" w:space="6"/>
         </w:pBdr>
@@ -14582,6 +16558,8 @@
     </w:p>
     <w:p>
       <w:pPr>
+        <w:keepNext/>
+        <w:keepLines/>
         <w:pBdr>
           <w:left w:val="single" w:color="2E75B6" w:sz="12" w:space="6"/>
         </w:pBdr>
@@ -14600,6 +16578,8 @@
     </w:p>
     <w:p>
       <w:pPr>
+        <w:keepNext/>
+        <w:keepLines/>
         <w:pBdr>
           <w:left w:val="single" w:color="2E75B6" w:sz="12" w:space="6"/>
         </w:pBdr>
@@ -14618,6 +16598,8 @@
     </w:p>
     <w:p>
       <w:pPr>
+        <w:keepNext/>
+        <w:keepLines/>
         <w:pBdr>
           <w:left w:val="single" w:color="2E75B6" w:sz="12" w:space="6"/>
         </w:pBdr>
@@ -14636,6 +16618,8 @@
     </w:p>
     <w:p>
       <w:pPr>
+        <w:keepNext/>
+        <w:keepLines/>
         <w:pBdr>
           <w:left w:val="single" w:color="2E75B6" w:sz="12" w:space="6"/>
         </w:pBdr>
@@ -14654,6 +16638,8 @@
     </w:p>
     <w:p>
       <w:pPr>
+        <w:keepNext/>
+        <w:keepLines/>
         <w:pBdr>
           <w:left w:val="single" w:color="2E75B6" w:sz="12" w:space="6"/>
         </w:pBdr>
@@ -14672,6 +16658,8 @@
     </w:p>
     <w:p>
       <w:pPr>
+        <w:keepNext/>
+        <w:keepLines/>
         <w:pBdr>
           <w:left w:val="single" w:color="2E75B6" w:sz="12" w:space="6"/>
         </w:pBdr>
@@ -14690,6 +16678,8 @@
     </w:p>
     <w:p>
       <w:pPr>
+        <w:keepNext/>
+        <w:keepLines/>
         <w:pBdr>
           <w:left w:val="single" w:color="2E75B6" w:sz="12" w:space="6"/>
         </w:pBdr>
@@ -14708,6 +16698,8 @@
     </w:p>
     <w:p>
       <w:pPr>
+        <w:keepNext/>
+        <w:keepLines/>
         <w:pBdr>
           <w:left w:val="single" w:color="2E75B6" w:sz="12" w:space="6"/>
         </w:pBdr>
@@ -14726,6 +16718,8 @@
     </w:p>
     <w:p>
       <w:pPr>
+        <w:keepNext/>
+        <w:keepLines/>
         <w:pBdr>
           <w:left w:val="single" w:color="2E75B6" w:sz="12" w:space="6"/>
         </w:pBdr>
@@ -14744,6 +16738,8 @@
     </w:p>
     <w:p>
       <w:pPr>
+        <w:keepNext/>
+        <w:keepLines/>
         <w:pBdr>
           <w:left w:val="single" w:color="2E75B6" w:sz="12" w:space="6"/>
         </w:pBdr>
@@ -14762,6 +16758,8 @@
     </w:p>
     <w:p>
       <w:pPr>
+        <w:keepNext/>
+        <w:keepLines/>
         <w:pBdr>
           <w:left w:val="single" w:color="2E75B6" w:sz="12" w:space="6"/>
         </w:pBdr>
@@ -14780,6 +16778,8 @@
     </w:p>
     <w:p>
       <w:pPr>
+        <w:keepNext/>
+        <w:keepLines/>
         <w:pBdr>
           <w:left w:val="single" w:color="2E75B6" w:sz="12" w:space="6"/>
         </w:pBdr>
@@ -14798,6 +16798,8 @@
     </w:p>
     <w:p>
       <w:pPr>
+        <w:keepNext/>
+        <w:keepLines/>
         <w:pBdr>
           <w:left w:val="single" w:color="2E75B6" w:sz="12" w:space="6"/>
         </w:pBdr>
@@ -14816,6 +16818,8 @@
     </w:p>
     <w:p>
       <w:pPr>
+        <w:keepNext/>
+        <w:keepLines/>
         <w:pBdr>
           <w:left w:val="single" w:color="2E75B6" w:sz="12" w:space="6"/>
         </w:pBdr>
@@ -14834,6 +16838,8 @@
     </w:p>
     <w:p>
       <w:pPr>
+        <w:keepNext/>
+        <w:keepLines/>
         <w:pBdr>
           <w:left w:val="single" w:color="2E75B6" w:sz="12" w:space="6"/>
         </w:pBdr>
@@ -14852,6 +16858,8 @@
     </w:p>
     <w:p>
       <w:pPr>
+        <w:keepNext w:val="false"/>
+        <w:keepLines/>
         <w:pBdr>
           <w:left w:val="single" w:color="2E75B6" w:sz="12" w:space="6"/>
         </w:pBdr>
@@ -15360,6 +17368,8 @@
     </w:p>
     <w:p>
       <w:pPr>
+        <w:keepNext/>
+        <w:keepLines/>
         <w:pBdr>
           <w:left w:val="single" w:color="2E75B6" w:sz="12" w:space="6"/>
         </w:pBdr>
@@ -15378,6 +17388,8 @@
     </w:p>
     <w:p>
       <w:pPr>
+        <w:keepNext/>
+        <w:keepLines/>
         <w:pBdr>
           <w:left w:val="single" w:color="2E75B6" w:sz="12" w:space="6"/>
         </w:pBdr>
@@ -15396,6 +17408,8 @@
     </w:p>
     <w:p>
       <w:pPr>
+        <w:keepNext/>
+        <w:keepLines/>
         <w:pBdr>
           <w:left w:val="single" w:color="2E75B6" w:sz="12" w:space="6"/>
         </w:pBdr>
@@ -15414,6 +17428,8 @@
     </w:p>
     <w:p>
       <w:pPr>
+        <w:keepNext/>
+        <w:keepLines/>
         <w:pBdr>
           <w:left w:val="single" w:color="2E75B6" w:sz="12" w:space="6"/>
         </w:pBdr>
@@ -15432,6 +17448,8 @@
     </w:p>
     <w:p>
       <w:pPr>
+        <w:keepNext/>
+        <w:keepLines/>
         <w:pBdr>
           <w:left w:val="single" w:color="2E75B6" w:sz="12" w:space="6"/>
         </w:pBdr>
@@ -15450,6 +17468,8 @@
     </w:p>
     <w:p>
       <w:pPr>
+        <w:keepNext/>
+        <w:keepLines/>
         <w:pBdr>
           <w:left w:val="single" w:color="2E75B6" w:sz="12" w:space="6"/>
         </w:pBdr>
@@ -15468,6 +17488,8 @@
     </w:p>
     <w:p>
       <w:pPr>
+        <w:keepNext/>
+        <w:keepLines/>
         <w:pBdr>
           <w:left w:val="single" w:color="2E75B6" w:sz="12" w:space="6"/>
         </w:pBdr>
@@ -15486,6 +17508,8 @@
     </w:p>
     <w:p>
       <w:pPr>
+        <w:keepNext/>
+        <w:keepLines/>
         <w:pBdr>
           <w:left w:val="single" w:color="2E75B6" w:sz="12" w:space="6"/>
         </w:pBdr>
@@ -15504,6 +17528,8 @@
     </w:p>
     <w:p>
       <w:pPr>
+        <w:keepNext/>
+        <w:keepLines/>
         <w:pBdr>
           <w:left w:val="single" w:color="2E75B6" w:sz="12" w:space="6"/>
         </w:pBdr>
@@ -15522,6 +17548,8 @@
     </w:p>
     <w:p>
       <w:pPr>
+        <w:keepNext/>
+        <w:keepLines/>
         <w:pBdr>
           <w:left w:val="single" w:color="2E75B6" w:sz="12" w:space="6"/>
         </w:pBdr>
@@ -15540,6 +17568,8 @@
     </w:p>
     <w:p>
       <w:pPr>
+        <w:keepNext w:val="false"/>
+        <w:keepLines/>
         <w:pBdr>
           <w:left w:val="single" w:color="2E75B6" w:sz="12" w:space="6"/>
         </w:pBdr>
@@ -16141,6 +18171,8 @@
     </w:p>
     <w:p>
       <w:pPr>
+        <w:keepNext/>
+        <w:keepLines/>
         <w:pBdr>
           <w:left w:val="single" w:color="2E75B6" w:sz="12" w:space="6"/>
         </w:pBdr>
@@ -16159,6 +18191,8 @@
     </w:p>
     <w:p>
       <w:pPr>
+        <w:keepNext/>
+        <w:keepLines/>
         <w:pBdr>
           <w:left w:val="single" w:color="2E75B6" w:sz="12" w:space="6"/>
         </w:pBdr>
@@ -16177,6 +18211,8 @@
     </w:p>
     <w:p>
       <w:pPr>
+        <w:keepNext/>
+        <w:keepLines/>
         <w:pBdr>
           <w:left w:val="single" w:color="2E75B6" w:sz="12" w:space="6"/>
         </w:pBdr>
@@ -16195,6 +18231,8 @@
     </w:p>
     <w:p>
       <w:pPr>
+        <w:keepNext/>
+        <w:keepLines/>
         <w:pBdr>
           <w:left w:val="single" w:color="2E75B6" w:sz="12" w:space="6"/>
         </w:pBdr>
@@ -16213,6 +18251,8 @@
     </w:p>
     <w:p>
       <w:pPr>
+        <w:keepNext/>
+        <w:keepLines/>
         <w:pBdr>
           <w:left w:val="single" w:color="2E75B6" w:sz="12" w:space="6"/>
         </w:pBdr>
@@ -16231,6 +18271,8 @@
     </w:p>
     <w:p>
       <w:pPr>
+        <w:keepNext/>
+        <w:keepLines/>
         <w:pBdr>
           <w:left w:val="single" w:color="2E75B6" w:sz="12" w:space="6"/>
         </w:pBdr>
@@ -16249,6 +18291,8 @@
     </w:p>
     <w:p>
       <w:pPr>
+        <w:keepNext/>
+        <w:keepLines/>
         <w:pBdr>
           <w:left w:val="single" w:color="2E75B6" w:sz="12" w:space="6"/>
         </w:pBdr>
@@ -16267,6 +18311,8 @@
     </w:p>
     <w:p>
       <w:pPr>
+        <w:keepNext/>
+        <w:keepLines/>
         <w:pBdr>
           <w:left w:val="single" w:color="2E75B6" w:sz="12" w:space="6"/>
         </w:pBdr>
@@ -16285,6 +18331,8 @@
     </w:p>
     <w:p>
       <w:pPr>
+        <w:keepNext/>
+        <w:keepLines/>
         <w:pBdr>
           <w:left w:val="single" w:color="2E75B6" w:sz="12" w:space="6"/>
         </w:pBdr>
@@ -16303,6 +18351,8 @@
     </w:p>
     <w:p>
       <w:pPr>
+        <w:keepNext/>
+        <w:keepLines/>
         <w:pBdr>
           <w:left w:val="single" w:color="2E75B6" w:sz="12" w:space="6"/>
         </w:pBdr>
@@ -16321,6 +18371,8 @@
     </w:p>
     <w:p>
       <w:pPr>
+        <w:keepNext/>
+        <w:keepLines/>
         <w:pBdr>
           <w:left w:val="single" w:color="2E75B6" w:sz="12" w:space="6"/>
         </w:pBdr>
@@ -16339,6 +18391,8 @@
     </w:p>
     <w:p>
       <w:pPr>
+        <w:keepNext/>
+        <w:keepLines/>
         <w:pBdr>
           <w:left w:val="single" w:color="2E75B6" w:sz="12" w:space="6"/>
         </w:pBdr>
@@ -16357,6 +18411,8 @@
     </w:p>
     <w:p>
       <w:pPr>
+        <w:keepNext/>
+        <w:keepLines/>
         <w:pBdr>
           <w:left w:val="single" w:color="2E75B6" w:sz="12" w:space="6"/>
         </w:pBdr>
@@ -16375,6 +18431,8 @@
     </w:p>
     <w:p>
       <w:pPr>
+        <w:keepNext w:val="false"/>
+        <w:keepLines/>
         <w:pBdr>
           <w:left w:val="single" w:color="2E75B6" w:sz="12" w:space="6"/>
         </w:pBdr>
@@ -16401,6 +18459,8 @@
     </w:p>
     <w:p>
       <w:pPr>
+        <w:keepNext/>
+        <w:keepLines/>
         <w:pBdr>
           <w:left w:val="single" w:color="2E75B6" w:sz="12" w:space="6"/>
         </w:pBdr>
@@ -16419,6 +18479,8 @@
     </w:p>
     <w:p>
       <w:pPr>
+        <w:keepNext/>
+        <w:keepLines/>
         <w:pBdr>
           <w:left w:val="single" w:color="2E75B6" w:sz="12" w:space="6"/>
         </w:pBdr>
@@ -16437,6 +18499,8 @@
     </w:p>
     <w:p>
       <w:pPr>
+        <w:keepNext/>
+        <w:keepLines/>
         <w:pBdr>
           <w:left w:val="single" w:color="2E75B6" w:sz="12" w:space="6"/>
         </w:pBdr>
@@ -16455,6 +18519,8 @@
     </w:p>
     <w:p>
       <w:pPr>
+        <w:keepNext/>
+        <w:keepLines/>
         <w:pBdr>
           <w:left w:val="single" w:color="2E75B6" w:sz="12" w:space="6"/>
         </w:pBdr>
@@ -16473,6 +18539,8 @@
     </w:p>
     <w:p>
       <w:pPr>
+        <w:keepNext/>
+        <w:keepLines/>
         <w:pBdr>
           <w:left w:val="single" w:color="2E75B6" w:sz="12" w:space="6"/>
         </w:pBdr>
@@ -16491,6 +18559,8 @@
     </w:p>
     <w:p>
       <w:pPr>
+        <w:keepNext w:val="false"/>
+        <w:keepLines/>
         <w:pBdr>
           <w:left w:val="single" w:color="2E75B6" w:sz="12" w:space="6"/>
         </w:pBdr>
@@ -17284,7 +19354,7 @@
         <w:t xml:space="preserve">with no network and no API key</w:t>
       </w:r>
       <w:r>
-        <w:t xml:space="preserve">, with 21 new cases (59 in total).</w:t>
+        <w:t xml:space="preserve">, (75 cases in the whole suite as of 28 September 2026).</w:t>
       </w:r>
     </w:p>
     <w:p>
@@ -17333,7 +19403,7 @@
         <w:t xml:space="preserve">uRegression.Fixtures.pas</w:t>
       </w:r>
       <w:r>
-        <w:t xml:space="preserve">) overrides it: it records the body sent and returns queued HTTP responses. All three adapters accept an external </w:t>
+        <w:t xml:space="preserve">) overrides it: it records the body sent and returns queued HTTP responses. All adapters accept an external </w:t>
       </w:r>
       <w:r>
         <w:rPr>
@@ -17362,6 +19432,8 @@
     </w:p>
     <w:p>
       <w:pPr>
+        <w:keepNext/>
+        <w:keepLines/>
         <w:pBdr>
           <w:left w:val="single" w:color="2E75B6" w:sz="12" w:space="6"/>
         </w:pBdr>
@@ -17380,6 +19452,8 @@
     </w:p>
     <w:p>
       <w:pPr>
+        <w:keepNext/>
+        <w:keepLines/>
         <w:pBdr>
           <w:left w:val="single" w:color="2E75B6" w:sz="12" w:space="6"/>
         </w:pBdr>
@@ -17398,6 +19472,8 @@
     </w:p>
     <w:p>
       <w:pPr>
+        <w:keepNext/>
+        <w:keepLines/>
         <w:pBdr>
           <w:left w:val="single" w:color="2E75B6" w:sz="12" w:space="6"/>
         </w:pBdr>
@@ -17416,6 +19492,8 @@
     </w:p>
     <w:p>
       <w:pPr>
+        <w:keepNext w:val="false"/>
+        <w:keepLines/>
         <w:pBdr>
           <w:left w:val="single" w:color="2E75B6" w:sz="12" w:space="6"/>
         </w:pBdr>
@@ -18324,6 +20402,121 @@
                 <w:sz w:val="19"/>
                 <w:szCs w:val="19"/>
               </w:rPr>
+              <w:t xml:space="preserve">jev.usage.adapters</w:t>
+            </w:r>
+          </w:p>
+        </w:tc>
+        <w:tc>
+          <w:tcPr>
+            <w:tcW w:type="dxa" w:w="6360"/>
+            <w:tcBorders>
+              <w:top w:val="single" w:color="BFC9D6" w:sz="4"/>
+              <w:left w:val="single" w:color="BFC9D6" w:sz="4"/>
+              <w:bottom w:val="single" w:color="BFC9D6" w:sz="4"/>
+              <w:right w:val="single" w:color="BFC9D6" w:sz="4"/>
+            </w:tcBorders>
+            <w:shd w:fill="F6F8FB" w:color="auto" w:val="clear"/>
+            <w:tcMar>
+              <w:top w:type="dxa" w:w="60"/>
+              <w:left w:type="dxa" w:w="100"/>
+              <w:bottom w:type="dxa" w:w="60"/>
+              <w:right w:type="dxa" w:w="100"/>
+            </w:tcMar>
+          </w:tcPr>
+          <w:p>
+            <w:r>
+              <w:rPr>
+                <w:rFonts w:ascii="Consolas" w:cs="Consolas" w:eastAsia="Consolas" w:hAnsi="Consolas"/>
+                <w:color w:val="0B4F8A"/>
+                <w:sz w:val="19"/>
+                <w:szCs w:val="19"/>
+              </w:rPr>
+              <w:t xml:space="preserve">Usage</w:t>
+            </w:r>
+            <w:r>
+              <w:rPr>
+                <w:sz w:val="19"/>
+                <w:szCs w:val="19"/>
+              </w:rPr>
+              <w:t xml:space="preserve"> and </w:t>
+            </w:r>
+            <w:r>
+              <w:rPr>
+                <w:rFonts w:ascii="Consolas" w:cs="Consolas" w:eastAsia="Consolas" w:hAnsi="Consolas"/>
+                <w:color w:val="0B4F8A"/>
+                <w:sz w:val="19"/>
+                <w:szCs w:val="19"/>
+              </w:rPr>
+              <w:t xml:space="preserve">OnUsage</w:t>
+            </w:r>
+            <w:r>
+              <w:rPr>
+                <w:sz w:val="19"/>
+                <w:szCs w:val="19"/>
+              </w:rPr>
+              <w:t xml:space="preserve"> in </w:t>
+            </w:r>
+            <w:r>
+              <w:rPr>
+                <w:rFonts w:ascii="Consolas" w:cs="Consolas" w:eastAsia="Consolas" w:hAnsi="Consolas"/>
+                <w:color w:val="0B4F8A"/>
+                <w:sz w:val="19"/>
+                <w:szCs w:val="19"/>
+              </w:rPr>
+              <w:t xml:space="preserve">TAiJev</w:t>
+            </w:r>
+            <w:r>
+              <w:rPr>
+                <w:sz w:val="19"/>
+                <w:szCs w:val="19"/>
+              </w:rPr>
+              <w:t xml:space="preserve"> and the adapters; parallel reranker → a single event with the total, on the caller thread; </w:t>
+            </w:r>
+            <w:r>
+              <w:rPr>
+                <w:rFonts w:ascii="Consolas" w:cs="Consolas" w:eastAsia="Consolas" w:hAnsi="Consolas"/>
+                <w:color w:val="0B4F8A"/>
+                <w:sz w:val="19"/>
+                <w:szCs w:val="19"/>
+              </w:rPr>
+              <w:t xml:space="preserve">ResetUsage</w:t>
+            </w:r>
+            <w:r>
+              <w:rPr>
+                <w:sz w:val="19"/>
+                <w:szCs w:val="19"/>
+              </w:rPr>
+              <w:t xml:space="preserve">; configurable price</w:t>
+            </w:r>
+          </w:p>
+        </w:tc>
+      </w:tr>
+      <w:tr>
+        <w:tc>
+          <w:tcPr>
+            <w:tcW w:type="dxa" w:w="3000"/>
+            <w:tcBorders>
+              <w:top w:val="single" w:color="BFC9D6" w:sz="4"/>
+              <w:left w:val="single" w:color="BFC9D6" w:sz="4"/>
+              <w:bottom w:val="single" w:color="BFC9D6" w:sz="4"/>
+              <w:right w:val="single" w:color="BFC9D6" w:sz="4"/>
+            </w:tcBorders>
+            <w:shd w:fill="FFFFFF" w:color="auto" w:val="clear"/>
+            <w:tcMar>
+              <w:top w:type="dxa" w:w="60"/>
+              <w:left w:type="dxa" w:w="100"/>
+              <w:bottom w:type="dxa" w:w="60"/>
+              <w:right w:type="dxa" w:w="100"/>
+            </w:tcMar>
+          </w:tcPr>
+          <w:p>
+            <w:r>
+              <w:rPr>
+                <w:rFonts w:ascii="Consolas" w:cs="Consolas" w:eastAsia="Consolas" w:hAnsi="Consolas"/>
+                <w:color w:val="0B4F8A"/>
+                <w:sz w:val="19"/>
+                <w:szCs w:val="19"/>
+              </w:rPr>
               <w:t xml:space="preserve">rag.rerank.jev-semantic</w:t>
             </w:r>
             <w:r>
@@ -18353,7 +20546,7 @@
               <w:bottom w:val="single" w:color="BFC9D6" w:sz="4"/>
               <w:right w:val="single" w:color="BFC9D6" w:sz="4"/>
             </w:tcBorders>
-            <w:shd w:fill="F6F8FB" w:color="auto" w:val="clear"/>
+            <w:shd w:fill="FFFFFF" w:color="auto" w:val="clear"/>
             <w:tcMar>
               <w:top w:type="dxa" w:w="60"/>
               <w:left w:type="dxa" w:w="100"/>
@@ -18380,6 +20573,8 @@
     </w:p>
     <w:p>
       <w:pPr>
+        <w:keepNext/>
+        <w:keepLines/>
         <w:pBdr>
           <w:left w:val="single" w:color="2E75B6" w:sz="12" w:space="6"/>
         </w:pBdr>
@@ -18398,6 +20593,8 @@
     </w:p>
     <w:p>
       <w:pPr>
+        <w:keepNext w:val="false"/>
+        <w:keepLines/>
         <w:pBdr>
           <w:left w:val="single" w:color="2E75B6" w:sz="12" w:space="6"/>
         </w:pBdr>

</xml_diff>